<commit_message>
Add admin dashboard and role-based redirection for admin users
Co-authored-by: Copilot <copilot@github.com>
</commit_message>
<xml_diff>
--- a/ReportTemplateSample.docx
+++ b/ReportTemplateSample.docx
@@ -71,13 +71,8 @@
           </w:tcPr>
           <w:p>
             <w:r>
-              <w:t xml:space="preserve">Matas </w:t>
+              <w:t>Matas Zostautas</w:t>
             </w:r>
-            <w:proofErr w:type="spellStart"/>
-            <w:r>
-              <w:t>Zostautas</w:t>
-            </w:r>
-            <w:proofErr w:type="spellEnd"/>
           </w:p>
         </w:tc>
       </w:tr>
@@ -246,13 +241,8 @@
         <w:t xml:space="preserve">Student Signature: </w:t>
       </w:r>
       <w:r>
-        <w:t xml:space="preserve">Matas </w:t>
-      </w:r>
-      <w:proofErr w:type="spellStart"/>
-      <w:r>
-        <w:t>Zostautas</w:t>
-      </w:r>
-      <w:proofErr w:type="spellEnd"/>
+        <w:t>Matas Zostautas</w:t>
+      </w:r>
     </w:p>
     <w:p>
       <w:r>
@@ -570,23 +560,13 @@
           <w:szCs w:val="24"/>
         </w:rPr>
       </w:pPr>
-      <w:proofErr w:type="spellStart"/>
       <w:r>
         <w:rPr>
           <w:rFonts w:cs="Arial"/>
           <w:sz w:val="24"/>
           <w:szCs w:val="24"/>
         </w:rPr>
-        <w:t>Assetra</w:t>
-      </w:r>
-      <w:proofErr w:type="spellEnd"/>
-      <w:r>
-        <w:rPr>
-          <w:rFonts w:cs="Arial"/>
-          <w:sz w:val="24"/>
-          <w:szCs w:val="24"/>
-        </w:rPr>
-        <w:t xml:space="preserve"> is a web-based school inventory management system designed to show how an educational institution tracks, lends, and manages assets such as laptops, projectors, laboratory equipment, textbooks and more. Schools often rely on spreadsheets or paper logs to keep track of which items have been loaned to which student and when those items are due to be returned. This approach could have errors, difficult to keep track, and difficult to always see stock levels.</w:t>
+        <w:t>Assetra is a web-based school inventory management system designed to show how an educational institution tracks, lends, and manages assets such as laptops, projectors, laboratory equipment, textbooks and more. Schools often rely on spreadsheets or paper logs to keep track of which items have been loaned to which student and when those items are due to be returned. This approach could have errors, difficult to keep track, and difficult to always see stock levels.</w:t>
       </w:r>
     </w:p>
     <w:p>
@@ -605,25 +585,7 @@
           <w:sz w:val="24"/>
           <w:szCs w:val="24"/>
         </w:rPr>
-        <w:t xml:space="preserve">The </w:t>
-      </w:r>
-      <w:proofErr w:type="spellStart"/>
-      <w:r>
-        <w:rPr>
-          <w:rFonts w:cs="Arial"/>
-          <w:sz w:val="24"/>
-          <w:szCs w:val="24"/>
-        </w:rPr>
-        <w:t>Assetra</w:t>
-      </w:r>
-      <w:proofErr w:type="spellEnd"/>
-      <w:r>
-        <w:rPr>
-          <w:rFonts w:cs="Arial"/>
-          <w:sz w:val="24"/>
-          <w:szCs w:val="24"/>
-        </w:rPr>
-        <w:t xml:space="preserve"> platform will address </w:t>
+        <w:t xml:space="preserve">The Assetra platform will address </w:t>
       </w:r>
       <w:r>
         <w:rPr>
@@ -999,21 +961,12 @@
           <w:szCs w:val="24"/>
         </w:rPr>
       </w:pPr>
-      <w:proofErr w:type="spellStart"/>
-      <w:r>
-        <w:rPr>
-          <w:sz w:val="24"/>
-          <w:szCs w:val="24"/>
-        </w:rPr>
-        <w:t>Assetra</w:t>
-      </w:r>
-      <w:proofErr w:type="spellEnd"/>
-      <w:r>
-        <w:rPr>
-          <w:sz w:val="24"/>
-          <w:szCs w:val="24"/>
-        </w:rPr>
-        <w:t xml:space="preserve"> implements many use cases across all the different roles. </w:t>
+      <w:r>
+        <w:rPr>
+          <w:sz w:val="24"/>
+          <w:szCs w:val="24"/>
+        </w:rPr>
+        <w:t xml:space="preserve">Assetra implements many use cases across all the different roles. </w:t>
       </w:r>
     </w:p>
     <w:p>
@@ -1085,12 +1038,14 @@
         <w:rPr>
           <w:sz w:val="24"/>
           <w:szCs w:val="24"/>
-        </w:rPr>
-      </w:pPr>
-      <w:r>
-        <w:rPr>
-          <w:sz w:val="24"/>
-          <w:szCs w:val="24"/>
+          <w:u w:val="single"/>
+        </w:rPr>
+      </w:pPr>
+      <w:r>
+        <w:rPr>
+          <w:sz w:val="24"/>
+          <w:szCs w:val="24"/>
+          <w:u w:val="single"/>
         </w:rPr>
         <w:lastRenderedPageBreak/>
         <w:t>General Use Cases</w:t>
@@ -1151,7 +1106,7 @@
           <w:sz w:val="24"/>
           <w:szCs w:val="24"/>
         </w:rPr>
-        <w:t>Use Case 2: View List Item</w:t>
+        <w:t>Any authenticated user can log in (Student, Staff, Manager, Admin)</w:t>
       </w:r>
     </w:p>
     <w:p>
@@ -1163,6 +1118,13 @@
           <w:szCs w:val="24"/>
         </w:rPr>
       </w:pPr>
+      <w:r>
+        <w:rPr>
+          <w:sz w:val="24"/>
+          <w:szCs w:val="24"/>
+        </w:rPr>
+        <w:t>The user enters their username and password. On success, Django will authenticate them and they will be redirected to the role appropriate landing page (Staff, Dashboard, Manager Dashboard, Student Home page)</w:t>
+      </w:r>
     </w:p>
     <w:p>
       <w:pPr>
@@ -1173,13 +1135,6 @@
           <w:szCs w:val="24"/>
         </w:rPr>
       </w:pPr>
-      <w:r>
-        <w:rPr>
-          <w:sz w:val="24"/>
-          <w:szCs w:val="24"/>
-        </w:rPr>
-        <w:t>Student Use Cases</w:t>
-      </w:r>
     </w:p>
     <w:p>
       <w:pPr>
@@ -1195,7 +1150,7 @@
           <w:sz w:val="24"/>
           <w:szCs w:val="24"/>
         </w:rPr>
-        <w:t>Use Case 3: Request an Item</w:t>
+        <w:t>Use Case 2: View List Item</w:t>
       </w:r>
     </w:p>
     <w:p>
@@ -1212,7 +1167,7 @@
           <w:sz w:val="24"/>
           <w:szCs w:val="24"/>
         </w:rPr>
-        <w:t>Use Case 4: View My Requests</w:t>
+        <w:t>All users (even non authenticated users/visitors) can view the items.</w:t>
       </w:r>
     </w:p>
     <w:p>
@@ -1229,7 +1184,7 @@
           <w:sz w:val="24"/>
           <w:szCs w:val="24"/>
         </w:rPr>
-        <w:t>Use Case 5: View My Items</w:t>
+        <w:t>Displays every item in the inventory, with its name, description, quantity, stock, status (Good, Low, Out), and category. Action buttons are dependent on the role.</w:t>
       </w:r>
     </w:p>
     <w:p>
@@ -1241,13 +1196,6 @@
           <w:szCs w:val="24"/>
         </w:rPr>
       </w:pPr>
-      <w:r>
-        <w:rPr>
-          <w:sz w:val="24"/>
-          <w:szCs w:val="24"/>
-        </w:rPr>
-        <w:t>Use Case 6: Return Item</w:t>
-      </w:r>
     </w:p>
     <w:p>
       <w:pPr>
@@ -1256,8 +1204,17 @@
         <w:rPr>
           <w:sz w:val="24"/>
           <w:szCs w:val="24"/>
-        </w:rPr>
-      </w:pPr>
+          <w:u w:val="single"/>
+        </w:rPr>
+      </w:pPr>
+      <w:r>
+        <w:rPr>
+          <w:sz w:val="24"/>
+          <w:szCs w:val="24"/>
+          <w:u w:val="single"/>
+        </w:rPr>
+        <w:t>Student Use Cases</w:t>
+      </w:r>
     </w:p>
     <w:p>
       <w:pPr>
@@ -1278,6 +1235,685 @@
           <w:szCs w:val="24"/>
         </w:rPr>
       </w:pPr>
+      <w:r>
+        <w:rPr>
+          <w:sz w:val="24"/>
+          <w:szCs w:val="24"/>
+        </w:rPr>
+        <w:t>Use Case 3: Request an Item</w:t>
+      </w:r>
+    </w:p>
+    <w:p>
+      <w:pPr>
+        <w:spacing w:after="0" w:line="240" w:lineRule="auto"/>
+        <w:jc w:val="both"/>
+        <w:rPr>
+          <w:sz w:val="24"/>
+          <w:szCs w:val="24"/>
+        </w:rPr>
+      </w:pPr>
+      <w:r>
+        <w:rPr>
+          <w:sz w:val="24"/>
+          <w:szCs w:val="24"/>
+        </w:rPr>
+        <w:t>The student that is logged in and items quantity is not 0. The student clicks the ‘Request’ button on the item list, and a new request record is created with status ‘PENDING’ and is sent for staff review.</w:t>
+      </w:r>
+    </w:p>
+    <w:p>
+      <w:pPr>
+        <w:spacing w:after="0" w:line="240" w:lineRule="auto"/>
+        <w:jc w:val="both"/>
+        <w:rPr>
+          <w:sz w:val="24"/>
+          <w:szCs w:val="24"/>
+        </w:rPr>
+      </w:pPr>
+    </w:p>
+    <w:p>
+      <w:pPr>
+        <w:spacing w:after="0" w:line="240" w:lineRule="auto"/>
+        <w:jc w:val="both"/>
+        <w:rPr>
+          <w:sz w:val="24"/>
+          <w:szCs w:val="24"/>
+        </w:rPr>
+      </w:pPr>
+      <w:r>
+        <w:rPr>
+          <w:sz w:val="24"/>
+          <w:szCs w:val="24"/>
+        </w:rPr>
+        <w:t>Use Case 4: View My Requests</w:t>
+      </w:r>
+    </w:p>
+    <w:p>
+      <w:pPr>
+        <w:spacing w:after="0" w:line="240" w:lineRule="auto"/>
+        <w:jc w:val="both"/>
+        <w:rPr>
+          <w:sz w:val="24"/>
+          <w:szCs w:val="24"/>
+        </w:rPr>
+      </w:pPr>
+      <w:r>
+        <w:rPr>
+          <w:sz w:val="24"/>
+          <w:szCs w:val="24"/>
+        </w:rPr>
+        <w:t>Displays all requests submitted by the logged in student with their status (Pending, Approved, Rejected, Returned) and the data the request was made.</w:t>
+      </w:r>
+    </w:p>
+    <w:p>
+      <w:pPr>
+        <w:spacing w:after="0" w:line="240" w:lineRule="auto"/>
+        <w:jc w:val="both"/>
+        <w:rPr>
+          <w:sz w:val="24"/>
+          <w:szCs w:val="24"/>
+        </w:rPr>
+      </w:pPr>
+    </w:p>
+    <w:p>
+      <w:pPr>
+        <w:spacing w:after="0" w:line="240" w:lineRule="auto"/>
+        <w:jc w:val="both"/>
+        <w:rPr>
+          <w:sz w:val="24"/>
+          <w:szCs w:val="24"/>
+        </w:rPr>
+      </w:pPr>
+      <w:r>
+        <w:rPr>
+          <w:sz w:val="24"/>
+          <w:szCs w:val="24"/>
+        </w:rPr>
+        <w:t>Use Case 5: View My Items</w:t>
+      </w:r>
+    </w:p>
+    <w:p>
+      <w:pPr>
+        <w:spacing w:after="0" w:line="240" w:lineRule="auto"/>
+        <w:jc w:val="both"/>
+        <w:rPr>
+          <w:sz w:val="24"/>
+          <w:szCs w:val="24"/>
+        </w:rPr>
+      </w:pPr>
+      <w:r>
+        <w:rPr>
+          <w:sz w:val="24"/>
+          <w:szCs w:val="24"/>
+        </w:rPr>
+        <w:t>Filters the student’s requests to show only those currently approved, such as items in the student’s possession.</w:t>
+      </w:r>
+    </w:p>
+    <w:p>
+      <w:pPr>
+        <w:spacing w:after="0" w:line="240" w:lineRule="auto"/>
+        <w:jc w:val="both"/>
+        <w:rPr>
+          <w:sz w:val="24"/>
+          <w:szCs w:val="24"/>
+        </w:rPr>
+      </w:pPr>
+    </w:p>
+    <w:p>
+      <w:pPr>
+        <w:spacing w:after="0" w:line="240" w:lineRule="auto"/>
+        <w:jc w:val="both"/>
+        <w:rPr>
+          <w:sz w:val="24"/>
+          <w:szCs w:val="24"/>
+        </w:rPr>
+      </w:pPr>
+      <w:r>
+        <w:rPr>
+          <w:sz w:val="24"/>
+          <w:szCs w:val="24"/>
+        </w:rPr>
+        <w:t>Use Case 6: Return Item</w:t>
+      </w:r>
+    </w:p>
+    <w:p>
+      <w:pPr>
+        <w:spacing w:after="0" w:line="240" w:lineRule="auto"/>
+        <w:jc w:val="both"/>
+        <w:rPr>
+          <w:sz w:val="24"/>
+          <w:szCs w:val="24"/>
+        </w:rPr>
+      </w:pPr>
+      <w:r>
+        <w:rPr>
+          <w:sz w:val="24"/>
+          <w:szCs w:val="24"/>
+        </w:rPr>
+        <w:t>The request status is ‘APPROVED’ and the user is the requester. The items stock quantity is incremented by one and the request status is ‘RETURNED’.</w:t>
+      </w:r>
+    </w:p>
+    <w:p>
+      <w:pPr>
+        <w:spacing w:after="0" w:line="240" w:lineRule="auto"/>
+        <w:jc w:val="both"/>
+        <w:rPr>
+          <w:sz w:val="24"/>
+          <w:szCs w:val="24"/>
+        </w:rPr>
+      </w:pPr>
+    </w:p>
+    <w:p>
+      <w:pPr>
+        <w:spacing w:after="0" w:line="240" w:lineRule="auto"/>
+        <w:jc w:val="both"/>
+        <w:rPr>
+          <w:sz w:val="24"/>
+          <w:szCs w:val="24"/>
+          <w:u w:val="single"/>
+        </w:rPr>
+      </w:pPr>
+      <w:r>
+        <w:rPr>
+          <w:sz w:val="24"/>
+          <w:szCs w:val="24"/>
+          <w:u w:val="single"/>
+        </w:rPr>
+        <w:t>Staff Use Cases</w:t>
+      </w:r>
+    </w:p>
+    <w:p>
+      <w:pPr>
+        <w:spacing w:after="0" w:line="240" w:lineRule="auto"/>
+        <w:jc w:val="both"/>
+        <w:rPr>
+          <w:sz w:val="24"/>
+          <w:szCs w:val="24"/>
+        </w:rPr>
+      </w:pPr>
+    </w:p>
+    <w:p>
+      <w:pPr>
+        <w:spacing w:after="0" w:line="240" w:lineRule="auto"/>
+        <w:jc w:val="both"/>
+        <w:rPr>
+          <w:sz w:val="24"/>
+          <w:szCs w:val="24"/>
+        </w:rPr>
+      </w:pPr>
+      <w:r>
+        <w:rPr>
+          <w:sz w:val="24"/>
+          <w:szCs w:val="24"/>
+        </w:rPr>
+        <w:t xml:space="preserve">Use Case 7: View Pending Requests </w:t>
+      </w:r>
+    </w:p>
+    <w:p>
+      <w:pPr>
+        <w:spacing w:after="0" w:line="240" w:lineRule="auto"/>
+        <w:jc w:val="both"/>
+        <w:rPr>
+          <w:sz w:val="24"/>
+          <w:szCs w:val="24"/>
+        </w:rPr>
+      </w:pPr>
+      <w:r>
+        <w:rPr>
+          <w:sz w:val="24"/>
+          <w:szCs w:val="24"/>
+        </w:rPr>
+        <w:t>Displays every request currently in 'PENDING' status with the requesting user and the item requested.</w:t>
+      </w:r>
+    </w:p>
+    <w:p>
+      <w:pPr>
+        <w:spacing w:after="0" w:line="240" w:lineRule="auto"/>
+        <w:jc w:val="both"/>
+        <w:rPr>
+          <w:sz w:val="24"/>
+          <w:szCs w:val="24"/>
+        </w:rPr>
+      </w:pPr>
+    </w:p>
+    <w:p>
+      <w:pPr>
+        <w:spacing w:after="0" w:line="240" w:lineRule="auto"/>
+        <w:jc w:val="both"/>
+        <w:rPr>
+          <w:sz w:val="24"/>
+          <w:szCs w:val="24"/>
+        </w:rPr>
+      </w:pPr>
+      <w:r>
+        <w:rPr>
+          <w:sz w:val="24"/>
+          <w:szCs w:val="24"/>
+        </w:rPr>
+        <w:t>Use Case 8: Approve a Request</w:t>
+      </w:r>
+    </w:p>
+    <w:p>
+      <w:pPr>
+        <w:spacing w:after="0" w:line="240" w:lineRule="auto"/>
+        <w:jc w:val="both"/>
+        <w:rPr>
+          <w:sz w:val="24"/>
+          <w:szCs w:val="24"/>
+        </w:rPr>
+      </w:pPr>
+      <w:r>
+        <w:rPr>
+          <w:sz w:val="24"/>
+          <w:szCs w:val="24"/>
+        </w:rPr>
+        <w:t xml:space="preserve">Request </w:t>
+      </w:r>
+      <w:r>
+        <w:rPr>
+          <w:sz w:val="24"/>
+          <w:szCs w:val="24"/>
+        </w:rPr>
+        <w:t xml:space="preserve">must be </w:t>
+      </w:r>
+      <w:r>
+        <w:rPr>
+          <w:sz w:val="24"/>
+          <w:szCs w:val="24"/>
+        </w:rPr>
+        <w:t>pending and item stock</w:t>
+      </w:r>
+      <w:r>
+        <w:rPr>
+          <w:sz w:val="24"/>
+          <w:szCs w:val="24"/>
+        </w:rPr>
+        <w:t xml:space="preserve"> must be greater than</w:t>
+      </w:r>
+      <w:r>
+        <w:rPr>
+          <w:sz w:val="24"/>
+          <w:szCs w:val="24"/>
+        </w:rPr>
+        <w:t xml:space="preserve"> 0</w:t>
+      </w:r>
+      <w:r>
+        <w:rPr>
+          <w:sz w:val="24"/>
+          <w:szCs w:val="24"/>
+        </w:rPr>
+        <w:t xml:space="preserve">. </w:t>
+      </w:r>
+      <w:r>
+        <w:rPr>
+          <w:sz w:val="24"/>
+          <w:szCs w:val="24"/>
+        </w:rPr>
+        <w:t>Decrements the item quantity by one and sets the request status to 'APPROVED'. If the item is out of stock at the time of approval, the operation is rejected with an error message.</w:t>
+      </w:r>
+    </w:p>
+    <w:p>
+      <w:pPr>
+        <w:spacing w:after="0" w:line="240" w:lineRule="auto"/>
+        <w:jc w:val="both"/>
+        <w:rPr>
+          <w:sz w:val="24"/>
+          <w:szCs w:val="24"/>
+        </w:rPr>
+      </w:pPr>
+    </w:p>
+    <w:p>
+      <w:pPr>
+        <w:spacing w:after="0" w:line="240" w:lineRule="auto"/>
+        <w:jc w:val="both"/>
+        <w:rPr>
+          <w:sz w:val="24"/>
+          <w:szCs w:val="24"/>
+        </w:rPr>
+      </w:pPr>
+    </w:p>
+    <w:p>
+      <w:pPr>
+        <w:spacing w:after="0" w:line="240" w:lineRule="auto"/>
+        <w:jc w:val="both"/>
+        <w:rPr>
+          <w:sz w:val="24"/>
+          <w:szCs w:val="24"/>
+        </w:rPr>
+      </w:pPr>
+      <w:r>
+        <w:rPr>
+          <w:sz w:val="24"/>
+          <w:szCs w:val="24"/>
+        </w:rPr>
+        <w:t>Use Case 9: Reject a Request</w:t>
+      </w:r>
+    </w:p>
+    <w:p>
+      <w:pPr>
+        <w:spacing w:after="0" w:line="240" w:lineRule="auto"/>
+        <w:jc w:val="both"/>
+        <w:rPr>
+          <w:sz w:val="24"/>
+          <w:szCs w:val="24"/>
+        </w:rPr>
+      </w:pPr>
+      <w:r>
+        <w:rPr>
+          <w:sz w:val="24"/>
+          <w:szCs w:val="24"/>
+        </w:rPr>
+        <w:t>Marks a pending request as 'REJECTED' without affecting stock levels.</w:t>
+      </w:r>
+    </w:p>
+    <w:p>
+      <w:pPr>
+        <w:spacing w:after="0" w:line="240" w:lineRule="auto"/>
+        <w:jc w:val="both"/>
+        <w:rPr>
+          <w:sz w:val="24"/>
+          <w:szCs w:val="24"/>
+        </w:rPr>
+      </w:pPr>
+    </w:p>
+    <w:p>
+      <w:pPr>
+        <w:spacing w:after="0" w:line="240" w:lineRule="auto"/>
+        <w:jc w:val="both"/>
+        <w:rPr>
+          <w:sz w:val="24"/>
+          <w:szCs w:val="24"/>
+        </w:rPr>
+      </w:pPr>
+      <w:r>
+        <w:rPr>
+          <w:sz w:val="24"/>
+          <w:szCs w:val="24"/>
+        </w:rPr>
+        <w:t>Use Case 10: Add Stock</w:t>
+      </w:r>
+    </w:p>
+    <w:p>
+      <w:pPr>
+        <w:spacing w:after="0" w:line="240" w:lineRule="auto"/>
+        <w:jc w:val="both"/>
+        <w:rPr>
+          <w:sz w:val="24"/>
+          <w:szCs w:val="24"/>
+        </w:rPr>
+      </w:pPr>
+      <w:r>
+        <w:rPr>
+          <w:sz w:val="24"/>
+          <w:szCs w:val="24"/>
+        </w:rPr>
+        <w:t>Increments the quantity of a selected item by one, used when physical stock is replenished.</w:t>
+      </w:r>
+    </w:p>
+    <w:p>
+      <w:pPr>
+        <w:spacing w:after="0" w:line="240" w:lineRule="auto"/>
+        <w:jc w:val="both"/>
+        <w:rPr>
+          <w:sz w:val="24"/>
+          <w:szCs w:val="24"/>
+        </w:rPr>
+      </w:pPr>
+    </w:p>
+    <w:p>
+      <w:pPr>
+        <w:spacing w:after="0" w:line="240" w:lineRule="auto"/>
+        <w:jc w:val="both"/>
+        <w:rPr>
+          <w:sz w:val="24"/>
+          <w:szCs w:val="24"/>
+          <w:u w:val="single"/>
+        </w:rPr>
+      </w:pPr>
+      <w:r>
+        <w:rPr>
+          <w:sz w:val="24"/>
+          <w:szCs w:val="24"/>
+          <w:u w:val="single"/>
+        </w:rPr>
+        <w:t>Manager Use Cases</w:t>
+      </w:r>
+    </w:p>
+    <w:p>
+      <w:pPr>
+        <w:spacing w:after="0" w:line="240" w:lineRule="auto"/>
+        <w:jc w:val="both"/>
+        <w:rPr>
+          <w:sz w:val="24"/>
+          <w:szCs w:val="24"/>
+          <w:u w:val="single"/>
+        </w:rPr>
+      </w:pPr>
+    </w:p>
+    <w:p>
+      <w:pPr>
+        <w:tabs>
+          <w:tab w:val="left" w:pos="3345"/>
+        </w:tabs>
+        <w:spacing w:after="0" w:line="240" w:lineRule="auto"/>
+        <w:jc w:val="both"/>
+        <w:rPr>
+          <w:sz w:val="24"/>
+          <w:szCs w:val="24"/>
+        </w:rPr>
+      </w:pPr>
+      <w:r>
+        <w:rPr>
+          <w:sz w:val="24"/>
+          <w:szCs w:val="24"/>
+        </w:rPr>
+        <w:t>Use Case 11: Create Ite</w:t>
+      </w:r>
+      <w:r>
+        <w:rPr>
+          <w:sz w:val="24"/>
+          <w:szCs w:val="24"/>
+        </w:rPr>
+        <w:t>m</w:t>
+      </w:r>
+    </w:p>
+    <w:p>
+      <w:pPr>
+        <w:tabs>
+          <w:tab w:val="left" w:pos="3345"/>
+        </w:tabs>
+        <w:spacing w:after="0" w:line="240" w:lineRule="auto"/>
+        <w:jc w:val="both"/>
+        <w:rPr>
+          <w:sz w:val="24"/>
+          <w:szCs w:val="24"/>
+        </w:rPr>
+      </w:pPr>
+      <w:r>
+        <w:rPr>
+          <w:sz w:val="24"/>
+          <w:szCs w:val="24"/>
+        </w:rPr>
+        <w:t>Opens a form where the manager can add a new item (name, description, quantity, category) to the inventory.</w:t>
+      </w:r>
+    </w:p>
+    <w:p>
+      <w:pPr>
+        <w:tabs>
+          <w:tab w:val="left" w:pos="3345"/>
+        </w:tabs>
+        <w:spacing w:after="0" w:line="240" w:lineRule="auto"/>
+        <w:jc w:val="both"/>
+        <w:rPr>
+          <w:sz w:val="24"/>
+          <w:szCs w:val="24"/>
+        </w:rPr>
+      </w:pPr>
+    </w:p>
+    <w:p>
+      <w:pPr>
+        <w:spacing w:after="0" w:line="240" w:lineRule="auto"/>
+        <w:jc w:val="both"/>
+        <w:rPr>
+          <w:sz w:val="24"/>
+          <w:szCs w:val="24"/>
+        </w:rPr>
+      </w:pPr>
+      <w:r>
+        <w:rPr>
+          <w:sz w:val="24"/>
+          <w:szCs w:val="24"/>
+        </w:rPr>
+        <w:t>Use Case 12: Edit Item</w:t>
+      </w:r>
+    </w:p>
+    <w:p>
+      <w:pPr>
+        <w:spacing w:after="0" w:line="240" w:lineRule="auto"/>
+        <w:jc w:val="both"/>
+        <w:rPr>
+          <w:sz w:val="24"/>
+          <w:szCs w:val="24"/>
+        </w:rPr>
+      </w:pPr>
+      <w:r>
+        <w:rPr>
+          <w:sz w:val="24"/>
+          <w:szCs w:val="24"/>
+        </w:rPr>
+        <w:t>Edit an item through a form. When edits are made and saved, the items information in the database is updated.</w:t>
+      </w:r>
+    </w:p>
+    <w:p>
+      <w:pPr>
+        <w:spacing w:after="0" w:line="240" w:lineRule="auto"/>
+        <w:jc w:val="both"/>
+        <w:rPr>
+          <w:sz w:val="24"/>
+          <w:szCs w:val="24"/>
+        </w:rPr>
+      </w:pPr>
+    </w:p>
+    <w:p>
+      <w:pPr>
+        <w:spacing w:after="0" w:line="240" w:lineRule="auto"/>
+        <w:jc w:val="both"/>
+        <w:rPr>
+          <w:sz w:val="24"/>
+          <w:szCs w:val="24"/>
+        </w:rPr>
+      </w:pPr>
+      <w:r>
+        <w:rPr>
+          <w:sz w:val="24"/>
+          <w:szCs w:val="24"/>
+        </w:rPr>
+        <w:t>Use Case 13: Delete Item</w:t>
+      </w:r>
+    </w:p>
+    <w:p>
+      <w:pPr>
+        <w:spacing w:after="0" w:line="240" w:lineRule="auto"/>
+        <w:jc w:val="both"/>
+        <w:rPr>
+          <w:sz w:val="24"/>
+          <w:szCs w:val="24"/>
+        </w:rPr>
+      </w:pPr>
+      <w:r>
+        <w:rPr>
+          <w:sz w:val="24"/>
+          <w:szCs w:val="24"/>
+        </w:rPr>
+        <w:t>After confirming to delete an item, the item is permanently removed and any associated request made for the item are also deleted.</w:t>
+      </w:r>
+    </w:p>
+    <w:p>
+      <w:pPr>
+        <w:spacing w:after="0" w:line="240" w:lineRule="auto"/>
+        <w:jc w:val="both"/>
+        <w:rPr>
+          <w:sz w:val="24"/>
+          <w:szCs w:val="24"/>
+        </w:rPr>
+      </w:pPr>
+    </w:p>
+    <w:p>
+      <w:pPr>
+        <w:spacing w:after="0" w:line="240" w:lineRule="auto"/>
+        <w:jc w:val="both"/>
+        <w:rPr>
+          <w:sz w:val="24"/>
+          <w:szCs w:val="24"/>
+        </w:rPr>
+      </w:pPr>
+      <w:r>
+        <w:rPr>
+          <w:sz w:val="24"/>
+          <w:szCs w:val="24"/>
+        </w:rPr>
+        <w:t>Use Case 14: Manage Categories</w:t>
+      </w:r>
+    </w:p>
+    <w:p>
+      <w:pPr>
+        <w:spacing w:after="0" w:line="240" w:lineRule="auto"/>
+        <w:jc w:val="both"/>
+        <w:rPr>
+          <w:sz w:val="24"/>
+          <w:szCs w:val="24"/>
+        </w:rPr>
+      </w:pPr>
+      <w:r>
+        <w:rPr>
+          <w:sz w:val="24"/>
+          <w:szCs w:val="24"/>
+        </w:rPr>
+        <w:t>Manage the listing, creation and editing of Category records which are used to categorise items (Electronics, Laboratory Equipment, Books, Sports Equipment and more if needed)</w:t>
+      </w:r>
+    </w:p>
+    <w:p>
+      <w:pPr>
+        <w:spacing w:after="0" w:line="240" w:lineRule="auto"/>
+        <w:jc w:val="both"/>
+        <w:rPr>
+          <w:sz w:val="24"/>
+          <w:szCs w:val="24"/>
+        </w:rPr>
+      </w:pPr>
+    </w:p>
+    <w:p>
+      <w:pPr>
+        <w:spacing w:after="0" w:line="240" w:lineRule="auto"/>
+        <w:jc w:val="both"/>
+        <w:rPr>
+          <w:sz w:val="24"/>
+          <w:szCs w:val="24"/>
+        </w:rPr>
+      </w:pPr>
+      <w:r>
+        <w:rPr>
+          <w:sz w:val="24"/>
+          <w:szCs w:val="24"/>
+        </w:rPr>
+        <w:t>Use Case 15: View Request History</w:t>
+      </w:r>
+    </w:p>
+    <w:p>
+      <w:pPr>
+        <w:spacing w:after="0" w:line="240" w:lineRule="auto"/>
+        <w:jc w:val="both"/>
+        <w:rPr>
+          <w:sz w:val="24"/>
+          <w:szCs w:val="24"/>
+        </w:rPr>
+      </w:pPr>
+      <w:r>
+        <w:rPr>
+          <w:sz w:val="24"/>
+          <w:szCs w:val="24"/>
+        </w:rPr>
+        <w:t>Provides a view of every request in the system with user, item, status, and date.</w:t>
+      </w:r>
     </w:p>
     <w:p>
       <w:pPr>
@@ -1325,6 +1961,544 @@
     </w:p>
     <w:p>
       <w:pPr>
+        <w:spacing w:after="0" w:line="240" w:lineRule="auto"/>
+        <w:jc w:val="both"/>
+        <w:rPr>
+          <w:color w:val="FF0000"/>
+          <w:sz w:val="24"/>
+          <w:szCs w:val="24"/>
+        </w:rPr>
+      </w:pPr>
+      <w:r>
+        <w:rPr>
+          <w:noProof/>
+          <w:color w:val="FF0000"/>
+        </w:rPr>
+        <w:lastRenderedPageBreak/>
+        <w:drawing>
+          <wp:inline distT="0" distB="0" distL="0" distR="0" wp14:anchorId="5942BB8E" wp14:editId="2794CA57">
+            <wp:extent cx="5486400" cy="7688580"/>
+            <wp:effectExtent l="0" t="0" r="0" b="7620"/>
+            <wp:docPr id="854933591" name="Picture 3"/>
+            <wp:cNvGraphicFramePr>
+              <a:graphicFrameLocks xmlns:a="http://schemas.openxmlformats.org/drawingml/2006/main" noChangeAspect="1"/>
+            </wp:cNvGraphicFramePr>
+            <a:graphic xmlns:a="http://schemas.openxmlformats.org/drawingml/2006/main">
+              <a:graphicData uri="http://schemas.openxmlformats.org/drawingml/2006/picture">
+                <pic:pic xmlns:pic="http://schemas.openxmlformats.org/drawingml/2006/picture">
+                  <pic:nvPicPr>
+                    <pic:cNvPr id="854933591" name="Picture 854933591"/>
+                    <pic:cNvPicPr/>
+                  </pic:nvPicPr>
+                  <pic:blipFill>
+                    <a:blip r:embed="rId11"/>
+                    <a:stretch>
+                      <a:fillRect/>
+                    </a:stretch>
+                  </pic:blipFill>
+                  <pic:spPr>
+                    <a:xfrm>
+                      <a:off x="0" y="0"/>
+                      <a:ext cx="5486400" cy="7688580"/>
+                    </a:xfrm>
+                    <a:prstGeom prst="rect">
+                      <a:avLst/>
+                    </a:prstGeom>
+                  </pic:spPr>
+                </pic:pic>
+              </a:graphicData>
+            </a:graphic>
+          </wp:inline>
+        </w:drawing>
+      </w:r>
+    </w:p>
+    <w:p>
+      <w:pPr>
+        <w:spacing w:after="0" w:line="240" w:lineRule="auto"/>
+        <w:jc w:val="both"/>
+        <w:rPr>
+          <w:sz w:val="24"/>
+          <w:szCs w:val="24"/>
+        </w:rPr>
+      </w:pPr>
+      <w:r>
+        <w:rPr>
+          <w:sz w:val="24"/>
+          <w:szCs w:val="24"/>
+        </w:rPr>
+        <w:lastRenderedPageBreak/>
+        <w:t>Entities and Attributes</w:t>
+      </w:r>
+    </w:p>
+    <w:p>
+      <w:pPr>
+        <w:spacing w:after="0" w:line="240" w:lineRule="auto"/>
+        <w:jc w:val="both"/>
+        <w:rPr>
+          <w:sz w:val="24"/>
+          <w:szCs w:val="24"/>
+        </w:rPr>
+      </w:pPr>
+    </w:p>
+    <w:p>
+      <w:pPr>
+        <w:spacing w:after="0" w:line="240" w:lineRule="auto"/>
+        <w:jc w:val="both"/>
+        <w:rPr>
+          <w:sz w:val="24"/>
+          <w:szCs w:val="24"/>
+        </w:rPr>
+      </w:pPr>
+      <w:r>
+        <w:rPr>
+          <w:sz w:val="24"/>
+          <w:szCs w:val="24"/>
+        </w:rPr>
+        <w:t>Category</w:t>
+      </w:r>
+    </w:p>
+    <w:p>
+      <w:pPr>
+        <w:spacing w:after="0" w:line="240" w:lineRule="auto"/>
+        <w:jc w:val="both"/>
+        <w:rPr>
+          <w:sz w:val="24"/>
+          <w:szCs w:val="24"/>
+        </w:rPr>
+      </w:pPr>
+      <w:r>
+        <w:rPr>
+          <w:sz w:val="24"/>
+          <w:szCs w:val="24"/>
+        </w:rPr>
+        <w:t>id(PK) - Primary key for each individual category</w:t>
+      </w:r>
+    </w:p>
+    <w:p>
+      <w:pPr>
+        <w:spacing w:after="0" w:line="240" w:lineRule="auto"/>
+        <w:jc w:val="both"/>
+        <w:rPr>
+          <w:sz w:val="24"/>
+          <w:szCs w:val="24"/>
+        </w:rPr>
+      </w:pPr>
+      <w:r>
+        <w:rPr>
+          <w:sz w:val="24"/>
+          <w:szCs w:val="24"/>
+        </w:rPr>
+        <w:t>name(string) – The category name (Electronics, Books)</w:t>
+      </w:r>
+    </w:p>
+    <w:p>
+      <w:pPr>
+        <w:spacing w:after="0" w:line="240" w:lineRule="auto"/>
+        <w:jc w:val="both"/>
+        <w:rPr>
+          <w:sz w:val="24"/>
+          <w:szCs w:val="24"/>
+        </w:rPr>
+      </w:pPr>
+      <w:r>
+        <w:rPr>
+          <w:sz w:val="24"/>
+          <w:szCs w:val="24"/>
+        </w:rPr>
+        <w:t>description(string) – A description of what the category contains</w:t>
+      </w:r>
+    </w:p>
+    <w:p>
+      <w:pPr>
+        <w:spacing w:after="0" w:line="240" w:lineRule="auto"/>
+        <w:jc w:val="both"/>
+        <w:rPr>
+          <w:sz w:val="24"/>
+          <w:szCs w:val="24"/>
+        </w:rPr>
+      </w:pPr>
+    </w:p>
+    <w:p>
+      <w:pPr>
+        <w:spacing w:after="0" w:line="240" w:lineRule="auto"/>
+        <w:jc w:val="both"/>
+        <w:rPr>
+          <w:sz w:val="24"/>
+          <w:szCs w:val="24"/>
+        </w:rPr>
+      </w:pPr>
+      <w:r>
+        <w:rPr>
+          <w:sz w:val="24"/>
+          <w:szCs w:val="24"/>
+        </w:rPr>
+        <w:t>Item</w:t>
+      </w:r>
+    </w:p>
+    <w:p>
+      <w:pPr>
+        <w:spacing w:after="0" w:line="240" w:lineRule="auto"/>
+        <w:jc w:val="both"/>
+        <w:rPr>
+          <w:sz w:val="24"/>
+          <w:szCs w:val="24"/>
+        </w:rPr>
+      </w:pPr>
+      <w:r>
+        <w:rPr>
+          <w:sz w:val="24"/>
+          <w:szCs w:val="24"/>
+        </w:rPr>
+        <w:t>id(PK) – Unique primary key for each individual category</w:t>
+      </w:r>
+    </w:p>
+    <w:p>
+      <w:pPr>
+        <w:spacing w:after="0" w:line="240" w:lineRule="auto"/>
+        <w:jc w:val="both"/>
+        <w:rPr>
+          <w:sz w:val="24"/>
+          <w:szCs w:val="24"/>
+        </w:rPr>
+      </w:pPr>
+      <w:r>
+        <w:rPr>
+          <w:sz w:val="24"/>
+          <w:szCs w:val="24"/>
+        </w:rPr>
+        <w:t>name(string) – The name of the item</w:t>
+      </w:r>
+    </w:p>
+    <w:p>
+      <w:pPr>
+        <w:spacing w:after="0" w:line="240" w:lineRule="auto"/>
+        <w:jc w:val="both"/>
+        <w:rPr>
+          <w:sz w:val="24"/>
+          <w:szCs w:val="24"/>
+        </w:rPr>
+      </w:pPr>
+      <w:r>
+        <w:rPr>
+          <w:sz w:val="24"/>
+          <w:szCs w:val="24"/>
+        </w:rPr>
+        <w:t>description(string) - A description of the item</w:t>
+      </w:r>
+    </w:p>
+    <w:p>
+      <w:pPr>
+        <w:spacing w:after="0" w:line="240" w:lineRule="auto"/>
+        <w:jc w:val="both"/>
+        <w:rPr>
+          <w:sz w:val="24"/>
+          <w:szCs w:val="24"/>
+        </w:rPr>
+      </w:pPr>
+      <w:r>
+        <w:rPr>
+          <w:sz w:val="24"/>
+          <w:szCs w:val="24"/>
+        </w:rPr>
+        <w:t>quantity(int)- The current stock level available</w:t>
+      </w:r>
+    </w:p>
+    <w:p>
+      <w:pPr>
+        <w:spacing w:after="0" w:line="240" w:lineRule="auto"/>
+        <w:jc w:val="both"/>
+        <w:rPr>
+          <w:sz w:val="24"/>
+          <w:szCs w:val="24"/>
+        </w:rPr>
+      </w:pPr>
+      <w:r>
+        <w:rPr>
+          <w:sz w:val="24"/>
+          <w:szCs w:val="24"/>
+        </w:rPr>
+        <w:t>category_id(FK – Category) – The category the item belongs to</w:t>
+      </w:r>
+    </w:p>
+    <w:p>
+      <w:pPr>
+        <w:spacing w:after="0" w:line="240" w:lineRule="auto"/>
+        <w:jc w:val="both"/>
+        <w:rPr>
+          <w:sz w:val="24"/>
+          <w:szCs w:val="24"/>
+        </w:rPr>
+      </w:pPr>
+    </w:p>
+    <w:p>
+      <w:pPr>
+        <w:spacing w:after="0" w:line="240" w:lineRule="auto"/>
+        <w:jc w:val="both"/>
+        <w:rPr>
+          <w:sz w:val="24"/>
+          <w:szCs w:val="24"/>
+        </w:rPr>
+      </w:pPr>
+      <w:r>
+        <w:rPr>
+          <w:sz w:val="24"/>
+          <w:szCs w:val="24"/>
+        </w:rPr>
+        <w:t>Request</w:t>
+      </w:r>
+    </w:p>
+    <w:p>
+      <w:pPr>
+        <w:spacing w:after="0" w:line="240" w:lineRule="auto"/>
+        <w:jc w:val="both"/>
+        <w:rPr>
+          <w:sz w:val="24"/>
+          <w:szCs w:val="24"/>
+        </w:rPr>
+      </w:pPr>
+      <w:r>
+        <w:rPr>
+          <w:sz w:val="24"/>
+          <w:szCs w:val="24"/>
+        </w:rPr>
+        <w:t>id(PK)</w:t>
+      </w:r>
+      <w:r>
+        <w:rPr>
+          <w:sz w:val="24"/>
+          <w:szCs w:val="24"/>
+        </w:rPr>
+        <w:t>- Primary key for each item.</w:t>
+      </w:r>
+      <w:r>
+        <w:rPr>
+          <w:sz w:val="24"/>
+          <w:szCs w:val="24"/>
+        </w:rPr>
+        <w:t>.</w:t>
+      </w:r>
+    </w:p>
+    <w:p>
+      <w:pPr>
+        <w:spacing w:after="0" w:line="240" w:lineRule="auto"/>
+        <w:jc w:val="both"/>
+        <w:rPr>
+          <w:sz w:val="24"/>
+          <w:szCs w:val="24"/>
+        </w:rPr>
+      </w:pPr>
+      <w:r>
+        <w:rPr>
+          <w:sz w:val="24"/>
+          <w:szCs w:val="24"/>
+        </w:rPr>
+        <w:t xml:space="preserve">name(string) — The name of the item. </w:t>
+      </w:r>
+    </w:p>
+    <w:p>
+      <w:pPr>
+        <w:spacing w:after="0" w:line="240" w:lineRule="auto"/>
+        <w:jc w:val="both"/>
+        <w:rPr>
+          <w:sz w:val="24"/>
+          <w:szCs w:val="24"/>
+        </w:rPr>
+      </w:pPr>
+      <w:r>
+        <w:rPr>
+          <w:sz w:val="24"/>
+          <w:szCs w:val="24"/>
+        </w:rPr>
+        <w:t>description(</w:t>
+      </w:r>
+      <w:r>
+        <w:rPr>
+          <w:sz w:val="24"/>
+          <w:szCs w:val="24"/>
+        </w:rPr>
+        <w:t>string</w:t>
+      </w:r>
+      <w:r>
+        <w:rPr>
+          <w:sz w:val="24"/>
+          <w:szCs w:val="24"/>
+        </w:rPr>
+        <w:t xml:space="preserve">) </w:t>
+      </w:r>
+      <w:r>
+        <w:rPr>
+          <w:sz w:val="24"/>
+          <w:szCs w:val="24"/>
+        </w:rPr>
+        <w:t xml:space="preserve">- </w:t>
+      </w:r>
+      <w:r>
+        <w:rPr>
+          <w:sz w:val="24"/>
+          <w:szCs w:val="24"/>
+        </w:rPr>
+        <w:t xml:space="preserve">A description of the item. </w:t>
+      </w:r>
+    </w:p>
+    <w:p>
+      <w:pPr>
+        <w:spacing w:after="0" w:line="240" w:lineRule="auto"/>
+        <w:jc w:val="both"/>
+        <w:rPr>
+          <w:sz w:val="24"/>
+          <w:szCs w:val="24"/>
+        </w:rPr>
+      </w:pPr>
+      <w:r>
+        <w:rPr>
+          <w:sz w:val="24"/>
+          <w:szCs w:val="24"/>
+        </w:rPr>
+        <w:t>quantity(int)</w:t>
+      </w:r>
+      <w:r>
+        <w:rPr>
+          <w:sz w:val="24"/>
+          <w:szCs w:val="24"/>
+        </w:rPr>
+        <w:t xml:space="preserve">-  </w:t>
+      </w:r>
+      <w:r>
+        <w:rPr>
+          <w:sz w:val="24"/>
+          <w:szCs w:val="24"/>
+        </w:rPr>
+        <w:t xml:space="preserve">The current stock level available. </w:t>
+      </w:r>
+    </w:p>
+    <w:p>
+      <w:pPr>
+        <w:spacing w:after="0" w:line="240" w:lineRule="auto"/>
+        <w:jc w:val="both"/>
+        <w:rPr>
+          <w:sz w:val="24"/>
+          <w:szCs w:val="24"/>
+        </w:rPr>
+      </w:pPr>
+      <w:r>
+        <w:rPr>
+          <w:sz w:val="24"/>
+          <w:szCs w:val="24"/>
+        </w:rPr>
+        <w:t xml:space="preserve">category_id (FK </w:t>
+      </w:r>
+      <w:r>
+        <w:rPr>
+          <w:sz w:val="24"/>
+          <w:szCs w:val="24"/>
+        </w:rPr>
+        <w:t xml:space="preserve"> - </w:t>
+      </w:r>
+      <w:r>
+        <w:rPr>
+          <w:sz w:val="24"/>
+          <w:szCs w:val="24"/>
+        </w:rPr>
+        <w:t xml:space="preserve">Category) </w:t>
+      </w:r>
+      <w:r>
+        <w:rPr>
+          <w:sz w:val="24"/>
+          <w:szCs w:val="24"/>
+        </w:rPr>
+        <w:t xml:space="preserve">- </w:t>
+      </w:r>
+      <w:r>
+        <w:rPr>
+          <w:sz w:val="24"/>
+          <w:szCs w:val="24"/>
+        </w:rPr>
+        <w:t>The category this item belongs to.</w:t>
+      </w:r>
+    </w:p>
+    <w:p>
+      <w:pPr>
+        <w:spacing w:after="0" w:line="240" w:lineRule="auto"/>
+        <w:jc w:val="both"/>
+        <w:rPr>
+          <w:sz w:val="24"/>
+          <w:szCs w:val="24"/>
+        </w:rPr>
+      </w:pPr>
+    </w:p>
+    <w:p>
+      <w:pPr>
+        <w:spacing w:after="0" w:line="240" w:lineRule="auto"/>
+        <w:jc w:val="both"/>
+        <w:rPr>
+          <w:sz w:val="24"/>
+          <w:szCs w:val="24"/>
+        </w:rPr>
+      </w:pPr>
+      <w:r>
+        <w:rPr>
+          <w:sz w:val="24"/>
+          <w:szCs w:val="24"/>
+        </w:rPr>
+        <w:t>User and Group (Django Admin)</w:t>
+      </w:r>
+    </w:p>
+    <w:p>
+      <w:pPr>
+        <w:spacing w:after="0" w:line="240" w:lineRule="auto"/>
+        <w:jc w:val="both"/>
+        <w:rPr>
+          <w:sz w:val="24"/>
+          <w:szCs w:val="24"/>
+        </w:rPr>
+      </w:pPr>
+      <w:r>
+        <w:rPr>
+          <w:sz w:val="24"/>
+          <w:szCs w:val="24"/>
+        </w:rPr>
+        <w:t>User holds credentials and profile info. Each user belongs to a group in the system</w:t>
+      </w:r>
+    </w:p>
+    <w:p>
+      <w:pPr>
+        <w:spacing w:after="0" w:line="240" w:lineRule="auto"/>
+        <w:jc w:val="both"/>
+        <w:rPr>
+          <w:sz w:val="24"/>
+          <w:szCs w:val="24"/>
+        </w:rPr>
+      </w:pPr>
+      <w:r>
+        <w:rPr>
+          <w:sz w:val="24"/>
+          <w:szCs w:val="24"/>
+        </w:rPr>
+        <w:t>The group defines the role. This can be Admin, Staff, Student, or Manager</w:t>
+      </w:r>
+    </w:p>
+    <w:p>
+      <w:pPr>
+        <w:spacing w:after="0" w:line="240" w:lineRule="auto"/>
+        <w:jc w:val="both"/>
+        <w:rPr>
+          <w:sz w:val="24"/>
+          <w:szCs w:val="24"/>
+        </w:rPr>
+      </w:pPr>
+    </w:p>
+    <w:p>
+      <w:pPr>
+        <w:spacing w:after="0" w:line="240" w:lineRule="auto"/>
+        <w:jc w:val="both"/>
+        <w:rPr>
+          <w:sz w:val="24"/>
+          <w:szCs w:val="24"/>
+        </w:rPr>
+      </w:pPr>
+    </w:p>
+    <w:p>
+      <w:pPr>
         <w:pStyle w:val="Heading1"/>
         <w:numPr>
           <w:ilvl w:val="0"/>
@@ -1578,6 +2752,7 @@
         <w:rPr>
           <w:color w:val="FF0000"/>
         </w:rPr>
+        <w:lastRenderedPageBreak/>
         <w:t>Use case tests (or User behaviour test)</w:t>
       </w:r>
     </w:p>
@@ -1660,7 +2835,6 @@
           <w:sz w:val="24"/>
           <w:szCs w:val="24"/>
         </w:rPr>
-        <w:lastRenderedPageBreak/>
         <w:t>Use Case Diagram Tool</w:t>
       </w:r>
     </w:p>
@@ -1672,7 +2846,7 @@
           <w:szCs w:val="24"/>
         </w:rPr>
       </w:pPr>
-      <w:hyperlink r:id="rId11" w:history="1">
+      <w:hyperlink r:id="rId12" w:history="1">
         <w:r>
           <w:rPr>
             <w:rStyle w:val="Hyperlink"/>
@@ -1732,7 +2906,7 @@
           <w:szCs w:val="24"/>
         </w:rPr>
       </w:pPr>
-      <w:hyperlink r:id="rId12" w:history="1">
+      <w:hyperlink r:id="rId13" w:history="1">
         <w:r>
           <w:rPr>
             <w:rStyle w:val="Hyperlink"/>
@@ -1751,7 +2925,7 @@
           <w:szCs w:val="24"/>
         </w:rPr>
       </w:pPr>
-      <w:hyperlink r:id="rId13" w:history="1">
+      <w:hyperlink r:id="rId14" w:history="1">
         <w:r>
           <w:rPr>
             <w:rStyle w:val="Hyperlink"/>
@@ -1795,6 +2969,16 @@
           <w:szCs w:val="24"/>
         </w:rPr>
       </w:pPr>
+      <w:hyperlink r:id="rId15" w:history="1">
+        <w:r>
+          <w:rPr>
+            <w:rStyle w:val="Hyperlink"/>
+            <w:sz w:val="24"/>
+            <w:szCs w:val="24"/>
+          </w:rPr>
+          <w:t>https://icons.getbootstrap.com</w:t>
+        </w:r>
+      </w:hyperlink>
     </w:p>
     <w:p>
       <w:pPr>
@@ -1804,6 +2988,16 @@
           <w:szCs w:val="24"/>
         </w:rPr>
       </w:pPr>
+      <w:hyperlink r:id="rId16" w:history="1">
+        <w:r>
+          <w:rPr>
+            <w:rStyle w:val="Hyperlink"/>
+            <w:sz w:val="24"/>
+            <w:szCs w:val="24"/>
+          </w:rPr>
+          <w:t>https://cdn.jsdelivr.net/npm/bootstrap-icons@1.11.3/font/bootstrap-icons.min.css</w:t>
+        </w:r>
+      </w:hyperlink>
     </w:p>
     <w:p>
       <w:pPr>
@@ -1813,6 +3007,13 @@
           <w:szCs w:val="24"/>
         </w:rPr>
       </w:pPr>
+      <w:r>
+        <w:rPr>
+          <w:sz w:val="24"/>
+          <w:szCs w:val="24"/>
+        </w:rPr>
+        <w:t>ERD Diagram Tool:</w:t>
+      </w:r>
     </w:p>
     <w:p>
       <w:pPr>
@@ -1822,9 +3023,143 @@
           <w:szCs w:val="24"/>
         </w:rPr>
       </w:pPr>
+      <w:hyperlink r:id="rId17" w:history="1">
+        <w:r>
+          <w:rPr>
+            <w:rStyle w:val="Hyperlink"/>
+            <w:sz w:val="24"/>
+            <w:szCs w:val="24"/>
+          </w:rPr>
+          <w:t>https://mermaid.live/edit#pako:eNqtU1Fv2jAQ_ivWPVMUisE0b1OXVlVVtaPwsAkJefGRuiV2ajtbGeW_zzYJMIamTZqf4u----7z3WUNuRYIKaD5KHlheDlTxJ_r8f30gby_n53pNZk-ZmOSkhlwa2WhUBCnZ7AlxljDG2efptnjJFJL_oK2JV1-mGTX9-PPLfFmkt1FVr4Mkgu5p8bQCT2DrzVa52tLFbiHNtfbSzhSOSIFebjdQ9YZqQqieIlbcNNmR-9_lVxbNHuBg0Dl_X_XRvwWwJLL5R79qvUSuSLSzm1doQmCp6OOLxYnIzx38tuBA8EdOlli_Jg_a-kHc_TAXd__sUPhOHxzRKDNjayc1OpIOs7pv8m2Cq81V0661a9o7h9YaLOa-wJXt0dG2iX5s5cAhZ4fSuyoDstjvPHup-Fqe6LnzTrOA9AYgg4URgpInamxAyUavwL-CtHZDNwT-</w:t>
+        </w:r>
+        <w:r>
+          <w:rPr>
+            <w:rStyle w:val="Hyperlink"/>
+            <w:sz w:val="24"/>
+            <w:szCs w:val="24"/>
+          </w:rPr>
+          <w:lastRenderedPageBreak/>
+          <w:t>kZAWGbBzUtY4pBTcfVF67JNM7ouniBd8KX1t7oKBZo_c4caVALNpa6Vg5T2ogaka3iDtNdjXcrYRcIGfTqkyagDq4Ced3tDNuyPLihLKE3YpgM_YtWkywYJHZ0PhrSf-Jw-2_wE0nA1CQ</w:t>
+        </w:r>
+      </w:hyperlink>
+    </w:p>
+    <w:p>
+      <w:pPr>
+        <w:jc w:val="both"/>
+        <w:rPr>
+          <w:sz w:val="24"/>
+          <w:szCs w:val="24"/>
+        </w:rPr>
+      </w:pPr>
+      <w:r>
+        <w:rPr>
+          <w:sz w:val="24"/>
+          <w:szCs w:val="24"/>
+        </w:rPr>
+        <w:t xml:space="preserve">Bootstrap JS </w:t>
+      </w:r>
+      <w:r>
+        <w:rPr>
+          <w:sz w:val="24"/>
+          <w:szCs w:val="24"/>
+        </w:rPr>
+        <w:t>Simple Interactivity</w:t>
+      </w:r>
+    </w:p>
+    <w:p>
+      <w:pPr>
+        <w:jc w:val="both"/>
+        <w:rPr>
+          <w:sz w:val="24"/>
+          <w:szCs w:val="24"/>
+        </w:rPr>
+      </w:pPr>
+      <w:hyperlink r:id="rId18" w:history="1">
+        <w:r>
+          <w:rPr>
+            <w:rStyle w:val="Hyperlink"/>
+            <w:sz w:val="24"/>
+            <w:szCs w:val="24"/>
+          </w:rPr>
+          <w:t>https://getbootstrap.com/docs/5.3/getting-started/introduction/</w:t>
+        </w:r>
+      </w:hyperlink>
+    </w:p>
+    <w:p>
+      <w:pPr>
+        <w:jc w:val="both"/>
+        <w:rPr>
+          <w:sz w:val="24"/>
+          <w:szCs w:val="24"/>
+        </w:rPr>
+      </w:pPr>
+      <w:hyperlink r:id="rId19" w:history="1">
+        <w:r>
+          <w:rPr>
+            <w:rStyle w:val="Hyperlink"/>
+            <w:sz w:val="24"/>
+            <w:szCs w:val="24"/>
+          </w:rPr>
+          <w:t>https://cdn.jsdelivr.net/npm/bootstrap@5.3.8/dist/js/bootstrap.bundle.min.js</w:t>
+        </w:r>
+      </w:hyperlink>
+    </w:p>
+    <w:p>
+      <w:pPr>
+        <w:jc w:val="both"/>
+        <w:rPr>
+          <w:sz w:val="24"/>
+          <w:szCs w:val="24"/>
+        </w:rPr>
+      </w:pPr>
+    </w:p>
+    <w:p>
+      <w:pPr>
+        <w:jc w:val="both"/>
+        <w:rPr>
+          <w:sz w:val="24"/>
+          <w:szCs w:val="24"/>
+        </w:rPr>
+      </w:pPr>
+    </w:p>
+    <w:p>
+      <w:pPr>
+        <w:jc w:val="both"/>
+        <w:rPr>
+          <w:sz w:val="24"/>
+          <w:szCs w:val="24"/>
+        </w:rPr>
+      </w:pPr>
+    </w:p>
+    <w:p>
+      <w:pPr>
+        <w:jc w:val="both"/>
+        <w:rPr>
+          <w:sz w:val="24"/>
+          <w:szCs w:val="24"/>
+        </w:rPr>
+      </w:pPr>
+    </w:p>
+    <w:p>
+      <w:pPr>
+        <w:jc w:val="both"/>
+        <w:rPr>
+          <w:sz w:val="24"/>
+          <w:szCs w:val="24"/>
+        </w:rPr>
+      </w:pPr>
+    </w:p>
+    <w:p>
+      <w:pPr>
+        <w:jc w:val="both"/>
+        <w:rPr>
+          <w:sz w:val="24"/>
+          <w:szCs w:val="24"/>
+        </w:rPr>
+      </w:pPr>
     </w:p>
     <w:sectPr>
-      <w:headerReference w:type="default" r:id="rId14"/>
+      <w:headerReference w:type="default" r:id="rId20"/>
       <w:pgSz w:w="12240" w:h="15840"/>
       <w:pgMar w:top="1440" w:right="1800" w:bottom="1440" w:left="1800" w:header="720" w:footer="720" w:gutter="0"/>
       <w:cols w:space="720"/>
@@ -3411,7 +4746,6 @@
   <w:style w:type="character" w:default="1" w:styleId="DefaultParagraphFont">
     <w:name w:val="Default Paragraph Font"/>
     <w:uiPriority w:val="1"/>
-    <w:semiHidden/>
     <w:unhideWhenUsed/>
   </w:style>
   <w:style w:type="table" w:default="1" w:styleId="TableNormal">

</xml_diff>

<commit_message>
more documentation and changing around user guiding sentences
Co-authored-by: Copilot <copilot@github.com>
</commit_message>
<xml_diff>
--- a/ReportTemplateSample.docx
+++ b/ReportTemplateSample.docx
@@ -71,8 +71,13 @@
           </w:tcPr>
           <w:p>
             <w:r>
-              <w:t>Matas Zostautas</w:t>
+              <w:t xml:space="preserve">Matas </w:t>
             </w:r>
+            <w:proofErr w:type="spellStart"/>
+            <w:r>
+              <w:t>Zostautas</w:t>
+            </w:r>
+            <w:proofErr w:type="spellEnd"/>
           </w:p>
         </w:tc>
       </w:tr>
@@ -241,8 +246,13 @@
         <w:t xml:space="preserve">Student Signature: </w:t>
       </w:r>
       <w:r>
-        <w:t>Matas Zostautas</w:t>
-      </w:r>
+        <w:t xml:space="preserve">Matas </w:t>
+      </w:r>
+      <w:proofErr w:type="spellStart"/>
+      <w:r>
+        <w:t>Zostautas</w:t>
+      </w:r>
+      <w:proofErr w:type="spellEnd"/>
     </w:p>
     <w:p>
       <w:r>
@@ -560,13 +570,23 @@
           <w:szCs w:val="24"/>
         </w:rPr>
       </w:pPr>
+      <w:proofErr w:type="spellStart"/>
       <w:r>
         <w:rPr>
           <w:rFonts w:cs="Arial"/>
           <w:sz w:val="24"/>
           <w:szCs w:val="24"/>
         </w:rPr>
-        <w:t>Assetra is a web-based school inventory management system designed to show how an educational institution tracks, lends, and manages assets such as laptops, projectors, laboratory equipment, textbooks and more. Schools often rely on spreadsheets or paper logs to keep track of which items have been loaned to which student and when those items are due to be returned. This approach could have errors, difficult to keep track, and difficult to always see stock levels.</w:t>
+        <w:t>Assetra</w:t>
+      </w:r>
+      <w:proofErr w:type="spellEnd"/>
+      <w:r>
+        <w:rPr>
+          <w:rFonts w:cs="Arial"/>
+          <w:sz w:val="24"/>
+          <w:szCs w:val="24"/>
+        </w:rPr>
+        <w:t xml:space="preserve"> is a web-based school inventory management system designed to show how an educational institution tracks, lends, and manages assets such as laptops, projectors, laboratory equipment, textbooks and more. Schools often rely on spreadsheets or paper logs to keep track of which items have been loaned to which student and when those items are due to be returned. This approach could have errors, difficult to keep track, and difficult to always see stock levels.</w:t>
       </w:r>
     </w:p>
     <w:p>
@@ -585,7 +605,25 @@
           <w:sz w:val="24"/>
           <w:szCs w:val="24"/>
         </w:rPr>
-        <w:t xml:space="preserve">The Assetra platform will address </w:t>
+        <w:t xml:space="preserve">The </w:t>
+      </w:r>
+      <w:proofErr w:type="spellStart"/>
+      <w:r>
+        <w:rPr>
+          <w:rFonts w:cs="Arial"/>
+          <w:sz w:val="24"/>
+          <w:szCs w:val="24"/>
+        </w:rPr>
+        <w:t>Assetra</w:t>
+      </w:r>
+      <w:proofErr w:type="spellEnd"/>
+      <w:r>
+        <w:rPr>
+          <w:rFonts w:cs="Arial"/>
+          <w:sz w:val="24"/>
+          <w:szCs w:val="24"/>
+        </w:rPr>
+        <w:t xml:space="preserve"> platform will address </w:t>
       </w:r>
       <w:r>
         <w:rPr>
@@ -876,108 +914,45 @@
         <w:spacing w:after="0" w:line="240" w:lineRule="auto"/>
         <w:jc w:val="both"/>
         <w:rPr>
-          <w:color w:val="FF0000"/>
-        </w:rPr>
-      </w:pPr>
-      <w:r>
-        <w:rPr>
-          <w:color w:val="FF0000"/>
-        </w:rPr>
-        <w:t xml:space="preserve">Draw </w:t>
-      </w:r>
-      <w:r>
-        <w:rPr>
-          <w:color w:val="FF0000"/>
-        </w:rPr>
-        <w:t>U</w:t>
-      </w:r>
-      <w:r>
-        <w:rPr>
-          <w:color w:val="FF0000"/>
-        </w:rPr>
-        <w:t xml:space="preserve">se </w:t>
-      </w:r>
-      <w:r>
-        <w:rPr>
-          <w:color w:val="FF0000"/>
-        </w:rPr>
-        <w:t>C</w:t>
-      </w:r>
-      <w:r>
-        <w:rPr>
-          <w:color w:val="FF0000"/>
-        </w:rPr>
-        <w:t xml:space="preserve">ase </w:t>
-      </w:r>
-      <w:r>
-        <w:rPr>
-          <w:color w:val="FF0000"/>
-        </w:rPr>
-        <w:t>D</w:t>
-      </w:r>
-      <w:r>
-        <w:rPr>
-          <w:color w:val="FF0000"/>
-        </w:rPr>
-        <w:t>iagrams for</w:t>
-      </w:r>
-      <w:r>
-        <w:rPr>
-          <w:color w:val="FF0000"/>
-        </w:rPr>
-        <w:t xml:space="preserve"> all the use cases implemented in your project. For </w:t>
-      </w:r>
-      <w:r>
-        <w:rPr>
-          <w:color w:val="FF0000"/>
-        </w:rPr>
-        <w:t>each</w:t>
-      </w:r>
-      <w:r>
-        <w:rPr>
-          <w:color w:val="FF0000"/>
-        </w:rPr>
-        <w:t xml:space="preserve"> </w:t>
-      </w:r>
-      <w:r>
-        <w:rPr>
-          <w:color w:val="FF0000"/>
-        </w:rPr>
-        <w:t xml:space="preserve">use </w:t>
-      </w:r>
-      <w:r>
-        <w:rPr>
-          <w:color w:val="FF0000"/>
-        </w:rPr>
-        <w:t xml:space="preserve">case, give some explanation. </w:t>
-      </w:r>
-    </w:p>
-    <w:p>
-      <w:pPr>
-        <w:spacing w:after="0" w:line="240" w:lineRule="auto"/>
-        <w:jc w:val="both"/>
-        <w:rPr>
-          <w:sz w:val="24"/>
-          <w:szCs w:val="24"/>
-        </w:rPr>
-      </w:pPr>
-      <w:r>
-        <w:rPr>
-          <w:sz w:val="24"/>
-          <w:szCs w:val="24"/>
-        </w:rPr>
-        <w:t xml:space="preserve">Assetra implements many use cases across all the different roles. </w:t>
-      </w:r>
-    </w:p>
-    <w:p>
-      <w:pPr>
-        <w:spacing w:after="0" w:line="240" w:lineRule="auto"/>
-        <w:jc w:val="both"/>
-        <w:rPr>
-          <w:sz w:val="24"/>
-          <w:szCs w:val="24"/>
-        </w:rPr>
-      </w:pPr>
+          <w:sz w:val="24"/>
+          <w:szCs w:val="24"/>
+        </w:rPr>
+      </w:pPr>
+      <w:r>
+        <w:rPr>
+          <w:sz w:val="24"/>
+          <w:szCs w:val="24"/>
+        </w:rPr>
+        <w:t xml:space="preserve">The system supports </w:t>
+      </w:r>
+      <w:r>
+        <w:rPr>
+          <w:sz w:val="24"/>
+          <w:szCs w:val="24"/>
+        </w:rPr>
+        <w:t>3 key roles</w:t>
+      </w:r>
+      <w:r>
+        <w:rPr>
+          <w:sz w:val="24"/>
+          <w:szCs w:val="24"/>
+        </w:rPr>
+        <w:t>:</w:t>
+      </w:r>
+      <w:r>
+        <w:rPr>
+          <w:sz w:val="24"/>
+          <w:szCs w:val="24"/>
+        </w:rPr>
+        <w:t xml:space="preserve"> Staff, Student, </w:t>
+      </w:r>
+      <w:r>
+        <w:rPr>
+          <w:sz w:val="24"/>
+          <w:szCs w:val="24"/>
+        </w:rPr>
+        <w:t xml:space="preserve">and Manager. There are 2 other roles that do not play a significant role in the system. One role is the user role (basic) and is very restricted (can only view items) whereas the admin role may do and overlook everything. </w:t>
+      </w:r>
     </w:p>
     <w:p>
       <w:pPr>
@@ -1895,7 +1870,14 @@
           <w:sz w:val="24"/>
           <w:szCs w:val="24"/>
         </w:rPr>
-        <w:t>Use Case 15: View Request History</w:t>
+        <w:t xml:space="preserve">Use Case 15: View </w:t>
+      </w:r>
+      <w:r>
+        <w:rPr>
+          <w:sz w:val="24"/>
+          <w:szCs w:val="24"/>
+        </w:rPr>
+        <w:t>All Requests Made</w:t>
       </w:r>
     </w:p>
     <w:p>
@@ -2017,14 +1999,20 @@
         <w:spacing w:after="0" w:line="240" w:lineRule="auto"/>
         <w:jc w:val="both"/>
         <w:rPr>
-          <w:sz w:val="24"/>
-          <w:szCs w:val="24"/>
-        </w:rPr>
-      </w:pPr>
-      <w:r>
-        <w:rPr>
-          <w:sz w:val="24"/>
-          <w:szCs w:val="24"/>
+          <w:b/>
+          <w:bCs/>
+          <w:sz w:val="24"/>
+          <w:szCs w:val="24"/>
+          <w:u w:val="single"/>
+        </w:rPr>
+      </w:pPr>
+      <w:r>
+        <w:rPr>
+          <w:b/>
+          <w:bCs/>
+          <w:sz w:val="24"/>
+          <w:szCs w:val="24"/>
+          <w:u w:val="single"/>
         </w:rPr>
         <w:lastRenderedPageBreak/>
         <w:t>Entities and Attributes</w:t>
@@ -2212,12 +2200,21 @@
           <w:szCs w:val="24"/>
         </w:rPr>
       </w:pPr>
-      <w:r>
-        <w:rPr>
-          <w:sz w:val="24"/>
-          <w:szCs w:val="24"/>
-        </w:rPr>
-        <w:t>category_id(FK – Category) – The category the item belongs to</w:t>
+      <w:proofErr w:type="spellStart"/>
+      <w:r>
+        <w:rPr>
+          <w:sz w:val="24"/>
+          <w:szCs w:val="24"/>
+        </w:rPr>
+        <w:t>category_id</w:t>
+      </w:r>
+      <w:proofErr w:type="spellEnd"/>
+      <w:r>
+        <w:rPr>
+          <w:sz w:val="24"/>
+          <w:szCs w:val="24"/>
+        </w:rPr>
+        <w:t>(FK – Category) – The category the item belongs to</w:t>
       </w:r>
     </w:p>
     <w:p>
@@ -2261,21 +2258,7 @@
           <w:sz w:val="24"/>
           <w:szCs w:val="24"/>
         </w:rPr>
-        <w:t>id(PK)</w:t>
-      </w:r>
-      <w:r>
-        <w:rPr>
-          <w:sz w:val="24"/>
-          <w:szCs w:val="24"/>
-        </w:rPr>
-        <w:t>- Primary key for each item.</w:t>
-      </w:r>
-      <w:r>
-        <w:rPr>
-          <w:sz w:val="24"/>
-          <w:szCs w:val="24"/>
-        </w:rPr>
-        <w:t>.</w:t>
+        <w:t>Request</w:t>
       </w:r>
     </w:p>
     <w:p>
@@ -2292,7 +2275,7 @@
           <w:sz w:val="24"/>
           <w:szCs w:val="24"/>
         </w:rPr>
-        <w:t xml:space="preserve">name(string) — The name of the item. </w:t>
+        <w:t>id(PK) – Primary key for each request</w:t>
       </w:r>
     </w:p>
     <w:p>
@@ -2304,40 +2287,21 @@
           <w:szCs w:val="24"/>
         </w:rPr>
       </w:pPr>
-      <w:r>
-        <w:rPr>
-          <w:sz w:val="24"/>
-          <w:szCs w:val="24"/>
-        </w:rPr>
-        <w:t>description(</w:t>
-      </w:r>
-      <w:r>
-        <w:rPr>
-          <w:sz w:val="24"/>
-          <w:szCs w:val="24"/>
-        </w:rPr>
-        <w:t>string</w:t>
-      </w:r>
-      <w:r>
-        <w:rPr>
-          <w:sz w:val="24"/>
-          <w:szCs w:val="24"/>
-        </w:rPr>
-        <w:t xml:space="preserve">) </w:t>
-      </w:r>
-      <w:r>
-        <w:rPr>
-          <w:sz w:val="24"/>
-          <w:szCs w:val="24"/>
-        </w:rPr>
-        <w:t xml:space="preserve">- </w:t>
-      </w:r>
-      <w:r>
-        <w:rPr>
-          <w:sz w:val="24"/>
-          <w:szCs w:val="24"/>
-        </w:rPr>
-        <w:t xml:space="preserve">A description of the item. </w:t>
+      <w:proofErr w:type="spellStart"/>
+      <w:r>
+        <w:rPr>
+          <w:sz w:val="24"/>
+          <w:szCs w:val="24"/>
+        </w:rPr>
+        <w:t>user_id</w:t>
+      </w:r>
+      <w:proofErr w:type="spellEnd"/>
+      <w:r>
+        <w:rPr>
+          <w:sz w:val="24"/>
+          <w:szCs w:val="24"/>
+        </w:rPr>
+        <w:t>(FK – User) – The student who made the request</w:t>
       </w:r>
     </w:p>
     <w:p>
@@ -2349,26 +2313,21 @@
           <w:szCs w:val="24"/>
         </w:rPr>
       </w:pPr>
-      <w:r>
-        <w:rPr>
-          <w:sz w:val="24"/>
-          <w:szCs w:val="24"/>
-        </w:rPr>
-        <w:t>quantity(int)</w:t>
-      </w:r>
-      <w:r>
-        <w:rPr>
-          <w:sz w:val="24"/>
-          <w:szCs w:val="24"/>
-        </w:rPr>
-        <w:t xml:space="preserve">-  </w:t>
-      </w:r>
-      <w:r>
-        <w:rPr>
-          <w:sz w:val="24"/>
-          <w:szCs w:val="24"/>
-        </w:rPr>
-        <w:t xml:space="preserve">The current stock level available. </w:t>
+      <w:proofErr w:type="spellStart"/>
+      <w:r>
+        <w:rPr>
+          <w:sz w:val="24"/>
+          <w:szCs w:val="24"/>
+        </w:rPr>
+        <w:t>item_id</w:t>
+      </w:r>
+      <w:proofErr w:type="spellEnd"/>
+      <w:r>
+        <w:rPr>
+          <w:sz w:val="24"/>
+          <w:szCs w:val="24"/>
+        </w:rPr>
+        <w:t>(FK – Item) – The item being requested</w:t>
       </w:r>
     </w:p>
     <w:p>
@@ -2385,35 +2344,7 @@
           <w:sz w:val="24"/>
           <w:szCs w:val="24"/>
         </w:rPr>
-        <w:t xml:space="preserve">category_id (FK </w:t>
-      </w:r>
-      <w:r>
-        <w:rPr>
-          <w:sz w:val="24"/>
-          <w:szCs w:val="24"/>
-        </w:rPr>
-        <w:t xml:space="preserve"> - </w:t>
-      </w:r>
-      <w:r>
-        <w:rPr>
-          <w:sz w:val="24"/>
-          <w:szCs w:val="24"/>
-        </w:rPr>
-        <w:t xml:space="preserve">Category) </w:t>
-      </w:r>
-      <w:r>
-        <w:rPr>
-          <w:sz w:val="24"/>
-          <w:szCs w:val="24"/>
-        </w:rPr>
-        <w:t xml:space="preserve">- </w:t>
-      </w:r>
-      <w:r>
-        <w:rPr>
-          <w:sz w:val="24"/>
-          <w:szCs w:val="24"/>
-        </w:rPr>
-        <w:t>The category this item belongs to.</w:t>
+        <w:t>status(string) – Pending, Approved, Rejected, or Returned</w:t>
       </w:r>
     </w:p>
     <w:p>
@@ -2425,6 +2356,22 @@
           <w:szCs w:val="24"/>
         </w:rPr>
       </w:pPr>
+      <w:proofErr w:type="spellStart"/>
+      <w:r>
+        <w:rPr>
+          <w:sz w:val="24"/>
+          <w:szCs w:val="24"/>
+        </w:rPr>
+        <w:t>request_date</w:t>
+      </w:r>
+      <w:proofErr w:type="spellEnd"/>
+      <w:r>
+        <w:rPr>
+          <w:sz w:val="24"/>
+          <w:szCs w:val="24"/>
+        </w:rPr>
+        <w:t>(datetime) – Timestamp of when the request was made</w:t>
+      </w:r>
     </w:p>
     <w:p>
       <w:pPr>
@@ -2435,13 +2382,6 @@
           <w:szCs w:val="24"/>
         </w:rPr>
       </w:pPr>
-      <w:r>
-        <w:rPr>
-          <w:sz w:val="24"/>
-          <w:szCs w:val="24"/>
-        </w:rPr>
-        <w:t>User and Group (Django Admin)</w:t>
-      </w:r>
     </w:p>
     <w:p>
       <w:pPr>
@@ -2457,7 +2397,7 @@
           <w:sz w:val="24"/>
           <w:szCs w:val="24"/>
         </w:rPr>
-        <w:t>User holds credentials and profile info. Each user belongs to a group in the system</w:t>
+        <w:t>User and Group (Django Admin)</w:t>
       </w:r>
     </w:p>
     <w:p>
@@ -2474,8 +2414,170 @@
           <w:sz w:val="24"/>
           <w:szCs w:val="24"/>
         </w:rPr>
-        <w:t>The group defines the role. This can be Admin, Staff, Student, or Manager</w:t>
-      </w:r>
+        <w:t>User holds credentials and profile info. Each user belongs to a group in the system</w:t>
+      </w:r>
+    </w:p>
+    <w:p>
+      <w:pPr>
+        <w:spacing w:after="0" w:line="240" w:lineRule="auto"/>
+        <w:jc w:val="both"/>
+        <w:rPr>
+          <w:sz w:val="24"/>
+          <w:szCs w:val="24"/>
+        </w:rPr>
+      </w:pPr>
+      <w:r>
+        <w:rPr>
+          <w:sz w:val="24"/>
+          <w:szCs w:val="24"/>
+        </w:rPr>
+        <w:t xml:space="preserve">The group defines the role. This can be Admin, Staff, Student, </w:t>
+      </w:r>
+      <w:r>
+        <w:rPr>
+          <w:sz w:val="24"/>
+          <w:szCs w:val="24"/>
+        </w:rPr>
+        <w:t>Manager or a basic User.</w:t>
+      </w:r>
+    </w:p>
+    <w:p>
+      <w:pPr>
+        <w:spacing w:after="0" w:line="240" w:lineRule="auto"/>
+        <w:jc w:val="both"/>
+        <w:rPr>
+          <w:b/>
+          <w:bCs/>
+          <w:sz w:val="24"/>
+          <w:szCs w:val="24"/>
+          <w:u w:val="single"/>
+        </w:rPr>
+      </w:pPr>
+    </w:p>
+    <w:p>
+      <w:pPr>
+        <w:spacing w:after="0" w:line="240" w:lineRule="auto"/>
+        <w:jc w:val="both"/>
+        <w:rPr>
+          <w:b/>
+          <w:bCs/>
+          <w:sz w:val="24"/>
+          <w:szCs w:val="24"/>
+          <w:u w:val="single"/>
+        </w:rPr>
+      </w:pPr>
+      <w:r>
+        <w:rPr>
+          <w:b/>
+          <w:bCs/>
+          <w:sz w:val="24"/>
+          <w:szCs w:val="24"/>
+          <w:u w:val="single"/>
+        </w:rPr>
+        <w:t>Relationship</w:t>
+      </w:r>
+      <w:r>
+        <w:rPr>
+          <w:b/>
+          <w:bCs/>
+          <w:sz w:val="24"/>
+          <w:szCs w:val="24"/>
+          <w:u w:val="single"/>
+        </w:rPr>
+        <w:t>s</w:t>
+      </w:r>
+    </w:p>
+    <w:p>
+      <w:pPr>
+        <w:spacing w:after="0" w:line="240" w:lineRule="auto"/>
+        <w:jc w:val="both"/>
+        <w:rPr>
+          <w:sz w:val="24"/>
+          <w:szCs w:val="24"/>
+        </w:rPr>
+      </w:pPr>
+      <w:r>
+        <w:rPr>
+          <w:sz w:val="24"/>
+          <w:szCs w:val="24"/>
+        </w:rPr>
+        <w:t>Category (1 to Many) Item: a category can contain many items and each items belong exactly to one category.</w:t>
+      </w:r>
+    </w:p>
+    <w:p>
+      <w:pPr>
+        <w:spacing w:after="0" w:line="240" w:lineRule="auto"/>
+        <w:jc w:val="both"/>
+        <w:rPr>
+          <w:sz w:val="24"/>
+          <w:szCs w:val="24"/>
+        </w:rPr>
+      </w:pPr>
+      <w:r>
+        <w:rPr>
+          <w:sz w:val="24"/>
+          <w:szCs w:val="24"/>
+        </w:rPr>
+        <w:t>User (1 to Many) Request: a user can make many requests.</w:t>
+      </w:r>
+    </w:p>
+    <w:p>
+      <w:pPr>
+        <w:spacing w:after="0" w:line="240" w:lineRule="auto"/>
+        <w:jc w:val="both"/>
+        <w:rPr>
+          <w:sz w:val="24"/>
+          <w:szCs w:val="24"/>
+        </w:rPr>
+      </w:pPr>
+      <w:r>
+        <w:rPr>
+          <w:sz w:val="24"/>
+          <w:szCs w:val="24"/>
+        </w:rPr>
+        <w:t>Item (1 to Many) Request: an item can be requested many times.</w:t>
+      </w:r>
+    </w:p>
+    <w:p>
+      <w:pPr>
+        <w:spacing w:after="0" w:line="240" w:lineRule="auto"/>
+        <w:jc w:val="both"/>
+        <w:rPr>
+          <w:sz w:val="24"/>
+          <w:szCs w:val="24"/>
+        </w:rPr>
+      </w:pPr>
+      <w:r>
+        <w:rPr>
+          <w:sz w:val="24"/>
+          <w:szCs w:val="24"/>
+        </w:rPr>
+        <w:t>User (Many to 1</w:t>
+      </w:r>
+      <w:r>
+        <w:rPr>
+          <w:sz w:val="24"/>
+          <w:szCs w:val="24"/>
+        </w:rPr>
+        <w:t>) Group</w:t>
+      </w:r>
+      <w:r>
+        <w:rPr>
+          <w:sz w:val="24"/>
+          <w:szCs w:val="24"/>
+        </w:rPr>
+        <w:t>: many users can be in one group.</w:t>
+      </w:r>
+    </w:p>
+    <w:p>
+      <w:pPr>
+        <w:spacing w:after="0" w:line="240" w:lineRule="auto"/>
+        <w:jc w:val="both"/>
+        <w:rPr>
+          <w:sz w:val="24"/>
+          <w:szCs w:val="24"/>
+        </w:rPr>
+      </w:pPr>
     </w:p>
     <w:p>
       <w:pPr>
@@ -2515,6 +2617,387 @@
       </w:r>
     </w:p>
     <w:p>
+      <w:proofErr w:type="spellStart"/>
+      <w:r>
+        <w:t>Assetra</w:t>
+      </w:r>
+      <w:proofErr w:type="spellEnd"/>
+      <w:r>
+        <w:t xml:space="preserve"> us built using Django’s Model-View-Template (MVT) architecture.</w:t>
+      </w:r>
+    </w:p>
+    <w:p/>
+    <w:p>
+      <w:r>
+        <w:lastRenderedPageBreak/>
+        <w:t>Model (M)</w:t>
+      </w:r>
+    </w:p>
+    <w:p>
+      <w:r>
+        <w:t>The three models are defined in inventory/models.py</w:t>
+      </w:r>
+    </w:p>
+    <w:p>
+      <w:r>
+        <w:drawing>
+          <wp:inline distT="0" distB="0" distL="0" distR="0" wp14:anchorId="048D99A9" wp14:editId="474CA66F">
+            <wp:extent cx="3296110" cy="1200318"/>
+            <wp:effectExtent l="0" t="0" r="0" b="0"/>
+            <wp:docPr id="25759581" name="Picture 1"/>
+            <wp:cNvGraphicFramePr>
+              <a:graphicFrameLocks xmlns:a="http://schemas.openxmlformats.org/drawingml/2006/main" noChangeAspect="1"/>
+            </wp:cNvGraphicFramePr>
+            <a:graphic xmlns:a="http://schemas.openxmlformats.org/drawingml/2006/main">
+              <a:graphicData uri="http://schemas.openxmlformats.org/drawingml/2006/picture">
+                <pic:pic xmlns:pic="http://schemas.openxmlformats.org/drawingml/2006/picture">
+                  <pic:nvPicPr>
+                    <pic:cNvPr id="25759581" name=""/>
+                    <pic:cNvPicPr/>
+                  </pic:nvPicPr>
+                  <pic:blipFill>
+                    <a:blip r:embed="rId12"/>
+                    <a:stretch>
+                      <a:fillRect/>
+                    </a:stretch>
+                  </pic:blipFill>
+                  <pic:spPr>
+                    <a:xfrm>
+                      <a:off x="0" y="0"/>
+                      <a:ext cx="3296110" cy="1200318"/>
+                    </a:xfrm>
+                    <a:prstGeom prst="rect">
+                      <a:avLst/>
+                    </a:prstGeom>
+                  </pic:spPr>
+                </pic:pic>
+              </a:graphicData>
+            </a:graphic>
+          </wp:inline>
+        </w:drawing>
+      </w:r>
+    </w:p>
+    <w:p>
+      <w:r>
+        <w:drawing>
+          <wp:inline distT="0" distB="0" distL="0" distR="0" wp14:anchorId="6E9D6F44" wp14:editId="28C280AF">
+            <wp:extent cx="5077534" cy="1562318"/>
+            <wp:effectExtent l="0" t="0" r="8890" b="0"/>
+            <wp:docPr id="216181010" name="Picture 1"/>
+            <wp:cNvGraphicFramePr>
+              <a:graphicFrameLocks xmlns:a="http://schemas.openxmlformats.org/drawingml/2006/main" noChangeAspect="1"/>
+            </wp:cNvGraphicFramePr>
+            <a:graphic xmlns:a="http://schemas.openxmlformats.org/drawingml/2006/main">
+              <a:graphicData uri="http://schemas.openxmlformats.org/drawingml/2006/picture">
+                <pic:pic xmlns:pic="http://schemas.openxmlformats.org/drawingml/2006/picture">
+                  <pic:nvPicPr>
+                    <pic:cNvPr id="216181010" name=""/>
+                    <pic:cNvPicPr/>
+                  </pic:nvPicPr>
+                  <pic:blipFill>
+                    <a:blip r:embed="rId13"/>
+                    <a:stretch>
+                      <a:fillRect/>
+                    </a:stretch>
+                  </pic:blipFill>
+                  <pic:spPr>
+                    <a:xfrm>
+                      <a:off x="0" y="0"/>
+                      <a:ext cx="5077534" cy="1562318"/>
+                    </a:xfrm>
+                    <a:prstGeom prst="rect">
+                      <a:avLst/>
+                    </a:prstGeom>
+                  </pic:spPr>
+                </pic:pic>
+              </a:graphicData>
+            </a:graphic>
+          </wp:inline>
+        </w:drawing>
+      </w:r>
+    </w:p>
+    <w:p>
+      <w:r>
+        <w:drawing>
+          <wp:inline distT="0" distB="0" distL="0" distR="0" wp14:anchorId="5C27673B" wp14:editId="0C23A5F3">
+            <wp:extent cx="5486400" cy="2278380"/>
+            <wp:effectExtent l="0" t="0" r="0" b="7620"/>
+            <wp:docPr id="24231562" name="Picture 1"/>
+            <wp:cNvGraphicFramePr>
+              <a:graphicFrameLocks xmlns:a="http://schemas.openxmlformats.org/drawingml/2006/main" noChangeAspect="1"/>
+            </wp:cNvGraphicFramePr>
+            <a:graphic xmlns:a="http://schemas.openxmlformats.org/drawingml/2006/main">
+              <a:graphicData uri="http://schemas.openxmlformats.org/drawingml/2006/picture">
+                <pic:pic xmlns:pic="http://schemas.openxmlformats.org/drawingml/2006/picture">
+                  <pic:nvPicPr>
+                    <pic:cNvPr id="24231562" name=""/>
+                    <pic:cNvPicPr/>
+                  </pic:nvPicPr>
+                  <pic:blipFill>
+                    <a:blip r:embed="rId14"/>
+                    <a:stretch>
+                      <a:fillRect/>
+                    </a:stretch>
+                  </pic:blipFill>
+                  <pic:spPr>
+                    <a:xfrm>
+                      <a:off x="0" y="0"/>
+                      <a:ext cx="5486400" cy="2278380"/>
+                    </a:xfrm>
+                    <a:prstGeom prst="rect">
+                      <a:avLst/>
+                    </a:prstGeom>
+                  </pic:spPr>
+                </pic:pic>
+              </a:graphicData>
+            </a:graphic>
+          </wp:inline>
+        </w:drawing>
+      </w:r>
+    </w:p>
+    <w:p>
+      <w:r>
+        <w:t xml:space="preserve">There would have been a User and Group model here also however Django already has that built in the auth system, so I did not need to make this myself. Each new request has a date stamp with </w:t>
+      </w:r>
+      <w:proofErr w:type="spellStart"/>
+      <w:r>
+        <w:t>auto_now_add</w:t>
+      </w:r>
+      <w:proofErr w:type="spellEnd"/>
+      <w:r>
+        <w:t>=True and automatically defaults to a ‘PENDING’ status.</w:t>
+      </w:r>
+    </w:p>
+    <w:p/>
+    <w:p>
+      <w:r>
+        <w:t>View (V)</w:t>
+      </w:r>
+    </w:p>
+    <w:p>
+      <w:r>
+        <w:lastRenderedPageBreak/>
+        <w:t>Views are implemented a function-based views in inventory/views.py. Each view has its own unique function and is protected with the @login_required decorator</w:t>
+      </w:r>
+      <w:r>
+        <w:t>s and for role-specify views, simple helper functions check to see which role the logged in user is.</w:t>
+      </w:r>
+    </w:p>
+    <w:p>
+      <w:r>
+        <w:drawing>
+          <wp:inline distT="0" distB="0" distL="0" distR="0" wp14:anchorId="2AA094D0" wp14:editId="137FDE02">
+            <wp:extent cx="5486400" cy="2070100"/>
+            <wp:effectExtent l="0" t="0" r="0" b="6350"/>
+            <wp:docPr id="1241226797" name="Picture 1"/>
+            <wp:cNvGraphicFramePr>
+              <a:graphicFrameLocks xmlns:a="http://schemas.openxmlformats.org/drawingml/2006/main" noChangeAspect="1"/>
+            </wp:cNvGraphicFramePr>
+            <a:graphic xmlns:a="http://schemas.openxmlformats.org/drawingml/2006/main">
+              <a:graphicData uri="http://schemas.openxmlformats.org/drawingml/2006/picture">
+                <pic:pic xmlns:pic="http://schemas.openxmlformats.org/drawingml/2006/picture">
+                  <pic:nvPicPr>
+                    <pic:cNvPr id="1241226797" name=""/>
+                    <pic:cNvPicPr/>
+                  </pic:nvPicPr>
+                  <pic:blipFill>
+                    <a:blip r:embed="rId15"/>
+                    <a:stretch>
+                      <a:fillRect/>
+                    </a:stretch>
+                  </pic:blipFill>
+                  <pic:spPr>
+                    <a:xfrm>
+                      <a:off x="0" y="0"/>
+                      <a:ext cx="5486400" cy="2070100"/>
+                    </a:xfrm>
+                    <a:prstGeom prst="rect">
+                      <a:avLst/>
+                    </a:prstGeom>
+                  </pic:spPr>
+                </pic:pic>
+              </a:graphicData>
+            </a:graphic>
+          </wp:inline>
+        </w:drawing>
+      </w:r>
+    </w:p>
+    <w:p>
+      <w:r>
+        <w:t>To make the database a bit safer, invalid or unsafe database lookups were handled by get_object_or_404() which means that invalid ID’s return with a error response instead of crashing the entire server. Django’s messages framework is also implemented and is used to give the user feedback after every action, such as approving a request or successfully returning an item.</w:t>
+      </w:r>
+    </w:p>
+    <w:p>
+      <w:r>
+        <w:t xml:space="preserve">The home view is the central view. It essentially checks the logged in </w:t>
+      </w:r>
+      <w:r>
+        <w:t>user’s</w:t>
+      </w:r>
+      <w:r>
+        <w:t xml:space="preserve"> role and redirects them to the appropriate dashboard.</w:t>
+      </w:r>
+    </w:p>
+    <w:p>
+      <w:r>
+        <w:drawing>
+          <wp:inline distT="0" distB="0" distL="0" distR="0" wp14:anchorId="272D07D7" wp14:editId="059291EF">
+            <wp:extent cx="3762900" cy="1800476"/>
+            <wp:effectExtent l="0" t="0" r="9525" b="9525"/>
+            <wp:docPr id="1864370269" name="Picture 1"/>
+            <wp:cNvGraphicFramePr>
+              <a:graphicFrameLocks xmlns:a="http://schemas.openxmlformats.org/drawingml/2006/main" noChangeAspect="1"/>
+            </wp:cNvGraphicFramePr>
+            <a:graphic xmlns:a="http://schemas.openxmlformats.org/drawingml/2006/main">
+              <a:graphicData uri="http://schemas.openxmlformats.org/drawingml/2006/picture">
+                <pic:pic xmlns:pic="http://schemas.openxmlformats.org/drawingml/2006/picture">
+                  <pic:nvPicPr>
+                    <pic:cNvPr id="1864370269" name=""/>
+                    <pic:cNvPicPr/>
+                  </pic:nvPicPr>
+                  <pic:blipFill>
+                    <a:blip r:embed="rId16"/>
+                    <a:stretch>
+                      <a:fillRect/>
+                    </a:stretch>
+                  </pic:blipFill>
+                  <pic:spPr>
+                    <a:xfrm>
+                      <a:off x="0" y="0"/>
+                      <a:ext cx="3762900" cy="1800476"/>
+                    </a:xfrm>
+                    <a:prstGeom prst="rect">
+                      <a:avLst/>
+                    </a:prstGeom>
+                  </pic:spPr>
+                </pic:pic>
+              </a:graphicData>
+            </a:graphic>
+          </wp:inline>
+        </w:drawing>
+      </w:r>
+    </w:p>
+    <w:p>
+      <w:r>
+        <w:t xml:space="preserve">Fort the managers create/edit views, I used Django’s </w:t>
+      </w:r>
+      <w:proofErr w:type="spellStart"/>
+      <w:r>
+        <w:t>ModelForm</w:t>
+      </w:r>
+      <w:proofErr w:type="spellEnd"/>
+      <w:r>
+        <w:t xml:space="preserve"> class which is defined in inventory/forms.py. A </w:t>
+      </w:r>
+      <w:proofErr w:type="spellStart"/>
+      <w:r>
+        <w:t>ModelForm</w:t>
+      </w:r>
+      <w:proofErr w:type="spellEnd"/>
+      <w:r>
+        <w:t xml:space="preserve"> allowed me to easily </w:t>
+      </w:r>
+      <w:r>
+        <w:t>generate form fields meaning I did not have to write raw HTML &lt;input&gt; tags.</w:t>
+      </w:r>
+    </w:p>
+    <w:p/>
+    <w:p>
+      <w:r>
+        <w:t>Template (T)</w:t>
+      </w:r>
+    </w:p>
+    <w:p>
+      <w:r>
+        <w:lastRenderedPageBreak/>
+        <w:t>All templates are located in inventory/templates/inventory/ and extend off of a single shared base template (base.html).</w:t>
+      </w:r>
+    </w:p>
+    <w:p>
+      <w:pPr>
+        <w:pStyle w:val="ListParagraph"/>
+        <w:numPr>
+          <w:ilvl w:val="0"/>
+          <w:numId w:val="16"/>
+        </w:numPr>
+      </w:pPr>
+      <w:r>
+        <w:t>The base template contains:</w:t>
+      </w:r>
+    </w:p>
+    <w:p>
+      <w:pPr>
+        <w:pStyle w:val="ListParagraph"/>
+        <w:numPr>
+          <w:ilvl w:val="0"/>
+          <w:numId w:val="16"/>
+        </w:numPr>
+      </w:pPr>
+      <w:r>
+        <w:t>The site navigation bar with a role-coloured badge showing the logged in user and their assigned role.</w:t>
+      </w:r>
+    </w:p>
+    <w:p>
+      <w:pPr>
+        <w:pStyle w:val="ListParagraph"/>
+        <w:numPr>
+          <w:ilvl w:val="0"/>
+          <w:numId w:val="16"/>
+        </w:numPr>
+      </w:pPr>
+      <w:r>
+        <w:t>The message area (Django’s messages Framework)</w:t>
+      </w:r>
+    </w:p>
+    <w:p>
+      <w:pPr>
+        <w:pStyle w:val="ListParagraph"/>
+        <w:numPr>
+          <w:ilvl w:val="0"/>
+          <w:numId w:val="16"/>
+        </w:numPr>
+      </w:pPr>
+      <w:r>
+        <w:t>Bootstrap CSS + JS and Bootstrap Icons links</w:t>
+      </w:r>
+    </w:p>
+    <w:p>
+      <w:r>
+        <w:t xml:space="preserve">Each individual page templates (items.html, manage_requests.html, manager_dashboard.html and more) extends base.html and simply fills in the </w:t>
+      </w:r>
+      <w:r>
+        <w:t>{% block content %} block. This means that all these pages are inheriting the code from the base template and that means I only had to write the navbar and footer once.</w:t>
+      </w:r>
+    </w:p>
+    <w:p>
+      <w:r>
+        <w:t xml:space="preserve">Role-based page rendering is </w:t>
+      </w:r>
+      <w:proofErr w:type="spellStart"/>
+      <w:r>
+        <w:t>hanfled</w:t>
+      </w:r>
+      <w:proofErr w:type="spellEnd"/>
+      <w:r>
+        <w:t xml:space="preserve"> inside the templates using Django’s template tags. For example, the “Actions” columns on the items page shows different buttons </w:t>
+      </w:r>
+      <w:proofErr w:type="spellStart"/>
+      <w:r>
+        <w:t>deoending</w:t>
+      </w:r>
+      <w:proofErr w:type="spellEnd"/>
+      <w:r>
+        <w:t xml:space="preserve"> on who is currently logged in.</w:t>
+      </w:r>
+    </w:p>
+    <w:p/>
+    <w:p/>
+    <w:p/>
+    <w:p/>
+    <w:p/>
+    <w:p/>
+    <w:p/>
+    <w:p>
       <w:pPr>
         <w:spacing w:after="0"/>
         <w:jc w:val="both"/>
@@ -2788,44 +3271,6 @@
       <w:pPr>
         <w:jc w:val="both"/>
         <w:rPr>
-          <w:color w:val="FF0000"/>
-        </w:rPr>
-      </w:pPr>
-      <w:r>
-        <w:rPr>
-          <w:color w:val="FF0000"/>
-        </w:rPr>
-        <w:t xml:space="preserve">All sources </w:t>
-      </w:r>
-      <w:r>
-        <w:rPr>
-          <w:color w:val="FF0000"/>
-        </w:rPr>
-        <w:t xml:space="preserve">of media used in your project </w:t>
-      </w:r>
-      <w:r>
-        <w:rPr>
-          <w:color w:val="FF0000"/>
-        </w:rPr>
-        <w:t>must be included</w:t>
-      </w:r>
-      <w:r>
-        <w:rPr>
-          <w:color w:val="FF0000"/>
-        </w:rPr>
-        <w:t xml:space="preserve"> as required in the project brief</w:t>
-      </w:r>
-      <w:r>
-        <w:rPr>
-          <w:color w:val="FF0000"/>
-        </w:rPr>
-        <w:t xml:space="preserve">. </w:t>
-      </w:r>
-    </w:p>
-    <w:p>
-      <w:pPr>
-        <w:jc w:val="both"/>
-        <w:rPr>
           <w:sz w:val="24"/>
           <w:szCs w:val="24"/>
         </w:rPr>
@@ -2836,183 +3281,6 @@
           <w:szCs w:val="24"/>
         </w:rPr>
         <w:t>Use Case Diagram Tool</w:t>
-      </w:r>
-    </w:p>
-    <w:p>
-      <w:pPr>
-        <w:jc w:val="both"/>
-        <w:rPr>
-          <w:sz w:val="24"/>
-          <w:szCs w:val="24"/>
-        </w:rPr>
-      </w:pPr>
-      <w:hyperlink r:id="rId12" w:history="1">
-        <w:r>
-          <w:rPr>
-            <w:rStyle w:val="Hyperlink"/>
-            <w:sz w:val="24"/>
-            <w:szCs w:val="24"/>
-          </w:rPr>
-          <w:t>https://editor.plantuml.com/uml/SoWkIImgAStDuIhEpimhI2nAp5L8J2x9BmekgSn9LKWiJo</w:t>
-        </w:r>
-        <w:r>
-          <w:rPr>
-            <w:rStyle w:val="Hyperlink"/>
-            <w:sz w:val="24"/>
-            <w:szCs w:val="24"/>
-          </w:rPr>
-          <w:t>t</w:t>
-        </w:r>
-        <w:r>
-          <w:rPr>
-            <w:rStyle w:val="Hyperlink"/>
-            <w:sz w:val="24"/>
-            <w:szCs w:val="24"/>
-          </w:rPr>
-          <w:t>EpqtbiWejJYsoKj3LjLFG038rkPHy4pFp51nJSZFpb1GIYo4iBYMWd4991b1VGK5EPd9YIMO-H1gY2Qm8OWY4YQPKayiXDIy5v1W0</w:t>
-        </w:r>
-      </w:hyperlink>
-    </w:p>
-    <w:p>
-      <w:pPr>
-        <w:jc w:val="both"/>
-        <w:rPr>
-          <w:sz w:val="24"/>
-          <w:szCs w:val="24"/>
-        </w:rPr>
-      </w:pPr>
-    </w:p>
-    <w:p>
-      <w:pPr>
-        <w:jc w:val="both"/>
-        <w:rPr>
-          <w:sz w:val="24"/>
-          <w:szCs w:val="24"/>
-        </w:rPr>
-      </w:pPr>
-      <w:r>
-        <w:rPr>
-          <w:sz w:val="24"/>
-          <w:szCs w:val="24"/>
-        </w:rPr>
-        <w:t>Bootstrap CSS for Design:</w:t>
-      </w:r>
-    </w:p>
-    <w:p>
-      <w:pPr>
-        <w:jc w:val="both"/>
-        <w:rPr>
-          <w:sz w:val="24"/>
-          <w:szCs w:val="24"/>
-        </w:rPr>
-      </w:pPr>
-      <w:hyperlink r:id="rId13" w:history="1">
-        <w:r>
-          <w:rPr>
-            <w:rStyle w:val="Hyperlink"/>
-            <w:sz w:val="24"/>
-            <w:szCs w:val="24"/>
-          </w:rPr>
-          <w:t>https://getbootstrap.com/docs/5.3/getting-started/introduction/</w:t>
-        </w:r>
-      </w:hyperlink>
-    </w:p>
-    <w:p>
-      <w:pPr>
-        <w:jc w:val="both"/>
-        <w:rPr>
-          <w:sz w:val="24"/>
-          <w:szCs w:val="24"/>
-        </w:rPr>
-      </w:pPr>
-      <w:hyperlink r:id="rId14" w:history="1">
-        <w:r>
-          <w:rPr>
-            <w:rStyle w:val="Hyperlink"/>
-            <w:sz w:val="24"/>
-            <w:szCs w:val="24"/>
-          </w:rPr>
-          <w:t>https://cdn.jsdelivr.net/npm/bootstrap@5.3.8/dist/css/bootstrap.min.css</w:t>
-        </w:r>
-      </w:hyperlink>
-    </w:p>
-    <w:p>
-      <w:pPr>
-        <w:jc w:val="both"/>
-        <w:rPr>
-          <w:sz w:val="24"/>
-          <w:szCs w:val="24"/>
-        </w:rPr>
-      </w:pPr>
-    </w:p>
-    <w:p>
-      <w:pPr>
-        <w:jc w:val="both"/>
-        <w:rPr>
-          <w:sz w:val="24"/>
-          <w:szCs w:val="24"/>
-        </w:rPr>
-      </w:pPr>
-      <w:r>
-        <w:rPr>
-          <w:sz w:val="24"/>
-          <w:szCs w:val="24"/>
-        </w:rPr>
-        <w:t>Bootstrap CSS for Icons:</w:t>
-      </w:r>
-    </w:p>
-    <w:p>
-      <w:pPr>
-        <w:jc w:val="both"/>
-        <w:rPr>
-          <w:sz w:val="24"/>
-          <w:szCs w:val="24"/>
-        </w:rPr>
-      </w:pPr>
-      <w:hyperlink r:id="rId15" w:history="1">
-        <w:r>
-          <w:rPr>
-            <w:rStyle w:val="Hyperlink"/>
-            <w:sz w:val="24"/>
-            <w:szCs w:val="24"/>
-          </w:rPr>
-          <w:t>https://icons.getbootstrap.com</w:t>
-        </w:r>
-      </w:hyperlink>
-    </w:p>
-    <w:p>
-      <w:pPr>
-        <w:jc w:val="both"/>
-        <w:rPr>
-          <w:sz w:val="24"/>
-          <w:szCs w:val="24"/>
-        </w:rPr>
-      </w:pPr>
-      <w:hyperlink r:id="rId16" w:history="1">
-        <w:r>
-          <w:rPr>
-            <w:rStyle w:val="Hyperlink"/>
-            <w:sz w:val="24"/>
-            <w:szCs w:val="24"/>
-          </w:rPr>
-          <w:t>https://cdn.jsdelivr.net/npm/bootstrap-icons@1.11.3/font/bootstrap-icons.min.css</w:t>
-        </w:r>
-      </w:hyperlink>
-    </w:p>
-    <w:p>
-      <w:pPr>
-        <w:jc w:val="both"/>
-        <w:rPr>
-          <w:sz w:val="24"/>
-          <w:szCs w:val="24"/>
-        </w:rPr>
-      </w:pPr>
-      <w:r>
-        <w:rPr>
-          <w:sz w:val="24"/>
-          <w:szCs w:val="24"/>
-        </w:rPr>
-        <w:t>ERD Diagram Tool:</w:t>
       </w:r>
     </w:p>
     <w:p>
@@ -3030,16 +3298,7 @@
             <w:sz w:val="24"/>
             <w:szCs w:val="24"/>
           </w:rPr>
-          <w:t>https://mermaid.live/edit#pako:eNqtU1Fv2jAQ_ivWPVMUisE0b1OXVlVVtaPwsAkJefGRuiV2ajtbGeW_zzYJMIamTZqf4u----7z3WUNuRYIKaD5KHlheDlTxJ_r8f30gby_n53pNZk-ZmOSkhlwa2WhUBCnZ7AlxljDG2efptnjJFJL_oK2JV1-mGTX9-PPLfFmkt1FVr4Mkgu5p8bQCT2DrzVa52tLFbiHNtfbSzhSOSIFebjdQ9YZqQqieIlbcNNmR-9_lVxbNHuBg0Dl_X_XRvwWwJLL5R79qvUSuSLSzm1doQmCp6OOLxYnIzx38tuBA8EdOlli_Jg_a-kHc_TAXd__sUPhOHxzRKDNjayc1OpIOs7pv8m2Cq81V0661a9o7h9YaLOa-wJXt0dG2iX5s5cAhZ4fSuyoDstjvPHup-Fqe6LnzTrOA9AYgg4URgpInamxAyUavwL-CtHZDNwT-</w:t>
-        </w:r>
-        <w:r>
-          <w:rPr>
-            <w:rStyle w:val="Hyperlink"/>
-            <w:sz w:val="24"/>
-            <w:szCs w:val="24"/>
-          </w:rPr>
-          <w:lastRenderedPageBreak/>
-          <w:t>kZAWGbBzUtY4pBTcfVF67JNM7ouniBd8KX1t7oKBZo_c4caVALNpa6Vg5T2ogaka3iDtNdjXcrYRcIGfTqkyagDq4Ced3tDNuyPLihLKE3YpgM_YtWkywYJHZ0PhrSf-Jw-2_wE0nA1CQ</w:t>
+          <w:t>https://editor.plantuml.com/uml/SoWkIImgAStDuIhEpimhI2nAp5L8J2x9BmekgSn9LKWiJotEpqtbiWejJYsoKj3LjLFG038rkPHy4pFp51nJSZFpb1GIYo4iBYMWd4991b1VGK5EPd9YIMO-H1gY2Qm8OWY4YQPKayiXDIy5v1W0</w:t>
         </w:r>
       </w:hyperlink>
     </w:p>
@@ -3051,19 +3310,21 @@
           <w:szCs w:val="24"/>
         </w:rPr>
       </w:pPr>
-      <w:r>
-        <w:rPr>
-          <w:sz w:val="24"/>
-          <w:szCs w:val="24"/>
-        </w:rPr>
-        <w:t xml:space="preserve">Bootstrap JS </w:t>
-      </w:r>
-      <w:r>
-        <w:rPr>
-          <w:sz w:val="24"/>
-          <w:szCs w:val="24"/>
-        </w:rPr>
-        <w:t>Simple Interactivity</w:t>
+    </w:p>
+    <w:p>
+      <w:pPr>
+        <w:jc w:val="both"/>
+        <w:rPr>
+          <w:sz w:val="24"/>
+          <w:szCs w:val="24"/>
+        </w:rPr>
+      </w:pPr>
+      <w:r>
+        <w:rPr>
+          <w:sz w:val="24"/>
+          <w:szCs w:val="24"/>
+        </w:rPr>
+        <w:t>Bootstrap CSS for Design:</w:t>
       </w:r>
     </w:p>
     <w:p>
@@ -3100,6 +3361,174 @@
             <w:sz w:val="24"/>
             <w:szCs w:val="24"/>
           </w:rPr>
+          <w:t>https://cdn.jsdelivr.net/npm/bootstrap@5.3.8/dist/css/bootstrap.min.css</w:t>
+        </w:r>
+      </w:hyperlink>
+    </w:p>
+    <w:p>
+      <w:pPr>
+        <w:jc w:val="both"/>
+        <w:rPr>
+          <w:sz w:val="24"/>
+          <w:szCs w:val="24"/>
+        </w:rPr>
+      </w:pPr>
+    </w:p>
+    <w:p>
+      <w:pPr>
+        <w:jc w:val="both"/>
+        <w:rPr>
+          <w:sz w:val="24"/>
+          <w:szCs w:val="24"/>
+        </w:rPr>
+      </w:pPr>
+      <w:r>
+        <w:rPr>
+          <w:sz w:val="24"/>
+          <w:szCs w:val="24"/>
+        </w:rPr>
+        <w:t>Bootstrap CSS for Icons:</w:t>
+      </w:r>
+    </w:p>
+    <w:p>
+      <w:pPr>
+        <w:jc w:val="both"/>
+        <w:rPr>
+          <w:sz w:val="24"/>
+          <w:szCs w:val="24"/>
+        </w:rPr>
+      </w:pPr>
+      <w:hyperlink r:id="rId20" w:history="1">
+        <w:r>
+          <w:rPr>
+            <w:rStyle w:val="Hyperlink"/>
+            <w:sz w:val="24"/>
+            <w:szCs w:val="24"/>
+          </w:rPr>
+          <w:t>https://icons.getbootstrap.com</w:t>
+        </w:r>
+      </w:hyperlink>
+    </w:p>
+    <w:p>
+      <w:pPr>
+        <w:jc w:val="both"/>
+        <w:rPr>
+          <w:sz w:val="24"/>
+          <w:szCs w:val="24"/>
+        </w:rPr>
+      </w:pPr>
+      <w:hyperlink r:id="rId21" w:history="1">
+        <w:r>
+          <w:rPr>
+            <w:rStyle w:val="Hyperlink"/>
+            <w:sz w:val="24"/>
+            <w:szCs w:val="24"/>
+          </w:rPr>
+          <w:t>https://cdn.jsdelivr.net/npm/bootstrap-icons@1.11.3/font/bootstrap-icons.min.css</w:t>
+        </w:r>
+      </w:hyperlink>
+    </w:p>
+    <w:p>
+      <w:pPr>
+        <w:jc w:val="both"/>
+        <w:rPr>
+          <w:sz w:val="24"/>
+          <w:szCs w:val="24"/>
+        </w:rPr>
+      </w:pPr>
+      <w:r>
+        <w:rPr>
+          <w:sz w:val="24"/>
+          <w:szCs w:val="24"/>
+        </w:rPr>
+        <w:t>ERD Diagram Tool:</w:t>
+      </w:r>
+    </w:p>
+    <w:p>
+      <w:pPr>
+        <w:jc w:val="both"/>
+        <w:rPr>
+          <w:sz w:val="24"/>
+          <w:szCs w:val="24"/>
+        </w:rPr>
+      </w:pPr>
+      <w:hyperlink r:id="rId22" w:anchor="pako:eNqtU1Fv2jAQ_ivWPVMUisE0b1OXVlVVtaPwsAkJefGRuiV2ajtbGeW_zzYJMIamTZqf4u----7z3WUNuRYIKaD5KHlheDlTxJ_r8f30gby_n53pNZk-ZmOSkhlwa2WhUBCnZ7AlxljDG2efptnjJFJL_oK2JV1-mGTX9-PPLfFmkt1FVr4Mkgu5p8bQCT2DrzVa52tLFbiHNtfbSzhSOSIFebjdQ9YZqQqieIlbcNNmR-9_lVxbNHuBg0Dl_X_XRvwWwJLL5R79qvUSuSLSzm1doQmCp6OOLxYnIzx38tuBA8EdOlli_Jg_a-kHc_TAXd__sUPhOHxzRKDNjayc1OpIOs7pv8m2Cq81V0661a9o7h9YaLOa-wJXt0dG2iX5s5cAhZ4fSuyoDstjvPHup-Fqe6LnzTrOA9AYgg4URgpInamxAyUavwL-CtHZDNwT-kZAWGbBzUtY4pBTcfVF67JNM7ouniBd8KX1t7oKBZo_c4caVALNpa6Vg5T2ogaka3iDtNdjXcrYRcIGfTqkyagDq4Ced3tDNuyPLihLKE3YpgM_YtWkywYJHZ0PhrSf-Jw-2_wE0nA1CQ" w:history="1">
+        <w:r>
+          <w:rPr>
+            <w:rStyle w:val="Hyperlink"/>
+            <w:sz w:val="24"/>
+            <w:szCs w:val="24"/>
+          </w:rPr>
+          <w:t>https://mermaid.live/edit#pako:eNqtU1Fv2jAQ_ivWPVMUisE0b1OXVlVVtaPwsAkJefGRuiV2ajtbGeW_zzYJMIamTZqf4u----7z3WUNuRYIKaD5KHlheDlTxJ_r8f30gby_n53pNZk-ZmOSkhlwa2WhUBCnZ7AlxljDG2efptnjJFJL_oK2JV1-mGTX9-PPLfFmkt1FVr4Mkgu5p8bQCT2DrzVa52tLFbiHNtfbSzhSOSIFebjdQ9YZqQqieIlbcNNmR-9_lVxbNHuBg0Dl_X_XRvwWwJLL5R79qvUSuSLSzm1doQmCp6OOLxYnIzx38tuBA8EdOlli_Jg_a-kHc_TAXd__sUPhOHxzRKDNjayc1OpIOs7pv8m2Cq81V0661a9o7h9YaLOa-wJXt0dG2iX5s5cAhZ4fSuyoDstjvPHup-Fqe6LnzTrOA9AYgg4URgpInamxAyUavwL-CtHZDNwT-kZAWGbBzUtY4pBTcfVF67JNM7ouniBd8KX1t7oKBZo_c4caVALNpa6Vg5T2ogaka3i</w:t>
+        </w:r>
+        <w:r>
+          <w:rPr>
+            <w:rStyle w:val="Hyperlink"/>
+            <w:sz w:val="24"/>
+            <w:szCs w:val="24"/>
+          </w:rPr>
+          <w:lastRenderedPageBreak/>
+          <w:t>DtNdjXcrYRcIGfTqkyagDq4Ced3tDNuyPLihLKE3YpgM_YtWkywYJHZ0PhrSf-Jw-2_wE0nA1CQ</w:t>
+        </w:r>
+      </w:hyperlink>
+    </w:p>
+    <w:p>
+      <w:pPr>
+        <w:jc w:val="both"/>
+        <w:rPr>
+          <w:sz w:val="24"/>
+          <w:szCs w:val="24"/>
+        </w:rPr>
+      </w:pPr>
+      <w:r>
+        <w:rPr>
+          <w:sz w:val="24"/>
+          <w:szCs w:val="24"/>
+        </w:rPr>
+        <w:t xml:space="preserve">Bootstrap JS </w:t>
+      </w:r>
+      <w:r>
+        <w:rPr>
+          <w:sz w:val="24"/>
+          <w:szCs w:val="24"/>
+        </w:rPr>
+        <w:t>Simple Interactivity</w:t>
+      </w:r>
+    </w:p>
+    <w:p>
+      <w:pPr>
+        <w:jc w:val="both"/>
+        <w:rPr>
+          <w:sz w:val="24"/>
+          <w:szCs w:val="24"/>
+        </w:rPr>
+      </w:pPr>
+      <w:hyperlink r:id="rId23" w:history="1">
+        <w:r>
+          <w:rPr>
+            <w:rStyle w:val="Hyperlink"/>
+            <w:sz w:val="24"/>
+            <w:szCs w:val="24"/>
+          </w:rPr>
+          <w:t>https://getbootstrap.com/docs/5.3/getting-started/introduction/</w:t>
+        </w:r>
+      </w:hyperlink>
+    </w:p>
+    <w:p>
+      <w:pPr>
+        <w:jc w:val="both"/>
+        <w:rPr>
+          <w:sz w:val="24"/>
+          <w:szCs w:val="24"/>
+        </w:rPr>
+      </w:pPr>
+      <w:hyperlink r:id="rId24" w:history="1">
+        <w:r>
+          <w:rPr>
+            <w:rStyle w:val="Hyperlink"/>
+            <w:sz w:val="24"/>
+            <w:szCs w:val="24"/>
+          </w:rPr>
           <w:t>https://cdn.jsdelivr.net/npm/bootstrap@5.3.8/dist/js/bootstrap.bundle.min.js</w:t>
         </w:r>
       </w:hyperlink>
@@ -3112,6 +3541,22 @@
           <w:szCs w:val="24"/>
         </w:rPr>
       </w:pPr>
+      <w:r>
+        <w:rPr>
+          <w:sz w:val="24"/>
+          <w:szCs w:val="24"/>
+        </w:rPr>
+        <w:t xml:space="preserve">Django </w:t>
+      </w:r>
+      <w:proofErr w:type="spellStart"/>
+      <w:r>
+        <w:rPr>
+          <w:sz w:val="24"/>
+          <w:szCs w:val="24"/>
+        </w:rPr>
+        <w:t>ModelForm</w:t>
+      </w:r>
+      <w:proofErr w:type="spellEnd"/>
     </w:p>
     <w:p>
       <w:pPr>
@@ -3121,6 +3566,16 @@
           <w:szCs w:val="24"/>
         </w:rPr>
       </w:pPr>
+      <w:hyperlink r:id="rId25" w:history="1">
+        <w:r>
+          <w:rPr>
+            <w:rStyle w:val="Hyperlink"/>
+            <w:sz w:val="24"/>
+            <w:szCs w:val="24"/>
+          </w:rPr>
+          <w:t>https://docs.djangoproject.com/en/6.0/topics/forms/modelforms/</w:t>
+        </w:r>
+      </w:hyperlink>
     </w:p>
     <w:p>
       <w:pPr>
@@ -3130,36 +3585,211 @@
           <w:szCs w:val="24"/>
         </w:rPr>
       </w:pPr>
-    </w:p>
-    <w:p>
-      <w:pPr>
+      <w:r>
+        <w:rPr>
+          <w:sz w:val="24"/>
+          <w:szCs w:val="24"/>
+        </w:rPr>
+        <w:t xml:space="preserve">Django </w:t>
+      </w:r>
+      <w:proofErr w:type="spellStart"/>
+      <w:r>
+        <w:rPr>
+          <w:sz w:val="24"/>
+          <w:szCs w:val="24"/>
+        </w:rPr>
+        <w:t>auto_now_add</w:t>
+      </w:r>
+      <w:proofErr w:type="spellEnd"/>
+    </w:p>
+    <w:p>
+      <w:pPr>
+        <w:tabs>
+          <w:tab w:val="left" w:pos="6645"/>
+        </w:tabs>
         <w:jc w:val="both"/>
         <w:rPr>
           <w:sz w:val="24"/>
           <w:szCs w:val="24"/>
         </w:rPr>
       </w:pPr>
-    </w:p>
-    <w:p>
-      <w:pPr>
+      <w:hyperlink r:id="rId26" w:history="1">
+        <w:r>
+          <w:rPr>
+            <w:rStyle w:val="Hyperlink"/>
+            <w:sz w:val="24"/>
+            <w:szCs w:val="24"/>
+          </w:rPr>
+          <w:t>https://docs.djangoproject.com/en/6.0/ref/models/fields/</w:t>
+        </w:r>
+      </w:hyperlink>
+      <w:r>
+        <w:rPr>
+          <w:sz w:val="24"/>
+          <w:szCs w:val="24"/>
+        </w:rPr>
+        <w:tab/>
+      </w:r>
+    </w:p>
+    <w:p>
+      <w:pPr>
+        <w:tabs>
+          <w:tab w:val="left" w:pos="6645"/>
+        </w:tabs>
         <w:jc w:val="both"/>
         <w:rPr>
           <w:sz w:val="24"/>
           <w:szCs w:val="24"/>
         </w:rPr>
       </w:pPr>
-    </w:p>
-    <w:p>
-      <w:pPr>
+      <w:r>
+        <w:rPr>
+          <w:sz w:val="24"/>
+          <w:szCs w:val="24"/>
+        </w:rPr>
+        <w:t>Django get_object_or_404()</w:t>
+      </w:r>
+    </w:p>
+    <w:p>
+      <w:pPr>
+        <w:tabs>
+          <w:tab w:val="left" w:pos="6645"/>
+        </w:tabs>
         <w:jc w:val="both"/>
         <w:rPr>
           <w:sz w:val="24"/>
           <w:szCs w:val="24"/>
         </w:rPr>
       </w:pPr>
+      <w:hyperlink r:id="rId27" w:history="1">
+        <w:r>
+          <w:rPr>
+            <w:rStyle w:val="Hyperlink"/>
+            <w:sz w:val="24"/>
+            <w:szCs w:val="24"/>
+          </w:rPr>
+          <w:t>https://docs.djangoproject.com/en/6.0/topics/http/shortcuts/</w:t>
+        </w:r>
+      </w:hyperlink>
+    </w:p>
+    <w:p>
+      <w:pPr>
+        <w:tabs>
+          <w:tab w:val="left" w:pos="6645"/>
+        </w:tabs>
+        <w:jc w:val="both"/>
+        <w:rPr>
+          <w:sz w:val="24"/>
+          <w:szCs w:val="24"/>
+        </w:rPr>
+      </w:pPr>
+      <w:r>
+        <w:rPr>
+          <w:sz w:val="24"/>
+          <w:szCs w:val="24"/>
+        </w:rPr>
+        <w:t>Django messages Framework</w:t>
+      </w:r>
+    </w:p>
+    <w:p>
+      <w:pPr>
+        <w:tabs>
+          <w:tab w:val="left" w:pos="6645"/>
+        </w:tabs>
+        <w:jc w:val="both"/>
+        <w:rPr>
+          <w:sz w:val="24"/>
+          <w:szCs w:val="24"/>
+        </w:rPr>
+      </w:pPr>
+      <w:hyperlink r:id="rId28" w:history="1">
+        <w:r>
+          <w:rPr>
+            <w:rStyle w:val="Hyperlink"/>
+            <w:sz w:val="24"/>
+            <w:szCs w:val="24"/>
+          </w:rPr>
+          <w:t>https://docs.djangoproject.com/en/6.0/ref/contrib/messages/</w:t>
+        </w:r>
+      </w:hyperlink>
+    </w:p>
+    <w:p>
+      <w:pPr>
+        <w:tabs>
+          <w:tab w:val="left" w:pos="6645"/>
+        </w:tabs>
+        <w:jc w:val="both"/>
+        <w:rPr>
+          <w:sz w:val="24"/>
+          <w:szCs w:val="24"/>
+        </w:rPr>
+      </w:pPr>
+    </w:p>
+    <w:p>
+      <w:pPr>
+        <w:jc w:val="both"/>
+        <w:rPr>
+          <w:sz w:val="24"/>
+          <w:szCs w:val="24"/>
+        </w:rPr>
+      </w:pPr>
+    </w:p>
+    <w:p>
+      <w:pPr>
+        <w:jc w:val="both"/>
+        <w:rPr>
+          <w:sz w:val="24"/>
+          <w:szCs w:val="24"/>
+        </w:rPr>
+      </w:pPr>
+    </w:p>
+    <w:p>
+      <w:pPr>
+        <w:jc w:val="both"/>
+        <w:rPr>
+          <w:sz w:val="24"/>
+          <w:szCs w:val="24"/>
+        </w:rPr>
+      </w:pPr>
+    </w:p>
+    <w:p>
+      <w:pPr>
+        <w:jc w:val="both"/>
+        <w:rPr>
+          <w:sz w:val="24"/>
+          <w:szCs w:val="24"/>
+        </w:rPr>
+      </w:pPr>
+    </w:p>
+    <w:p>
+      <w:pPr>
+        <w:jc w:val="both"/>
+        <w:rPr>
+          <w:sz w:val="24"/>
+          <w:szCs w:val="24"/>
+        </w:rPr>
+      </w:pPr>
+    </w:p>
+    <w:p>
+      <w:pPr>
+        <w:jc w:val="both"/>
+        <w:rPr>
+          <w:sz w:val="24"/>
+          <w:szCs w:val="24"/>
+        </w:rPr>
+      </w:pPr>
+    </w:p>
+    <w:p>
+      <w:pPr>
+        <w:jc w:val="both"/>
+        <w:rPr>
+          <w:sz w:val="24"/>
+          <w:szCs w:val="24"/>
+        </w:rPr>
+      </w:pPr>
     </w:p>
     <w:sectPr>
-      <w:headerReference w:type="default" r:id="rId20"/>
+      <w:headerReference w:type="default" r:id="rId29"/>
       <w:pgSz w:w="12240" w:h="15840"/>
       <w:pgMar w:top="1440" w:right="1800" w:bottom="1440" w:left="1800" w:header="720" w:footer="720" w:gutter="0"/>
       <w:cols w:space="720"/>
@@ -3981,6 +4611,119 @@
     </w:lvl>
   </w:abstractNum>
   <w:abstractNum w:abstractNumId="14" w15:restartNumberingAfterBreak="0">
+    <w:nsid w:val="758128FC"/>
+    <w:multiLevelType w:val="hybridMultilevel"/>
+    <w:tmpl w:val="13261052"/>
+    <w:lvl w:ilvl="0" w:tplc="18090001">
+      <w:start w:val="1"/>
+      <w:numFmt w:val="bullet"/>
+      <w:lvlText w:val=""/>
+      <w:lvlJc w:val="left"/>
+      <w:pPr>
+        <w:ind w:left="720" w:hanging="360"/>
+      </w:pPr>
+      <w:rPr>
+        <w:rFonts w:ascii="Symbol" w:hAnsi="Symbol" w:hint="default"/>
+      </w:rPr>
+    </w:lvl>
+    <w:lvl w:ilvl="1" w:tplc="18090003" w:tentative="1">
+      <w:start w:val="1"/>
+      <w:numFmt w:val="bullet"/>
+      <w:lvlText w:val="o"/>
+      <w:lvlJc w:val="left"/>
+      <w:pPr>
+        <w:ind w:left="1440" w:hanging="360"/>
+      </w:pPr>
+      <w:rPr>
+        <w:rFonts w:ascii="Courier New" w:hAnsi="Courier New" w:cs="Courier New" w:hint="default"/>
+      </w:rPr>
+    </w:lvl>
+    <w:lvl w:ilvl="2" w:tplc="18090005" w:tentative="1">
+      <w:start w:val="1"/>
+      <w:numFmt w:val="bullet"/>
+      <w:lvlText w:val=""/>
+      <w:lvlJc w:val="left"/>
+      <w:pPr>
+        <w:ind w:left="2160" w:hanging="360"/>
+      </w:pPr>
+      <w:rPr>
+        <w:rFonts w:ascii="Wingdings" w:hAnsi="Wingdings" w:hint="default"/>
+      </w:rPr>
+    </w:lvl>
+    <w:lvl w:ilvl="3" w:tplc="18090001" w:tentative="1">
+      <w:start w:val="1"/>
+      <w:numFmt w:val="bullet"/>
+      <w:lvlText w:val=""/>
+      <w:lvlJc w:val="left"/>
+      <w:pPr>
+        <w:ind w:left="2880" w:hanging="360"/>
+      </w:pPr>
+      <w:rPr>
+        <w:rFonts w:ascii="Symbol" w:hAnsi="Symbol" w:hint="default"/>
+      </w:rPr>
+    </w:lvl>
+    <w:lvl w:ilvl="4" w:tplc="18090003" w:tentative="1">
+      <w:start w:val="1"/>
+      <w:numFmt w:val="bullet"/>
+      <w:lvlText w:val="o"/>
+      <w:lvlJc w:val="left"/>
+      <w:pPr>
+        <w:ind w:left="3600" w:hanging="360"/>
+      </w:pPr>
+      <w:rPr>
+        <w:rFonts w:ascii="Courier New" w:hAnsi="Courier New" w:cs="Courier New" w:hint="default"/>
+      </w:rPr>
+    </w:lvl>
+    <w:lvl w:ilvl="5" w:tplc="18090005" w:tentative="1">
+      <w:start w:val="1"/>
+      <w:numFmt w:val="bullet"/>
+      <w:lvlText w:val=""/>
+      <w:lvlJc w:val="left"/>
+      <w:pPr>
+        <w:ind w:left="4320" w:hanging="360"/>
+      </w:pPr>
+      <w:rPr>
+        <w:rFonts w:ascii="Wingdings" w:hAnsi="Wingdings" w:hint="default"/>
+      </w:rPr>
+    </w:lvl>
+    <w:lvl w:ilvl="6" w:tplc="18090001" w:tentative="1">
+      <w:start w:val="1"/>
+      <w:numFmt w:val="bullet"/>
+      <w:lvlText w:val=""/>
+      <w:lvlJc w:val="left"/>
+      <w:pPr>
+        <w:ind w:left="5040" w:hanging="360"/>
+      </w:pPr>
+      <w:rPr>
+        <w:rFonts w:ascii="Symbol" w:hAnsi="Symbol" w:hint="default"/>
+      </w:rPr>
+    </w:lvl>
+    <w:lvl w:ilvl="7" w:tplc="18090003" w:tentative="1">
+      <w:start w:val="1"/>
+      <w:numFmt w:val="bullet"/>
+      <w:lvlText w:val="o"/>
+      <w:lvlJc w:val="left"/>
+      <w:pPr>
+        <w:ind w:left="5760" w:hanging="360"/>
+      </w:pPr>
+      <w:rPr>
+        <w:rFonts w:ascii="Courier New" w:hAnsi="Courier New" w:cs="Courier New" w:hint="default"/>
+      </w:rPr>
+    </w:lvl>
+    <w:lvl w:ilvl="8" w:tplc="18090005" w:tentative="1">
+      <w:start w:val="1"/>
+      <w:numFmt w:val="bullet"/>
+      <w:lvlText w:val=""/>
+      <w:lvlJc w:val="left"/>
+      <w:pPr>
+        <w:ind w:left="6480" w:hanging="360"/>
+      </w:pPr>
+      <w:rPr>
+        <w:rFonts w:ascii="Wingdings" w:hAnsi="Wingdings" w:hint="default"/>
+      </w:rPr>
+    </w:lvl>
+  </w:abstractNum>
+  <w:abstractNum w:abstractNumId="15" w15:restartNumberingAfterBreak="0">
     <w:nsid w:val="77A95487"/>
     <w:multiLevelType w:val="hybridMultilevel"/>
     <w:tmpl w:val="DC7C2012"/>
@@ -4123,7 +4866,7 @@
     <w:abstractNumId w:val="9"/>
   </w:num>
   <w:num w:numId="11" w16cid:durableId="816722100">
-    <w:abstractNumId w:val="14"/>
+    <w:abstractNumId w:val="15"/>
   </w:num>
   <w:num w:numId="12" w16cid:durableId="1432701337">
     <w:abstractNumId w:val="11"/>
@@ -4136,6 +4879,9 @@
   </w:num>
   <w:num w:numId="15" w16cid:durableId="1332637130">
     <w:abstractNumId w:val="13"/>
+  </w:num>
+  <w:num w:numId="16" w16cid:durableId="594943727">
+    <w:abstractNumId w:val="14"/>
   </w:num>
 </w:numbering>
 </file>

</xml_diff>

<commit_message>
implementing continuous integration framework
</commit_message>
<xml_diff>
--- a/ReportTemplateSample.docx
+++ b/ReportTemplateSample.docx
@@ -7,17 +7,21 @@
         <w:pStyle w:val="Heading1"/>
         <w:jc w:val="center"/>
       </w:pPr>
+      <w:bookmarkStart w:id="0" w:name="_Toc228020653"/>
       <w:r>
         <w:t>School of Informatics &amp; Cybersecurity - Assessment Submission Coversheet</w:t>
       </w:r>
+      <w:bookmarkEnd w:id="0"/>
     </w:p>
     <w:p>
       <w:pPr>
         <w:pStyle w:val="Heading2"/>
       </w:pPr>
+      <w:bookmarkStart w:id="1" w:name="_Toc228020654"/>
       <w:r>
         <w:t>Student Information</w:t>
       </w:r>
+      <w:bookmarkEnd w:id="1"/>
     </w:p>
     <w:tbl>
       <w:tblPr>
@@ -71,8 +75,13 @@
           </w:tcPr>
           <w:p>
             <w:r>
-              <w:t>Matas Zostautas</w:t>
+              <w:t xml:space="preserve">Matas </w:t>
             </w:r>
+            <w:proofErr w:type="spellStart"/>
+            <w:r>
+              <w:t>Zostautas</w:t>
+            </w:r>
+            <w:proofErr w:type="spellEnd"/>
           </w:p>
         </w:tc>
       </w:tr>
@@ -82,9 +91,11 @@
       <w:pPr>
         <w:pStyle w:val="Heading2"/>
       </w:pPr>
+      <w:bookmarkStart w:id="2" w:name="_Toc228020655"/>
       <w:r>
         <w:t>Module Information</w:t>
       </w:r>
+      <w:bookmarkEnd w:id="2"/>
     </w:p>
     <w:tbl>
       <w:tblPr>
@@ -149,9 +160,11 @@
       <w:pPr>
         <w:pStyle w:val="Heading2"/>
       </w:pPr>
+      <w:bookmarkStart w:id="3" w:name="_Toc228020656"/>
       <w:r>
         <w:t>Assessment Information</w:t>
       </w:r>
+      <w:bookmarkEnd w:id="3"/>
     </w:p>
     <w:tbl>
       <w:tblPr>
@@ -191,9 +204,11 @@
       <w:pPr>
         <w:pStyle w:val="Heading2"/>
       </w:pPr>
+      <w:bookmarkStart w:id="4" w:name="_Toc228020657"/>
       <w:r>
         <w:t>Declaration</w:t>
       </w:r>
+      <w:bookmarkEnd w:id="4"/>
     </w:p>
     <w:p>
       <w:r>
@@ -241,8 +256,13 @@
         <w:t xml:space="preserve">Student Signature: </w:t>
       </w:r>
       <w:r>
-        <w:t>Matas Zostautas</w:t>
-      </w:r>
+        <w:t xml:space="preserve">Matas </w:t>
+      </w:r>
+      <w:proofErr w:type="spellStart"/>
+      <w:r>
+        <w:t>Zostautas</w:t>
+      </w:r>
+      <w:proofErr w:type="spellEnd"/>
     </w:p>
     <w:p>
       <w:r>
@@ -473,6 +493,965 @@
     </w:p>
     <w:p>
       <w:pPr>
+        <w:jc w:val="center"/>
+        <w:rPr>
+          <w:rFonts w:ascii="Arial" w:hAnsi="Arial" w:cs="Arial"/>
+          <w:b/>
+          <w:bCs/>
+          <w:sz w:val="36"/>
+          <w:szCs w:val="36"/>
+        </w:rPr>
+      </w:pPr>
+    </w:p>
+    <w:sdt>
+      <w:sdtPr>
+        <w:id w:val="1402954278"/>
+        <w:docPartObj>
+          <w:docPartGallery w:val="Table of Contents"/>
+          <w:docPartUnique/>
+        </w:docPartObj>
+      </w:sdtPr>
+      <w:sdtEndPr>
+        <w:rPr>
+          <w:rFonts w:asciiTheme="minorHAnsi" w:eastAsiaTheme="minorEastAsia" w:hAnsiTheme="minorHAnsi" w:cstheme="minorBidi"/>
+          <w:noProof/>
+          <w:color w:val="auto"/>
+          <w:sz w:val="22"/>
+          <w:szCs w:val="22"/>
+        </w:rPr>
+      </w:sdtEndPr>
+      <w:sdtContent>
+        <w:p>
+          <w:pPr>
+            <w:pStyle w:val="TOCHeading"/>
+          </w:pPr>
+          <w:r>
+            <w:t>Table of Contents</w:t>
+          </w:r>
+        </w:p>
+        <w:p>
+          <w:pPr>
+            <w:pStyle w:val="TOC1"/>
+            <w:tabs>
+              <w:tab w:val="right" w:leader="dot" w:pos="8630"/>
+            </w:tabs>
+            <w:rPr>
+              <w:noProof/>
+            </w:rPr>
+          </w:pPr>
+          <w:r>
+            <w:fldChar w:fldCharType="begin"/>
+          </w:r>
+          <w:r>
+            <w:instrText xml:space="preserve"> TOC \o "1-3" \h \z \u </w:instrText>
+          </w:r>
+          <w:r>
+            <w:fldChar w:fldCharType="separate"/>
+          </w:r>
+          <w:hyperlink w:anchor="_Toc228020653" w:history="1">
+            <w:r>
+              <w:rPr>
+                <w:rStyle w:val="Hyperlink"/>
+                <w:noProof/>
+              </w:rPr>
+              <w:t>School of Informatics &amp; Cybersecurity - Assessment Submission Coversheet</w:t>
+            </w:r>
+            <w:r>
+              <w:rPr>
+                <w:noProof/>
+                <w:webHidden/>
+              </w:rPr>
+              <w:tab/>
+            </w:r>
+            <w:r>
+              <w:rPr>
+                <w:noProof/>
+                <w:webHidden/>
+              </w:rPr>
+              <w:fldChar w:fldCharType="begin"/>
+            </w:r>
+            <w:r>
+              <w:rPr>
+                <w:noProof/>
+                <w:webHidden/>
+              </w:rPr>
+              <w:instrText xml:space="preserve"> PAGEREF _Toc228020653 \h </w:instrText>
+            </w:r>
+            <w:r>
+              <w:rPr>
+                <w:noProof/>
+                <w:webHidden/>
+              </w:rPr>
+            </w:r>
+            <w:r>
+              <w:rPr>
+                <w:noProof/>
+                <w:webHidden/>
+              </w:rPr>
+              <w:fldChar w:fldCharType="separate"/>
+            </w:r>
+            <w:r>
+              <w:rPr>
+                <w:noProof/>
+                <w:webHidden/>
+              </w:rPr>
+              <w:t>1</w:t>
+            </w:r>
+            <w:r>
+              <w:rPr>
+                <w:noProof/>
+                <w:webHidden/>
+              </w:rPr>
+              <w:fldChar w:fldCharType="end"/>
+            </w:r>
+          </w:hyperlink>
+        </w:p>
+        <w:p>
+          <w:pPr>
+            <w:pStyle w:val="TOC2"/>
+            <w:tabs>
+              <w:tab w:val="right" w:leader="dot" w:pos="8630"/>
+            </w:tabs>
+            <w:rPr>
+              <w:noProof/>
+            </w:rPr>
+          </w:pPr>
+          <w:hyperlink w:anchor="_Toc228020654" w:history="1">
+            <w:r>
+              <w:rPr>
+                <w:rStyle w:val="Hyperlink"/>
+                <w:noProof/>
+              </w:rPr>
+              <w:t>Student Information</w:t>
+            </w:r>
+            <w:r>
+              <w:rPr>
+                <w:noProof/>
+                <w:webHidden/>
+              </w:rPr>
+              <w:tab/>
+            </w:r>
+            <w:r>
+              <w:rPr>
+                <w:noProof/>
+                <w:webHidden/>
+              </w:rPr>
+              <w:fldChar w:fldCharType="begin"/>
+            </w:r>
+            <w:r>
+              <w:rPr>
+                <w:noProof/>
+                <w:webHidden/>
+              </w:rPr>
+              <w:instrText xml:space="preserve"> PAGEREF _Toc228020654 \h </w:instrText>
+            </w:r>
+            <w:r>
+              <w:rPr>
+                <w:noProof/>
+                <w:webHidden/>
+              </w:rPr>
+            </w:r>
+            <w:r>
+              <w:rPr>
+                <w:noProof/>
+                <w:webHidden/>
+              </w:rPr>
+              <w:fldChar w:fldCharType="separate"/>
+            </w:r>
+            <w:r>
+              <w:rPr>
+                <w:noProof/>
+                <w:webHidden/>
+              </w:rPr>
+              <w:t>1</w:t>
+            </w:r>
+            <w:r>
+              <w:rPr>
+                <w:noProof/>
+                <w:webHidden/>
+              </w:rPr>
+              <w:fldChar w:fldCharType="end"/>
+            </w:r>
+          </w:hyperlink>
+        </w:p>
+        <w:p>
+          <w:pPr>
+            <w:pStyle w:val="TOC2"/>
+            <w:tabs>
+              <w:tab w:val="right" w:leader="dot" w:pos="8630"/>
+            </w:tabs>
+            <w:rPr>
+              <w:noProof/>
+            </w:rPr>
+          </w:pPr>
+          <w:hyperlink w:anchor="_Toc228020655" w:history="1">
+            <w:r>
+              <w:rPr>
+                <w:rStyle w:val="Hyperlink"/>
+                <w:noProof/>
+              </w:rPr>
+              <w:t>Module Information</w:t>
+            </w:r>
+            <w:r>
+              <w:rPr>
+                <w:noProof/>
+                <w:webHidden/>
+              </w:rPr>
+              <w:tab/>
+            </w:r>
+            <w:r>
+              <w:rPr>
+                <w:noProof/>
+                <w:webHidden/>
+              </w:rPr>
+              <w:fldChar w:fldCharType="begin"/>
+            </w:r>
+            <w:r>
+              <w:rPr>
+                <w:noProof/>
+                <w:webHidden/>
+              </w:rPr>
+              <w:instrText xml:space="preserve"> PAGEREF _Toc228020655 \h </w:instrText>
+            </w:r>
+            <w:r>
+              <w:rPr>
+                <w:noProof/>
+                <w:webHidden/>
+              </w:rPr>
+            </w:r>
+            <w:r>
+              <w:rPr>
+                <w:noProof/>
+                <w:webHidden/>
+              </w:rPr>
+              <w:fldChar w:fldCharType="separate"/>
+            </w:r>
+            <w:r>
+              <w:rPr>
+                <w:noProof/>
+                <w:webHidden/>
+              </w:rPr>
+              <w:t>1</w:t>
+            </w:r>
+            <w:r>
+              <w:rPr>
+                <w:noProof/>
+                <w:webHidden/>
+              </w:rPr>
+              <w:fldChar w:fldCharType="end"/>
+            </w:r>
+          </w:hyperlink>
+        </w:p>
+        <w:p>
+          <w:pPr>
+            <w:pStyle w:val="TOC2"/>
+            <w:tabs>
+              <w:tab w:val="right" w:leader="dot" w:pos="8630"/>
+            </w:tabs>
+            <w:rPr>
+              <w:noProof/>
+            </w:rPr>
+          </w:pPr>
+          <w:hyperlink w:anchor="_Toc228020656" w:history="1">
+            <w:r>
+              <w:rPr>
+                <w:rStyle w:val="Hyperlink"/>
+                <w:noProof/>
+              </w:rPr>
+              <w:t>Assessment Information</w:t>
+            </w:r>
+            <w:r>
+              <w:rPr>
+                <w:noProof/>
+                <w:webHidden/>
+              </w:rPr>
+              <w:tab/>
+            </w:r>
+            <w:r>
+              <w:rPr>
+                <w:noProof/>
+                <w:webHidden/>
+              </w:rPr>
+              <w:fldChar w:fldCharType="begin"/>
+            </w:r>
+            <w:r>
+              <w:rPr>
+                <w:noProof/>
+                <w:webHidden/>
+              </w:rPr>
+              <w:instrText xml:space="preserve"> PAGEREF _Toc228020656 \h </w:instrText>
+            </w:r>
+            <w:r>
+              <w:rPr>
+                <w:noProof/>
+                <w:webHidden/>
+              </w:rPr>
+            </w:r>
+            <w:r>
+              <w:rPr>
+                <w:noProof/>
+                <w:webHidden/>
+              </w:rPr>
+              <w:fldChar w:fldCharType="separate"/>
+            </w:r>
+            <w:r>
+              <w:rPr>
+                <w:noProof/>
+                <w:webHidden/>
+              </w:rPr>
+              <w:t>1</w:t>
+            </w:r>
+            <w:r>
+              <w:rPr>
+                <w:noProof/>
+                <w:webHidden/>
+              </w:rPr>
+              <w:fldChar w:fldCharType="end"/>
+            </w:r>
+          </w:hyperlink>
+        </w:p>
+        <w:p>
+          <w:pPr>
+            <w:pStyle w:val="TOC2"/>
+            <w:tabs>
+              <w:tab w:val="right" w:leader="dot" w:pos="8630"/>
+            </w:tabs>
+            <w:rPr>
+              <w:noProof/>
+            </w:rPr>
+          </w:pPr>
+          <w:hyperlink w:anchor="_Toc228020657" w:history="1">
+            <w:r>
+              <w:rPr>
+                <w:rStyle w:val="Hyperlink"/>
+                <w:noProof/>
+              </w:rPr>
+              <w:t>Declaration</w:t>
+            </w:r>
+            <w:r>
+              <w:rPr>
+                <w:noProof/>
+                <w:webHidden/>
+              </w:rPr>
+              <w:tab/>
+            </w:r>
+            <w:r>
+              <w:rPr>
+                <w:noProof/>
+                <w:webHidden/>
+              </w:rPr>
+              <w:fldChar w:fldCharType="begin"/>
+            </w:r>
+            <w:r>
+              <w:rPr>
+                <w:noProof/>
+                <w:webHidden/>
+              </w:rPr>
+              <w:instrText xml:space="preserve"> PAGEREF _Toc228020657 \h </w:instrText>
+            </w:r>
+            <w:r>
+              <w:rPr>
+                <w:noProof/>
+                <w:webHidden/>
+              </w:rPr>
+            </w:r>
+            <w:r>
+              <w:rPr>
+                <w:noProof/>
+                <w:webHidden/>
+              </w:rPr>
+              <w:fldChar w:fldCharType="separate"/>
+            </w:r>
+            <w:r>
+              <w:rPr>
+                <w:noProof/>
+                <w:webHidden/>
+              </w:rPr>
+              <w:t>1</w:t>
+            </w:r>
+            <w:r>
+              <w:rPr>
+                <w:noProof/>
+                <w:webHidden/>
+              </w:rPr>
+              <w:fldChar w:fldCharType="end"/>
+            </w:r>
+          </w:hyperlink>
+        </w:p>
+        <w:p>
+          <w:pPr>
+            <w:pStyle w:val="TOC1"/>
+            <w:tabs>
+              <w:tab w:val="left" w:pos="480"/>
+              <w:tab w:val="right" w:leader="dot" w:pos="8630"/>
+            </w:tabs>
+            <w:rPr>
+              <w:noProof/>
+            </w:rPr>
+          </w:pPr>
+          <w:hyperlink w:anchor="_Toc228020658" w:history="1">
+            <w:r>
+              <w:rPr>
+                <w:rStyle w:val="Hyperlink"/>
+                <w:noProof/>
+              </w:rPr>
+              <w:t>1.</w:t>
+            </w:r>
+            <w:r>
+              <w:rPr>
+                <w:noProof/>
+              </w:rPr>
+              <w:tab/>
+            </w:r>
+            <w:r>
+              <w:rPr>
+                <w:rStyle w:val="Hyperlink"/>
+                <w:noProof/>
+              </w:rPr>
+              <w:t>Business Understanding</w:t>
+            </w:r>
+            <w:r>
+              <w:rPr>
+                <w:noProof/>
+                <w:webHidden/>
+              </w:rPr>
+              <w:tab/>
+            </w:r>
+            <w:r>
+              <w:rPr>
+                <w:noProof/>
+                <w:webHidden/>
+              </w:rPr>
+              <w:fldChar w:fldCharType="begin"/>
+            </w:r>
+            <w:r>
+              <w:rPr>
+                <w:noProof/>
+                <w:webHidden/>
+              </w:rPr>
+              <w:instrText xml:space="preserve"> PAGEREF _Toc228020658 \h </w:instrText>
+            </w:r>
+            <w:r>
+              <w:rPr>
+                <w:noProof/>
+                <w:webHidden/>
+              </w:rPr>
+            </w:r>
+            <w:r>
+              <w:rPr>
+                <w:noProof/>
+                <w:webHidden/>
+              </w:rPr>
+              <w:fldChar w:fldCharType="separate"/>
+            </w:r>
+            <w:r>
+              <w:rPr>
+                <w:noProof/>
+                <w:webHidden/>
+              </w:rPr>
+              <w:t>3</w:t>
+            </w:r>
+            <w:r>
+              <w:rPr>
+                <w:noProof/>
+                <w:webHidden/>
+              </w:rPr>
+              <w:fldChar w:fldCharType="end"/>
+            </w:r>
+          </w:hyperlink>
+        </w:p>
+        <w:p>
+          <w:pPr>
+            <w:pStyle w:val="TOC2"/>
+            <w:tabs>
+              <w:tab w:val="right" w:leader="dot" w:pos="8630"/>
+            </w:tabs>
+            <w:rPr>
+              <w:noProof/>
+            </w:rPr>
+          </w:pPr>
+          <w:hyperlink w:anchor="_Toc228020659" w:history="1">
+            <w:r>
+              <w:rPr>
+                <w:rStyle w:val="Hyperlink"/>
+                <w:noProof/>
+              </w:rPr>
+              <w:t>Business Requirements</w:t>
+            </w:r>
+            <w:r>
+              <w:rPr>
+                <w:noProof/>
+                <w:webHidden/>
+              </w:rPr>
+              <w:tab/>
+            </w:r>
+            <w:r>
+              <w:rPr>
+                <w:noProof/>
+                <w:webHidden/>
+              </w:rPr>
+              <w:fldChar w:fldCharType="begin"/>
+            </w:r>
+            <w:r>
+              <w:rPr>
+                <w:noProof/>
+                <w:webHidden/>
+              </w:rPr>
+              <w:instrText xml:space="preserve"> PAGEREF _Toc228020659 \h </w:instrText>
+            </w:r>
+            <w:r>
+              <w:rPr>
+                <w:noProof/>
+                <w:webHidden/>
+              </w:rPr>
+            </w:r>
+            <w:r>
+              <w:rPr>
+                <w:noProof/>
+                <w:webHidden/>
+              </w:rPr>
+              <w:fldChar w:fldCharType="separate"/>
+            </w:r>
+            <w:r>
+              <w:rPr>
+                <w:noProof/>
+                <w:webHidden/>
+              </w:rPr>
+              <w:t>3</w:t>
+            </w:r>
+            <w:r>
+              <w:rPr>
+                <w:noProof/>
+                <w:webHidden/>
+              </w:rPr>
+              <w:fldChar w:fldCharType="end"/>
+            </w:r>
+          </w:hyperlink>
+        </w:p>
+        <w:p>
+          <w:pPr>
+            <w:pStyle w:val="TOC1"/>
+            <w:tabs>
+              <w:tab w:val="left" w:pos="480"/>
+              <w:tab w:val="right" w:leader="dot" w:pos="8630"/>
+            </w:tabs>
+            <w:rPr>
+              <w:noProof/>
+            </w:rPr>
+          </w:pPr>
+          <w:hyperlink w:anchor="_Toc228020660" w:history="1">
+            <w:r>
+              <w:rPr>
+                <w:rStyle w:val="Hyperlink"/>
+                <w:noProof/>
+              </w:rPr>
+              <w:t>2.</w:t>
+            </w:r>
+            <w:r>
+              <w:rPr>
+                <w:noProof/>
+              </w:rPr>
+              <w:tab/>
+            </w:r>
+            <w:r>
+              <w:rPr>
+                <w:rStyle w:val="Hyperlink"/>
+                <w:noProof/>
+              </w:rPr>
+              <w:t>Use Cases</w:t>
+            </w:r>
+            <w:r>
+              <w:rPr>
+                <w:noProof/>
+                <w:webHidden/>
+              </w:rPr>
+              <w:tab/>
+            </w:r>
+            <w:r>
+              <w:rPr>
+                <w:noProof/>
+                <w:webHidden/>
+              </w:rPr>
+              <w:fldChar w:fldCharType="begin"/>
+            </w:r>
+            <w:r>
+              <w:rPr>
+                <w:noProof/>
+                <w:webHidden/>
+              </w:rPr>
+              <w:instrText xml:space="preserve"> PAGEREF _Toc228020660 \h </w:instrText>
+            </w:r>
+            <w:r>
+              <w:rPr>
+                <w:noProof/>
+                <w:webHidden/>
+              </w:rPr>
+            </w:r>
+            <w:r>
+              <w:rPr>
+                <w:noProof/>
+                <w:webHidden/>
+              </w:rPr>
+              <w:fldChar w:fldCharType="separate"/>
+            </w:r>
+            <w:r>
+              <w:rPr>
+                <w:noProof/>
+                <w:webHidden/>
+              </w:rPr>
+              <w:t>4</w:t>
+            </w:r>
+            <w:r>
+              <w:rPr>
+                <w:noProof/>
+                <w:webHidden/>
+              </w:rPr>
+              <w:fldChar w:fldCharType="end"/>
+            </w:r>
+          </w:hyperlink>
+        </w:p>
+        <w:p>
+          <w:pPr>
+            <w:pStyle w:val="TOC1"/>
+            <w:tabs>
+              <w:tab w:val="left" w:pos="480"/>
+              <w:tab w:val="right" w:leader="dot" w:pos="8630"/>
+            </w:tabs>
+            <w:rPr>
+              <w:noProof/>
+            </w:rPr>
+          </w:pPr>
+          <w:hyperlink w:anchor="_Toc228020661" w:history="1">
+            <w:r>
+              <w:rPr>
+                <w:rStyle w:val="Hyperlink"/>
+                <w:noProof/>
+              </w:rPr>
+              <w:t>3.</w:t>
+            </w:r>
+            <w:r>
+              <w:rPr>
+                <w:noProof/>
+              </w:rPr>
+              <w:tab/>
+            </w:r>
+            <w:r>
+              <w:rPr>
+                <w:rStyle w:val="Hyperlink"/>
+                <w:noProof/>
+              </w:rPr>
+              <w:t>Database Design</w:t>
+            </w:r>
+            <w:r>
+              <w:rPr>
+                <w:noProof/>
+                <w:webHidden/>
+              </w:rPr>
+              <w:tab/>
+            </w:r>
+            <w:r>
+              <w:rPr>
+                <w:noProof/>
+                <w:webHidden/>
+              </w:rPr>
+              <w:fldChar w:fldCharType="begin"/>
+            </w:r>
+            <w:r>
+              <w:rPr>
+                <w:noProof/>
+                <w:webHidden/>
+              </w:rPr>
+              <w:instrText xml:space="preserve"> PAGEREF _Toc228020661 \h </w:instrText>
+            </w:r>
+            <w:r>
+              <w:rPr>
+                <w:noProof/>
+                <w:webHidden/>
+              </w:rPr>
+            </w:r>
+            <w:r>
+              <w:rPr>
+                <w:noProof/>
+                <w:webHidden/>
+              </w:rPr>
+              <w:fldChar w:fldCharType="separate"/>
+            </w:r>
+            <w:r>
+              <w:rPr>
+                <w:noProof/>
+                <w:webHidden/>
+              </w:rPr>
+              <w:t>7</w:t>
+            </w:r>
+            <w:r>
+              <w:rPr>
+                <w:noProof/>
+                <w:webHidden/>
+              </w:rPr>
+              <w:fldChar w:fldCharType="end"/>
+            </w:r>
+          </w:hyperlink>
+        </w:p>
+        <w:p>
+          <w:pPr>
+            <w:pStyle w:val="TOC1"/>
+            <w:tabs>
+              <w:tab w:val="left" w:pos="480"/>
+              <w:tab w:val="right" w:leader="dot" w:pos="8630"/>
+            </w:tabs>
+            <w:rPr>
+              <w:noProof/>
+            </w:rPr>
+          </w:pPr>
+          <w:hyperlink w:anchor="_Toc228020662" w:history="1">
+            <w:r>
+              <w:rPr>
+                <w:rStyle w:val="Hyperlink"/>
+                <w:noProof/>
+              </w:rPr>
+              <w:t>4.</w:t>
+            </w:r>
+            <w:r>
+              <w:rPr>
+                <w:noProof/>
+              </w:rPr>
+              <w:tab/>
+            </w:r>
+            <w:r>
+              <w:rPr>
+                <w:rStyle w:val="Hyperlink"/>
+                <w:noProof/>
+              </w:rPr>
+              <w:t>Django Framework Implementation</w:t>
+            </w:r>
+            <w:r>
+              <w:rPr>
+                <w:noProof/>
+                <w:webHidden/>
+              </w:rPr>
+              <w:tab/>
+            </w:r>
+            <w:r>
+              <w:rPr>
+                <w:noProof/>
+                <w:webHidden/>
+              </w:rPr>
+              <w:fldChar w:fldCharType="begin"/>
+            </w:r>
+            <w:r>
+              <w:rPr>
+                <w:noProof/>
+                <w:webHidden/>
+              </w:rPr>
+              <w:instrText xml:space="preserve"> PAGEREF _Toc228020662 \h </w:instrText>
+            </w:r>
+            <w:r>
+              <w:rPr>
+                <w:noProof/>
+                <w:webHidden/>
+              </w:rPr>
+            </w:r>
+            <w:r>
+              <w:rPr>
+                <w:noProof/>
+                <w:webHidden/>
+              </w:rPr>
+              <w:fldChar w:fldCharType="separate"/>
+            </w:r>
+            <w:r>
+              <w:rPr>
+                <w:noProof/>
+                <w:webHidden/>
+              </w:rPr>
+              <w:t>8</w:t>
+            </w:r>
+            <w:r>
+              <w:rPr>
+                <w:noProof/>
+                <w:webHidden/>
+              </w:rPr>
+              <w:fldChar w:fldCharType="end"/>
+            </w:r>
+          </w:hyperlink>
+        </w:p>
+        <w:p>
+          <w:pPr>
+            <w:pStyle w:val="TOC1"/>
+            <w:tabs>
+              <w:tab w:val="left" w:pos="480"/>
+              <w:tab w:val="right" w:leader="dot" w:pos="8630"/>
+            </w:tabs>
+            <w:rPr>
+              <w:noProof/>
+            </w:rPr>
+          </w:pPr>
+          <w:hyperlink w:anchor="_Toc228020663" w:history="1">
+            <w:r>
+              <w:rPr>
+                <w:rStyle w:val="Hyperlink"/>
+                <w:noProof/>
+              </w:rPr>
+              <w:t>5.</w:t>
+            </w:r>
+            <w:r>
+              <w:rPr>
+                <w:noProof/>
+              </w:rPr>
+              <w:tab/>
+            </w:r>
+            <w:r>
+              <w:rPr>
+                <w:rStyle w:val="Hyperlink"/>
+                <w:noProof/>
+              </w:rPr>
+              <w:t>Project Testing</w:t>
+            </w:r>
+            <w:r>
+              <w:rPr>
+                <w:noProof/>
+                <w:webHidden/>
+              </w:rPr>
+              <w:tab/>
+            </w:r>
+            <w:r>
+              <w:rPr>
+                <w:noProof/>
+                <w:webHidden/>
+              </w:rPr>
+              <w:fldChar w:fldCharType="begin"/>
+            </w:r>
+            <w:r>
+              <w:rPr>
+                <w:noProof/>
+                <w:webHidden/>
+              </w:rPr>
+              <w:instrText xml:space="preserve"> PAGEREF _Toc228020663 \h </w:instrText>
+            </w:r>
+            <w:r>
+              <w:rPr>
+                <w:noProof/>
+                <w:webHidden/>
+              </w:rPr>
+            </w:r>
+            <w:r>
+              <w:rPr>
+                <w:noProof/>
+                <w:webHidden/>
+              </w:rPr>
+              <w:fldChar w:fldCharType="separate"/>
+            </w:r>
+            <w:r>
+              <w:rPr>
+                <w:noProof/>
+                <w:webHidden/>
+              </w:rPr>
+              <w:t>13</w:t>
+            </w:r>
+            <w:r>
+              <w:rPr>
+                <w:noProof/>
+                <w:webHidden/>
+              </w:rPr>
+              <w:fldChar w:fldCharType="end"/>
+            </w:r>
+          </w:hyperlink>
+        </w:p>
+        <w:p>
+          <w:pPr>
+            <w:pStyle w:val="TOC1"/>
+            <w:tabs>
+              <w:tab w:val="left" w:pos="480"/>
+              <w:tab w:val="right" w:leader="dot" w:pos="8630"/>
+            </w:tabs>
+            <w:rPr>
+              <w:noProof/>
+            </w:rPr>
+          </w:pPr>
+          <w:hyperlink w:anchor="_Toc228020664" w:history="1">
+            <w:r>
+              <w:rPr>
+                <w:rStyle w:val="Hyperlink"/>
+                <w:noProof/>
+              </w:rPr>
+              <w:t>6.</w:t>
+            </w:r>
+            <w:r>
+              <w:rPr>
+                <w:noProof/>
+              </w:rPr>
+              <w:tab/>
+            </w:r>
+            <w:r>
+              <w:rPr>
+                <w:rStyle w:val="Hyperlink"/>
+                <w:noProof/>
+              </w:rPr>
+              <w:t>Media Sources</w:t>
+            </w:r>
+            <w:r>
+              <w:rPr>
+                <w:noProof/>
+                <w:webHidden/>
+              </w:rPr>
+              <w:tab/>
+            </w:r>
+            <w:r>
+              <w:rPr>
+                <w:noProof/>
+                <w:webHidden/>
+              </w:rPr>
+              <w:fldChar w:fldCharType="begin"/>
+            </w:r>
+            <w:r>
+              <w:rPr>
+                <w:noProof/>
+                <w:webHidden/>
+              </w:rPr>
+              <w:instrText xml:space="preserve"> PAGEREF _Toc228020664 \h </w:instrText>
+            </w:r>
+            <w:r>
+              <w:rPr>
+                <w:noProof/>
+                <w:webHidden/>
+              </w:rPr>
+            </w:r>
+            <w:r>
+              <w:rPr>
+                <w:noProof/>
+                <w:webHidden/>
+              </w:rPr>
+              <w:fldChar w:fldCharType="separate"/>
+            </w:r>
+            <w:r>
+              <w:rPr>
+                <w:noProof/>
+                <w:webHidden/>
+              </w:rPr>
+              <w:t>14</w:t>
+            </w:r>
+            <w:r>
+              <w:rPr>
+                <w:noProof/>
+                <w:webHidden/>
+              </w:rPr>
+              <w:fldChar w:fldCharType="end"/>
+            </w:r>
+          </w:hyperlink>
+        </w:p>
+        <w:p>
+          <w:r>
+            <w:rPr>
+              <w:b/>
+              <w:bCs/>
+              <w:noProof/>
+            </w:rPr>
+            <w:fldChar w:fldCharType="end"/>
+          </w:r>
+        </w:p>
+      </w:sdtContent>
+    </w:sdt>
+    <w:p>
+      <w:pPr>
         <w:rPr>
           <w:rFonts w:ascii="Arial" w:hAnsi="Arial" w:cs="Arial"/>
           <w:b/>
@@ -495,13 +1474,21 @@
           <w:szCs w:val="40"/>
         </w:rPr>
       </w:pPr>
+      <w:bookmarkStart w:id="5" w:name="_Toc228020658"/>
       <w:r>
         <w:rPr>
           <w:sz w:val="40"/>
           <w:szCs w:val="40"/>
         </w:rPr>
-        <w:lastRenderedPageBreak/>
-        <w:t xml:space="preserve">Business Understanding </w:t>
+        <w:t>Business Understanding</w:t>
+      </w:r>
+      <w:bookmarkEnd w:id="5"/>
+      <w:r>
+        <w:rPr>
+          <w:sz w:val="40"/>
+          <w:szCs w:val="40"/>
+        </w:rPr>
+        <w:t xml:space="preserve"> </w:t>
       </w:r>
     </w:p>
     <w:p>
@@ -514,13 +1501,23 @@
           <w:szCs w:val="24"/>
         </w:rPr>
       </w:pPr>
+      <w:proofErr w:type="spellStart"/>
       <w:r>
         <w:rPr>
           <w:rFonts w:cs="Arial"/>
           <w:sz w:val="24"/>
           <w:szCs w:val="24"/>
         </w:rPr>
-        <w:t>Assetra is a web-based school inventory management system designed to show how an educational institution tracks, lends, and manages assets such as laptops, projectors, laboratory equipment, textbooks and more. Schools often rely on spreadsheets or paper logs to keep track of which items have been loaned to which student and when those items are due to be returned. This approach could have errors, difficult to keep track, and difficult to always see stock levels.</w:t>
+        <w:t>Assetra</w:t>
+      </w:r>
+      <w:proofErr w:type="spellEnd"/>
+      <w:r>
+        <w:rPr>
+          <w:rFonts w:cs="Arial"/>
+          <w:sz w:val="24"/>
+          <w:szCs w:val="24"/>
+        </w:rPr>
+        <w:t xml:space="preserve"> is a web-based school inventory management system designed to show how an educational institution tracks, lends, and manages assets such as laptops, projectors, laboratory equipment, textbooks and more. Schools often rely on spreadsheets or paper logs to keep track of which items have been loaned to which student and when those items are due to be returned. This approach could have errors, difficult to keep track, and difficult to always see stock levels.</w:t>
       </w:r>
     </w:p>
     <w:p>
@@ -539,7 +1536,25 @@
           <w:sz w:val="24"/>
           <w:szCs w:val="24"/>
         </w:rPr>
-        <w:t xml:space="preserve">The Assetra platform will address </w:t>
+        <w:t xml:space="preserve">The </w:t>
+      </w:r>
+      <w:proofErr w:type="spellStart"/>
+      <w:r>
+        <w:rPr>
+          <w:rFonts w:cs="Arial"/>
+          <w:sz w:val="24"/>
+          <w:szCs w:val="24"/>
+        </w:rPr>
+        <w:t>Assetra</w:t>
+      </w:r>
+      <w:proofErr w:type="spellEnd"/>
+      <w:r>
+        <w:rPr>
+          <w:rFonts w:cs="Arial"/>
+          <w:sz w:val="24"/>
+          <w:szCs w:val="24"/>
+        </w:rPr>
+        <w:t xml:space="preserve"> platform will address </w:t>
       </w:r>
       <w:r>
         <w:rPr>
@@ -585,11 +1600,13 @@
           <w:szCs w:val="40"/>
         </w:rPr>
       </w:pPr>
+      <w:bookmarkStart w:id="6" w:name="_Toc228020659"/>
       <w:r>
         <w:rPr>
           <w:sz w:val="40"/>
           <w:szCs w:val="40"/>
         </w:rPr>
+        <w:lastRenderedPageBreak/>
         <w:t xml:space="preserve">Business </w:t>
       </w:r>
       <w:r>
@@ -599,6 +1616,7 @@
         </w:rPr>
         <w:t>Requirements</w:t>
       </w:r>
+      <w:bookmarkEnd w:id="6"/>
     </w:p>
     <w:p>
       <w:pPr>
@@ -778,12 +1796,12 @@
           <w:szCs w:val="40"/>
         </w:rPr>
       </w:pPr>
+      <w:bookmarkStart w:id="7" w:name="_Toc228020660"/>
       <w:r>
         <w:rPr>
           <w:sz w:val="40"/>
           <w:szCs w:val="40"/>
         </w:rPr>
-        <w:lastRenderedPageBreak/>
         <w:t xml:space="preserve">Use </w:t>
       </w:r>
       <w:r>
@@ -793,6 +1811,7 @@
         </w:rPr>
         <w:t>Cases</w:t>
       </w:r>
+      <w:bookmarkEnd w:id="7"/>
     </w:p>
     <w:p>
       <w:pPr>
@@ -854,6 +1873,7 @@
           <w:sz w:val="24"/>
           <w:szCs w:val="24"/>
         </w:rPr>
+        <w:lastRenderedPageBreak/>
         <w:drawing>
           <wp:inline distT="0" distB="0" distL="0" distR="0" wp14:anchorId="6EF61423" wp14:editId="24BE4591">
             <wp:extent cx="2105025" cy="5420449"/>
@@ -986,7 +2006,6 @@
           <w:sz w:val="24"/>
           <w:szCs w:val="24"/>
         </w:rPr>
-        <w:lastRenderedPageBreak/>
         <w:t>The user enters their username and password. On success, Django will authenticate them and they will be redirected to the role appropriate landing page (Staff, Dashboard, Manager Dashboard, Student Home page)</w:t>
       </w:r>
     </w:p>
@@ -1257,7 +2276,23 @@
           <w:sz w:val="24"/>
           <w:szCs w:val="24"/>
         </w:rPr>
-        <w:t>The request status is ‘APPROVED’ and the user is the requester. The items stock quantity is incremented by one and the request status is ‘RETURNED’.</w:t>
+        <w:t>The request status is ‘APPROVED</w:t>
+      </w:r>
+      <w:proofErr w:type="gramStart"/>
+      <w:r>
+        <w:rPr>
+          <w:sz w:val="24"/>
+          <w:szCs w:val="24"/>
+        </w:rPr>
+        <w:t>’</w:t>
+      </w:r>
+      <w:proofErr w:type="gramEnd"/>
+      <w:r>
+        <w:rPr>
+          <w:sz w:val="24"/>
+          <w:szCs w:val="24"/>
+        </w:rPr>
+        <w:t xml:space="preserve"> and the user is the requester. The items stock quantity is incremented by one and the request status is ‘RETURNED’.</w:t>
       </w:r>
     </w:p>
     <w:p>
@@ -1609,6 +2644,7 @@
           <w:sz w:val="24"/>
           <w:szCs w:val="24"/>
         </w:rPr>
+        <w:lastRenderedPageBreak/>
         <w:t>Opens a form where the manager can add a new item (name, description, quantity, category) to the inventory.</w:t>
       </w:r>
     </w:p>
@@ -1908,6 +2944,30 @@
         </w:rPr>
       </w:pPr>
     </w:p>
+    <w:p>
+      <w:pPr>
+        <w:pStyle w:val="Heading1"/>
+        <w:spacing w:after="120"/>
+        <w:jc w:val="both"/>
+        <w:rPr>
+          <w:sz w:val="40"/>
+          <w:szCs w:val="40"/>
+        </w:rPr>
+      </w:pPr>
+      <w:bookmarkStart w:id="8" w:name="_Toc228020661"/>
+    </w:p>
+    <w:p>
+      <w:pPr>
+        <w:pStyle w:val="Heading1"/>
+        <w:spacing w:after="120"/>
+        <w:jc w:val="both"/>
+        <w:rPr>
+          <w:sz w:val="40"/>
+          <w:szCs w:val="40"/>
+        </w:rPr>
+      </w:pPr>
+    </w:p>
+    <w:p/>
     <w:p>
       <w:pPr>
         <w:pStyle w:val="Heading1"/>
@@ -1930,6 +2990,7 @@
         <w:lastRenderedPageBreak/>
         <w:t>Database Design</w:t>
       </w:r>
+      <w:bookmarkEnd w:id="8"/>
       <w:r>
         <w:rPr>
           <w:sz w:val="40"/>
@@ -1950,7 +3011,23 @@
           <w:sz w:val="24"/>
           <w:szCs w:val="24"/>
         </w:rPr>
-        <w:t xml:space="preserve">The Assetra database is built around </w:t>
+        <w:t xml:space="preserve">The </w:t>
+      </w:r>
+      <w:proofErr w:type="spellStart"/>
+      <w:r>
+        <w:rPr>
+          <w:sz w:val="24"/>
+          <w:szCs w:val="24"/>
+        </w:rPr>
+        <w:t>Assetra</w:t>
+      </w:r>
+      <w:proofErr w:type="spellEnd"/>
+      <w:r>
+        <w:rPr>
+          <w:sz w:val="24"/>
+          <w:szCs w:val="24"/>
+        </w:rPr>
+        <w:t xml:space="preserve"> database is built around </w:t>
       </w:r>
       <w:r>
         <w:rPr>
@@ -1992,9 +3069,9 @@
           <w:color w:val="FF0000"/>
         </w:rPr>
         <w:drawing>
-          <wp:inline distT="0" distB="0" distL="0" distR="0" wp14:anchorId="5942BB8E" wp14:editId="45349720">
-            <wp:extent cx="4781550" cy="6700809"/>
-            <wp:effectExtent l="0" t="0" r="0" b="5080"/>
+          <wp:inline distT="0" distB="0" distL="0" distR="0" wp14:anchorId="5942BB8E" wp14:editId="098AC1F1">
+            <wp:extent cx="4825748" cy="6762750"/>
+            <wp:effectExtent l="0" t="0" r="0" b="0"/>
             <wp:docPr id="854933591" name="Picture 3"/>
             <wp:cNvGraphicFramePr>
               <a:graphicFrameLocks xmlns:a="http://schemas.openxmlformats.org/drawingml/2006/main" noChangeAspect="1"/>
@@ -2015,7 +3092,7 @@
                   <pic:spPr>
                     <a:xfrm>
                       <a:off x="0" y="0"/>
-                      <a:ext cx="4799743" cy="6726305"/>
+                      <a:ext cx="4852734" cy="6800568"/>
                     </a:xfrm>
                     <a:prstGeom prst="rect">
                       <a:avLst/>
@@ -2088,12 +3165,21 @@
           <w:szCs w:val="24"/>
         </w:rPr>
       </w:pPr>
-      <w:r>
-        <w:rPr>
-          <w:sz w:val="24"/>
-          <w:szCs w:val="24"/>
-        </w:rPr>
-        <w:t>id(PK) - Primary key for each individual category</w:t>
+      <w:proofErr w:type="gramStart"/>
+      <w:r>
+        <w:rPr>
+          <w:sz w:val="24"/>
+          <w:szCs w:val="24"/>
+        </w:rPr>
+        <w:t>id(</w:t>
+      </w:r>
+      <w:proofErr w:type="gramEnd"/>
+      <w:r>
+        <w:rPr>
+          <w:sz w:val="24"/>
+          <w:szCs w:val="24"/>
+        </w:rPr>
+        <w:t>PK) - Primary key for each individual category</w:t>
       </w:r>
     </w:p>
     <w:p>
@@ -2166,12 +3252,21 @@
           <w:szCs w:val="24"/>
         </w:rPr>
       </w:pPr>
-      <w:r>
-        <w:rPr>
-          <w:sz w:val="24"/>
-          <w:szCs w:val="24"/>
-        </w:rPr>
-        <w:t>id(PK) – Unique primary key for each individual category</w:t>
+      <w:proofErr w:type="gramStart"/>
+      <w:r>
+        <w:rPr>
+          <w:sz w:val="24"/>
+          <w:szCs w:val="24"/>
+        </w:rPr>
+        <w:t>id(</w:t>
+      </w:r>
+      <w:proofErr w:type="gramEnd"/>
+      <w:r>
+        <w:rPr>
+          <w:sz w:val="24"/>
+          <w:szCs w:val="24"/>
+        </w:rPr>
+        <w:t>PK) – Unique primary key for each individual category</w:t>
       </w:r>
     </w:p>
     <w:p>
@@ -2234,12 +3329,37 @@
           <w:szCs w:val="24"/>
         </w:rPr>
       </w:pPr>
-      <w:r>
-        <w:rPr>
-          <w:sz w:val="24"/>
-          <w:szCs w:val="24"/>
-        </w:rPr>
-        <w:t>category_id(FK – Category) – The category the item belongs to</w:t>
+      <w:proofErr w:type="spellStart"/>
+      <w:r>
+        <w:rPr>
+          <w:sz w:val="24"/>
+          <w:szCs w:val="24"/>
+        </w:rPr>
+        <w:t>category_</w:t>
+      </w:r>
+      <w:proofErr w:type="gramStart"/>
+      <w:r>
+        <w:rPr>
+          <w:sz w:val="24"/>
+          <w:szCs w:val="24"/>
+        </w:rPr>
+        <w:t>id</w:t>
+      </w:r>
+      <w:proofErr w:type="spellEnd"/>
+      <w:r>
+        <w:rPr>
+          <w:sz w:val="24"/>
+          <w:szCs w:val="24"/>
+        </w:rPr>
+        <w:t>(</w:t>
+      </w:r>
+      <w:proofErr w:type="gramEnd"/>
+      <w:r>
+        <w:rPr>
+          <w:sz w:val="24"/>
+          <w:szCs w:val="24"/>
+        </w:rPr>
+        <w:t>FK – Category) – The category the item belongs to</w:t>
       </w:r>
     </w:p>
     <w:p>
@@ -2278,12 +3398,21 @@
           <w:szCs w:val="24"/>
         </w:rPr>
       </w:pPr>
-      <w:r>
-        <w:rPr>
-          <w:sz w:val="24"/>
-          <w:szCs w:val="24"/>
-        </w:rPr>
-        <w:t>id(PK) – Primary key for each request</w:t>
+      <w:proofErr w:type="gramStart"/>
+      <w:r>
+        <w:rPr>
+          <w:sz w:val="24"/>
+          <w:szCs w:val="24"/>
+        </w:rPr>
+        <w:t>id(</w:t>
+      </w:r>
+      <w:proofErr w:type="gramEnd"/>
+      <w:r>
+        <w:rPr>
+          <w:sz w:val="24"/>
+          <w:szCs w:val="24"/>
+        </w:rPr>
+        <w:t>PK) – Primary key for each request</w:t>
       </w:r>
     </w:p>
     <w:p>
@@ -2295,12 +3424,37 @@
           <w:szCs w:val="24"/>
         </w:rPr>
       </w:pPr>
-      <w:r>
-        <w:rPr>
-          <w:sz w:val="24"/>
-          <w:szCs w:val="24"/>
-        </w:rPr>
-        <w:t>user_id(FK – User) – The student who made the request</w:t>
+      <w:proofErr w:type="spellStart"/>
+      <w:r>
+        <w:rPr>
+          <w:sz w:val="24"/>
+          <w:szCs w:val="24"/>
+        </w:rPr>
+        <w:t>user_</w:t>
+      </w:r>
+      <w:proofErr w:type="gramStart"/>
+      <w:r>
+        <w:rPr>
+          <w:sz w:val="24"/>
+          <w:szCs w:val="24"/>
+        </w:rPr>
+        <w:t>id</w:t>
+      </w:r>
+      <w:proofErr w:type="spellEnd"/>
+      <w:r>
+        <w:rPr>
+          <w:sz w:val="24"/>
+          <w:szCs w:val="24"/>
+        </w:rPr>
+        <w:t>(</w:t>
+      </w:r>
+      <w:proofErr w:type="gramEnd"/>
+      <w:r>
+        <w:rPr>
+          <w:sz w:val="24"/>
+          <w:szCs w:val="24"/>
+        </w:rPr>
+        <w:t>FK – User) – The student who made the request</w:t>
       </w:r>
     </w:p>
     <w:p>
@@ -2312,12 +3466,37 @@
           <w:szCs w:val="24"/>
         </w:rPr>
       </w:pPr>
-      <w:r>
-        <w:rPr>
-          <w:sz w:val="24"/>
-          <w:szCs w:val="24"/>
-        </w:rPr>
-        <w:t>item_id(FK – Item) – The item being requested</w:t>
+      <w:proofErr w:type="spellStart"/>
+      <w:r>
+        <w:rPr>
+          <w:sz w:val="24"/>
+          <w:szCs w:val="24"/>
+        </w:rPr>
+        <w:t>item_</w:t>
+      </w:r>
+      <w:proofErr w:type="gramStart"/>
+      <w:r>
+        <w:rPr>
+          <w:sz w:val="24"/>
+          <w:szCs w:val="24"/>
+        </w:rPr>
+        <w:t>id</w:t>
+      </w:r>
+      <w:proofErr w:type="spellEnd"/>
+      <w:r>
+        <w:rPr>
+          <w:sz w:val="24"/>
+          <w:szCs w:val="24"/>
+        </w:rPr>
+        <w:t>(</w:t>
+      </w:r>
+      <w:proofErr w:type="gramEnd"/>
+      <w:r>
+        <w:rPr>
+          <w:sz w:val="24"/>
+          <w:szCs w:val="24"/>
+        </w:rPr>
+        <w:t>FK – Item) – The item being requested</w:t>
       </w:r>
     </w:p>
     <w:p>
@@ -2346,12 +3525,21 @@
           <w:szCs w:val="24"/>
         </w:rPr>
       </w:pPr>
-      <w:r>
-        <w:rPr>
-          <w:sz w:val="24"/>
-          <w:szCs w:val="24"/>
-        </w:rPr>
-        <w:t>request_date(datetime) – Timestamp of when the request was made</w:t>
+      <w:proofErr w:type="spellStart"/>
+      <w:r>
+        <w:rPr>
+          <w:sz w:val="24"/>
+          <w:szCs w:val="24"/>
+        </w:rPr>
+        <w:t>request_date</w:t>
+      </w:r>
+      <w:proofErr w:type="spellEnd"/>
+      <w:r>
+        <w:rPr>
+          <w:sz w:val="24"/>
+          <w:szCs w:val="24"/>
+        </w:rPr>
+        <w:t>(datetime) – Timestamp of when the request was made</w:t>
       </w:r>
     </w:p>
     <w:p>
@@ -2549,6 +3737,46 @@
         </w:rPr>
         <w:t>: many users can be in one group.</w:t>
       </w:r>
+    </w:p>
+    <w:p>
+      <w:pPr>
+        <w:spacing w:after="0" w:line="240" w:lineRule="auto"/>
+        <w:jc w:val="both"/>
+        <w:rPr>
+          <w:sz w:val="24"/>
+          <w:szCs w:val="24"/>
+        </w:rPr>
+      </w:pPr>
+    </w:p>
+    <w:p>
+      <w:pPr>
+        <w:spacing w:after="0" w:line="240" w:lineRule="auto"/>
+        <w:jc w:val="both"/>
+        <w:rPr>
+          <w:sz w:val="24"/>
+          <w:szCs w:val="24"/>
+        </w:rPr>
+      </w:pPr>
+    </w:p>
+    <w:p>
+      <w:pPr>
+        <w:spacing w:after="0" w:line="240" w:lineRule="auto"/>
+        <w:jc w:val="both"/>
+        <w:rPr>
+          <w:sz w:val="24"/>
+          <w:szCs w:val="24"/>
+        </w:rPr>
+      </w:pPr>
+    </w:p>
+    <w:p>
+      <w:pPr>
+        <w:spacing w:after="0" w:line="240" w:lineRule="auto"/>
+        <w:jc w:val="both"/>
+        <w:rPr>
+          <w:sz w:val="24"/>
+          <w:szCs w:val="24"/>
+        </w:rPr>
+      </w:pPr>
     </w:p>
     <w:p>
       <w:pPr>
@@ -2594,13 +3822,16 @@
           <w:szCs w:val="40"/>
         </w:rPr>
       </w:pPr>
+      <w:bookmarkStart w:id="9" w:name="_Toc228020662"/>
       <w:r>
         <w:rPr>
           <w:sz w:val="40"/>
           <w:szCs w:val="40"/>
         </w:rPr>
+        <w:lastRenderedPageBreak/>
         <w:t>Django Framework Implementation</w:t>
       </w:r>
+      <w:bookmarkEnd w:id="9"/>
       <w:r>
         <w:rPr>
           <w:sz w:val="40"/>
@@ -2616,12 +3847,21 @@
           <w:szCs w:val="24"/>
         </w:rPr>
       </w:pPr>
-      <w:r>
-        <w:rPr>
-          <w:sz w:val="24"/>
-          <w:szCs w:val="24"/>
-        </w:rPr>
-        <w:t xml:space="preserve">Assetra </w:t>
+      <w:proofErr w:type="spellStart"/>
+      <w:r>
+        <w:rPr>
+          <w:sz w:val="24"/>
+          <w:szCs w:val="24"/>
+        </w:rPr>
+        <w:t>Assetra</w:t>
+      </w:r>
+      <w:proofErr w:type="spellEnd"/>
+      <w:r>
+        <w:rPr>
+          <w:sz w:val="24"/>
+          <w:szCs w:val="24"/>
+        </w:rPr>
+        <w:t xml:space="preserve"> </w:t>
       </w:r>
       <w:r>
         <w:rPr>
@@ -2638,7 +3878,6 @@
         <w:t xml:space="preserve"> built using Django’s Model-View-Template (MVT) architecture.</w:t>
       </w:r>
     </w:p>
-    <w:p/>
     <w:p>
       <w:pPr>
         <w:rPr>
@@ -2657,7 +3896,6 @@
           <w:szCs w:val="32"/>
           <w:u w:val="single"/>
         </w:rPr>
-        <w:lastRenderedPageBreak/>
         <w:t>Model (M)</w:t>
       </w:r>
     </w:p>
@@ -2833,12 +4071,45 @@
           <w:szCs w:val="24"/>
         </w:rPr>
       </w:pPr>
-      <w:r>
-        <w:rPr>
-          <w:sz w:val="24"/>
-          <w:szCs w:val="24"/>
-        </w:rPr>
-        <w:t>There would have been a User and Group model here also however Django already has that built in the auth system, so I did not need to make this myself. Each new request has a date stamp with auto_now_add=True and automatically defaults to a ‘PENDING’ status.</w:t>
+    </w:p>
+    <w:p>
+      <w:pPr>
+        <w:rPr>
+          <w:sz w:val="24"/>
+          <w:szCs w:val="24"/>
+        </w:rPr>
+      </w:pPr>
+    </w:p>
+    <w:p>
+      <w:pPr>
+        <w:rPr>
+          <w:sz w:val="24"/>
+          <w:szCs w:val="24"/>
+        </w:rPr>
+      </w:pPr>
+      <w:r>
+        <w:rPr>
+          <w:sz w:val="24"/>
+          <w:szCs w:val="24"/>
+        </w:rPr>
+        <w:lastRenderedPageBreak/>
+        <w:t xml:space="preserve">There would have been a User and Group model here also however Django already has that built in the auth system, so I did not need to make this myself. Each new request has a date stamp with </w:t>
+      </w:r>
+      <w:proofErr w:type="spellStart"/>
+      <w:r>
+        <w:rPr>
+          <w:sz w:val="24"/>
+          <w:szCs w:val="24"/>
+        </w:rPr>
+        <w:t>auto_now_add</w:t>
+      </w:r>
+      <w:proofErr w:type="spellEnd"/>
+      <w:r>
+        <w:rPr>
+          <w:sz w:val="24"/>
+          <w:szCs w:val="24"/>
+        </w:rPr>
+        <w:t>=True and automatically defaults to a ‘PENDING’ status.</w:t>
       </w:r>
     </w:p>
     <w:p/>
@@ -2860,7 +4131,6 @@
           <w:szCs w:val="32"/>
           <w:u w:val="single"/>
         </w:rPr>
-        <w:lastRenderedPageBreak/>
         <w:t>View (V)</w:t>
       </w:r>
     </w:p>
@@ -2940,7 +4210,23 @@
           <w:sz w:val="24"/>
           <w:szCs w:val="24"/>
         </w:rPr>
-        <w:t>To make the database a bit safer, invalid or unsafe database lookups were handled by get_object_or_404() which means that invalid ID’s return with a error response instead of crashing the entire server. Django’s messages framework is also implemented and is used to give the user feedback after every action, such as approving a request or successfully returning an item.</w:t>
+        <w:t xml:space="preserve">To make the database a bit safer, invalid or unsafe database lookups were handled by get_object_or_404() which means that invalid ID’s return with </w:t>
+      </w:r>
+      <w:proofErr w:type="gramStart"/>
+      <w:r>
+        <w:rPr>
+          <w:sz w:val="24"/>
+          <w:szCs w:val="24"/>
+        </w:rPr>
+        <w:t>a</w:t>
+      </w:r>
+      <w:proofErr w:type="gramEnd"/>
+      <w:r>
+        <w:rPr>
+          <w:sz w:val="24"/>
+          <w:szCs w:val="24"/>
+        </w:rPr>
+        <w:t xml:space="preserve"> error response instead of crashing the entire server. Django’s messages framework is also implemented and is used to give the user feedback after every action, such as approving a request or successfully returning an item.</w:t>
       </w:r>
     </w:p>
     <w:p>
@@ -2977,6 +4263,7 @@
         <w:rPr>
           <w:noProof/>
         </w:rPr>
+        <w:lastRenderedPageBreak/>
         <w:drawing>
           <wp:inline distT="0" distB="0" distL="0" distR="0" wp14:anchorId="272D07D7" wp14:editId="059291EF">
             <wp:extent cx="3762900" cy="1800476"/>
@@ -3026,8 +4313,39 @@
           <w:sz w:val="24"/>
           <w:szCs w:val="24"/>
         </w:rPr>
-        <w:lastRenderedPageBreak/>
-        <w:t xml:space="preserve">Fort the managers create/edit views, I used Django’s ModelForm class which is defined in inventory/forms.py. A ModelForm allowed me to easily </w:t>
+        <w:t xml:space="preserve">Fort the managers create/edit views, I used Django’s </w:t>
+      </w:r>
+      <w:proofErr w:type="spellStart"/>
+      <w:r>
+        <w:rPr>
+          <w:sz w:val="24"/>
+          <w:szCs w:val="24"/>
+        </w:rPr>
+        <w:t>ModelForm</w:t>
+      </w:r>
+      <w:proofErr w:type="spellEnd"/>
+      <w:r>
+        <w:rPr>
+          <w:sz w:val="24"/>
+          <w:szCs w:val="24"/>
+        </w:rPr>
+        <w:t xml:space="preserve"> class which is defined in inventory/forms.py. A </w:t>
+      </w:r>
+      <w:proofErr w:type="spellStart"/>
+      <w:r>
+        <w:rPr>
+          <w:sz w:val="24"/>
+          <w:szCs w:val="24"/>
+        </w:rPr>
+        <w:t>ModelForm</w:t>
+      </w:r>
+      <w:proofErr w:type="spellEnd"/>
+      <w:r>
+        <w:rPr>
+          <w:sz w:val="24"/>
+          <w:szCs w:val="24"/>
+        </w:rPr>
+        <w:t xml:space="preserve"> allowed me to easily </w:t>
       </w:r>
       <w:r>
         <w:rPr>
@@ -3302,6 +4620,7 @@
         <w:rPr>
           <w:noProof/>
         </w:rPr>
+        <w:lastRenderedPageBreak/>
         <w:drawing>
           <wp:inline distT="0" distB="0" distL="0" distR="0" wp14:anchorId="0761DB0F" wp14:editId="4C20CF46">
             <wp:extent cx="5486400" cy="968375"/>
@@ -3344,7 +4663,6 @@
         <w:rPr>
           <w:noProof/>
         </w:rPr>
-        <w:lastRenderedPageBreak/>
         <w:drawing>
           <wp:inline distT="0" distB="0" distL="0" distR="0" wp14:anchorId="40F94FB3" wp14:editId="647DC8AE">
             <wp:extent cx="5314950" cy="3823812"/>
@@ -3481,6 +4799,7 @@
           <w:szCs w:val="40"/>
         </w:rPr>
       </w:pPr>
+      <w:bookmarkStart w:id="10" w:name="_Toc228020663"/>
       <w:r>
         <w:rPr>
           <w:sz w:val="40"/>
@@ -3488,20 +4807,37 @@
         </w:rPr>
         <w:t>Project Testing</w:t>
       </w:r>
-    </w:p>
-    <w:p>
-      <w:pPr>
-        <w:rPr>
-          <w:sz w:val="24"/>
-          <w:szCs w:val="24"/>
-        </w:rPr>
-      </w:pPr>
-      <w:r>
-        <w:rPr>
-          <w:sz w:val="24"/>
-          <w:szCs w:val="24"/>
-        </w:rPr>
-        <w:t xml:space="preserve">Automated testing in Assetra is implemented in inventory/tests.py using Django’s built in test framework. The testing strategy covers all three types of test types required for the project; unit tests, integration tests, and use case tests. </w:t>
+      <w:bookmarkEnd w:id="10"/>
+    </w:p>
+    <w:p>
+      <w:pPr>
+        <w:rPr>
+          <w:sz w:val="24"/>
+          <w:szCs w:val="24"/>
+        </w:rPr>
+      </w:pPr>
+      <w:r>
+        <w:rPr>
+          <w:sz w:val="24"/>
+          <w:szCs w:val="24"/>
+        </w:rPr>
+        <w:t xml:space="preserve">Automated testing in </w:t>
+      </w:r>
+      <w:proofErr w:type="spellStart"/>
+      <w:r>
+        <w:rPr>
+          <w:sz w:val="24"/>
+          <w:szCs w:val="24"/>
+        </w:rPr>
+        <w:t>Assetra</w:t>
+      </w:r>
+      <w:proofErr w:type="spellEnd"/>
+      <w:r>
+        <w:rPr>
+          <w:sz w:val="24"/>
+          <w:szCs w:val="24"/>
+        </w:rPr>
+        <w:t xml:space="preserve"> is implemented in inventory/tests.py using Django’s built in test framework. The testing strategy covers all three types of test types required for the project; unit tests, integration tests, and use case tests. </w:t>
       </w:r>
     </w:p>
     <w:p>
@@ -3553,6 +4889,7 @@
           <w:szCs w:val="24"/>
         </w:rPr>
       </w:pPr>
+      <w:proofErr w:type="spellStart"/>
       <w:r>
         <w:rPr>
           <w:sz w:val="24"/>
@@ -3579,7 +4916,15 @@
           <w:sz w:val="24"/>
           <w:szCs w:val="24"/>
         </w:rPr>
-        <w:t xml:space="preserve">ity_can_be_updated </w:t>
+        <w:t>ity_can_be_updated</w:t>
+      </w:r>
+      <w:proofErr w:type="spellEnd"/>
+      <w:r>
+        <w:rPr>
+          <w:sz w:val="24"/>
+          <w:szCs w:val="24"/>
+        </w:rPr>
+        <w:t xml:space="preserve"> </w:t>
       </w:r>
       <w:r>
         <w:rPr>
@@ -3596,6 +4941,7 @@
           <w:szCs w:val="24"/>
         </w:rPr>
       </w:pPr>
+      <w:proofErr w:type="spellStart"/>
       <w:r>
         <w:rPr>
           <w:sz w:val="24"/>
@@ -3610,6 +4956,7 @@
         </w:rPr>
         <w:t>est_user_assigned_to_correct_group</w:t>
       </w:r>
+      <w:proofErr w:type="spellEnd"/>
       <w:r>
         <w:rPr>
           <w:sz w:val="24"/>
@@ -3642,23 +4989,48 @@
           <w:szCs w:val="24"/>
         </w:rPr>
         <w:br/>
+      </w:r>
+      <w:proofErr w:type="spellStart"/>
+      <w:r>
+        <w:rPr>
+          <w:sz w:val="24"/>
+          <w:szCs w:val="24"/>
+        </w:rPr>
         <w:t>test_item_list_is_visible</w:t>
       </w:r>
-      <w:r>
-        <w:rPr>
-          <w:sz w:val="24"/>
-          <w:szCs w:val="24"/>
-        </w:rPr>
-        <w:t xml:space="preserve"> – sends a GET request for a item to check if it is there and visible</w:t>
-      </w:r>
-    </w:p>
-    <w:p>
-      <w:pPr>
-        <w:rPr>
-          <w:sz w:val="24"/>
-          <w:szCs w:val="24"/>
-        </w:rPr>
-      </w:pPr>
+      <w:proofErr w:type="spellEnd"/>
+      <w:r>
+        <w:rPr>
+          <w:sz w:val="24"/>
+          <w:szCs w:val="24"/>
+        </w:rPr>
+        <w:t xml:space="preserve"> – sends a GET request for </w:t>
+      </w:r>
+      <w:proofErr w:type="gramStart"/>
+      <w:r>
+        <w:rPr>
+          <w:sz w:val="24"/>
+          <w:szCs w:val="24"/>
+        </w:rPr>
+        <w:t>a</w:t>
+      </w:r>
+      <w:proofErr w:type="gramEnd"/>
+      <w:r>
+        <w:rPr>
+          <w:sz w:val="24"/>
+          <w:szCs w:val="24"/>
+        </w:rPr>
+        <w:t xml:space="preserve"> item to check if it is there and visible</w:t>
+      </w:r>
+    </w:p>
+    <w:p>
+      <w:pPr>
+        <w:rPr>
+          <w:sz w:val="24"/>
+          <w:szCs w:val="24"/>
+        </w:rPr>
+      </w:pPr>
+      <w:proofErr w:type="spellStart"/>
       <w:r>
         <w:rPr>
           <w:sz w:val="24"/>
@@ -3673,6 +5045,7 @@
         </w:rPr>
         <w:t>est_student_cannot_access_manage_request</w:t>
       </w:r>
+      <w:proofErr w:type="spellEnd"/>
       <w:r>
         <w:rPr>
           <w:sz w:val="24"/>
@@ -3688,6 +5061,7 @@
           <w:szCs w:val="24"/>
         </w:rPr>
       </w:pPr>
+      <w:proofErr w:type="spellStart"/>
       <w:r>
         <w:rPr>
           <w:sz w:val="24"/>
@@ -3702,6 +5076,7 @@
         </w:rPr>
         <w:t>est_login_required_to_make_request</w:t>
       </w:r>
+      <w:proofErr w:type="spellEnd"/>
       <w:r>
         <w:rPr>
           <w:sz w:val="24"/>
@@ -3738,6 +5113,7 @@
           <w:szCs w:val="24"/>
         </w:rPr>
       </w:pPr>
+      <w:proofErr w:type="spellStart"/>
       <w:r>
         <w:rPr>
           <w:sz w:val="24"/>
@@ -3752,6 +5128,7 @@
         </w:rPr>
         <w:t>est_student_can_request_item</w:t>
       </w:r>
+      <w:proofErr w:type="spellEnd"/>
       <w:r>
         <w:rPr>
           <w:sz w:val="24"/>
@@ -3767,6 +5144,7 @@
           <w:szCs w:val="24"/>
         </w:rPr>
       </w:pPr>
+      <w:proofErr w:type="spellStart"/>
       <w:r>
         <w:rPr>
           <w:sz w:val="24"/>
@@ -3781,6 +5159,7 @@
         </w:rPr>
         <w:t>est_staff_can_approve_request</w:t>
       </w:r>
+      <w:proofErr w:type="spellEnd"/>
       <w:r>
         <w:rPr>
           <w:sz w:val="24"/>
@@ -3871,8 +5250,46 @@
           <w:sz w:val="24"/>
           <w:szCs w:val="24"/>
         </w:rPr>
-        <w:t>All seven automated tests passed against the current codebase, showing and confirming that the model logic, role based access controls, and core user flows are functioning correctly.</w:t>
-      </w:r>
+        <w:t xml:space="preserve">All seven automated tests passed against the current codebase, showing and confirming that the model logic, </w:t>
+      </w:r>
+      <w:r>
+        <w:rPr>
+          <w:sz w:val="24"/>
+          <w:szCs w:val="24"/>
+        </w:rPr>
+        <w:t>role-based</w:t>
+      </w:r>
+      <w:r>
+        <w:rPr>
+          <w:sz w:val="24"/>
+          <w:szCs w:val="24"/>
+        </w:rPr>
+        <w:t xml:space="preserve"> access controls, and core user flows are functioning correctly.</w:t>
+      </w:r>
+    </w:p>
+    <w:p>
+      <w:pPr>
+        <w:rPr>
+          <w:sz w:val="24"/>
+          <w:szCs w:val="24"/>
+        </w:rPr>
+      </w:pPr>
+    </w:p>
+    <w:p>
+      <w:pPr>
+        <w:rPr>
+          <w:sz w:val="24"/>
+          <w:szCs w:val="24"/>
+        </w:rPr>
+      </w:pPr>
+    </w:p>
+    <w:p>
+      <w:pPr>
+        <w:rPr>
+          <w:sz w:val="24"/>
+          <w:szCs w:val="24"/>
+        </w:rPr>
+      </w:pPr>
     </w:p>
     <w:p>
       <w:pPr>
@@ -3887,13 +5304,16 @@
           <w:szCs w:val="40"/>
         </w:rPr>
       </w:pPr>
+      <w:bookmarkStart w:id="11" w:name="_Toc228020664"/>
       <w:r>
         <w:rPr>
           <w:sz w:val="40"/>
           <w:szCs w:val="40"/>
         </w:rPr>
+        <w:lastRenderedPageBreak/>
         <w:t>Media Sources</w:t>
       </w:r>
+      <w:bookmarkEnd w:id="11"/>
     </w:p>
     <w:p>
       <w:pPr>
@@ -4104,6 +5524,7 @@
           <w:sz w:val="24"/>
           <w:szCs w:val="24"/>
         </w:rPr>
+        <w:lastRenderedPageBreak/>
         <w:t xml:space="preserve">Bootstrap JS </w:t>
       </w:r>
       <w:r>
@@ -4165,8 +5586,17 @@
           <w:sz w:val="24"/>
           <w:szCs w:val="24"/>
         </w:rPr>
-        <w:t>Django ModelForm</w:t>
-      </w:r>
+        <w:t xml:space="preserve">Django </w:t>
+      </w:r>
+      <w:proofErr w:type="spellStart"/>
+      <w:r>
+        <w:rPr>
+          <w:sz w:val="24"/>
+          <w:szCs w:val="24"/>
+        </w:rPr>
+        <w:t>ModelForm</w:t>
+      </w:r>
+      <w:proofErr w:type="spellEnd"/>
     </w:p>
     <w:p>
       <w:pPr>
@@ -4200,9 +5630,17 @@
           <w:sz w:val="24"/>
           <w:szCs w:val="24"/>
         </w:rPr>
-        <w:lastRenderedPageBreak/>
-        <w:t>Django auto_now_add</w:t>
-      </w:r>
+        <w:t xml:space="preserve">Django </w:t>
+      </w:r>
+      <w:proofErr w:type="spellStart"/>
+      <w:r>
+        <w:rPr>
+          <w:sz w:val="24"/>
+          <w:szCs w:val="24"/>
+        </w:rPr>
+        <w:t>auto_now_add</w:t>
+      </w:r>
+      <w:proofErr w:type="spellEnd"/>
     </w:p>
     <w:p>
       <w:pPr>
@@ -4410,25 +5848,6 @@
           <w:szCs w:val="24"/>
         </w:rPr>
       </w:pPr>
-      <w:r>
-        <w:rPr>
-          <w:sz w:val="24"/>
-          <w:szCs w:val="24"/>
-        </w:rPr>
-        <w:t>Railway Deployment Documents</w:t>
-      </w:r>
-    </w:p>
-    <w:p>
-      <w:pPr>
-        <w:tabs>
-          <w:tab w:val="left" w:pos="6645"/>
-        </w:tabs>
-        <w:jc w:val="both"/>
-        <w:rPr>
-          <w:sz w:val="24"/>
-          <w:szCs w:val="24"/>
-        </w:rPr>
-      </w:pPr>
       <w:hyperlink r:id="rId37" w:history="1">
         <w:r>
           <w:rPr>
@@ -4451,12 +5870,21 @@
           <w:szCs w:val="24"/>
         </w:rPr>
       </w:pPr>
-      <w:r>
-        <w:rPr>
-          <w:sz w:val="24"/>
-          <w:szCs w:val="24"/>
-        </w:rPr>
-        <w:t>Gunicorn Installation</w:t>
+      <w:proofErr w:type="spellStart"/>
+      <w:r>
+        <w:rPr>
+          <w:sz w:val="24"/>
+          <w:szCs w:val="24"/>
+        </w:rPr>
+        <w:t>Gunicorn</w:t>
+      </w:r>
+      <w:proofErr w:type="spellEnd"/>
+      <w:r>
+        <w:rPr>
+          <w:sz w:val="24"/>
+          <w:szCs w:val="24"/>
+        </w:rPr>
+        <w:t xml:space="preserve"> Installation</w:t>
       </w:r>
     </w:p>
     <w:p>
@@ -4484,7 +5912,115 @@
     <w:p>
       <w:pPr>
         <w:tabs>
-          <w:tab w:val="left" w:pos="6645"/>
+          <w:tab w:val="left" w:pos="1575"/>
+        </w:tabs>
+        <w:jc w:val="both"/>
+        <w:rPr>
+          <w:sz w:val="24"/>
+          <w:szCs w:val="24"/>
+        </w:rPr>
+      </w:pPr>
+      <w:r>
+        <w:rPr>
+          <w:sz w:val="24"/>
+          <w:szCs w:val="24"/>
+        </w:rPr>
+        <w:t>C</w:t>
+      </w:r>
+      <w:r>
+        <w:rPr>
+          <w:sz w:val="24"/>
+          <w:szCs w:val="24"/>
+        </w:rPr>
+        <w:t xml:space="preserve">ontinuous Integration </w:t>
+      </w:r>
+      <w:r>
+        <w:rPr>
+          <w:sz w:val="24"/>
+          <w:szCs w:val="24"/>
+        </w:rPr>
+        <w:t>(tests running automatically after every git commit)</w:t>
+      </w:r>
+    </w:p>
+    <w:p>
+      <w:pPr>
+        <w:tabs>
+          <w:tab w:val="left" w:pos="7005"/>
+        </w:tabs>
+        <w:jc w:val="both"/>
+        <w:rPr>
+          <w:sz w:val="24"/>
+          <w:szCs w:val="24"/>
+        </w:rPr>
+      </w:pPr>
+      <w:hyperlink r:id="rId39" w:history="1">
+        <w:r>
+          <w:rPr>
+            <w:rStyle w:val="Hyperlink"/>
+            <w:sz w:val="24"/>
+            <w:szCs w:val="24"/>
+          </w:rPr>
+          <w:t>https://docs.github.com/en/actions/get-started/quickstart</w:t>
+        </w:r>
+      </w:hyperlink>
+      <w:r>
+        <w:rPr>
+          <w:sz w:val="24"/>
+          <w:szCs w:val="24"/>
+        </w:rPr>
+        <w:tab/>
+      </w:r>
+    </w:p>
+    <w:p>
+      <w:pPr>
+        <w:tabs>
+          <w:tab w:val="left" w:pos="7005"/>
+        </w:tabs>
+        <w:jc w:val="both"/>
+        <w:rPr>
+          <w:sz w:val="24"/>
+          <w:szCs w:val="24"/>
+        </w:rPr>
+      </w:pPr>
+      <w:hyperlink r:id="rId40" w:history="1">
+        <w:r>
+          <w:rPr>
+            <w:rStyle w:val="Hyperlink"/>
+            <w:sz w:val="24"/>
+            <w:szCs w:val="24"/>
+          </w:rPr>
+          <w:t>https://github.com/actions/starter-workflows/blob/main/ci/django.yml</w:t>
+        </w:r>
+      </w:hyperlink>
+    </w:p>
+    <w:p>
+      <w:pPr>
+        <w:tabs>
+          <w:tab w:val="left" w:pos="7005"/>
+        </w:tabs>
+        <w:jc w:val="both"/>
+        <w:rPr>
+          <w:sz w:val="24"/>
+          <w:szCs w:val="24"/>
+        </w:rPr>
+      </w:pPr>
+    </w:p>
+    <w:p>
+      <w:pPr>
+        <w:tabs>
+          <w:tab w:val="left" w:pos="7005"/>
+        </w:tabs>
+        <w:jc w:val="both"/>
+        <w:rPr>
+          <w:sz w:val="24"/>
+          <w:szCs w:val="24"/>
+        </w:rPr>
+      </w:pPr>
+    </w:p>
+    <w:p>
+      <w:pPr>
+        <w:tabs>
+          <w:tab w:val="left" w:pos="7005"/>
         </w:tabs>
         <w:jc w:val="both"/>
         <w:rPr>
@@ -4504,6 +6040,58 @@
           <w:szCs w:val="24"/>
         </w:rPr>
       </w:pPr>
+      <w:r>
+        <w:rPr>
+          <w:sz w:val="24"/>
+          <w:szCs w:val="24"/>
+        </w:rPr>
+        <w:lastRenderedPageBreak/>
+        <w:t>Con</w:t>
+      </w:r>
+      <w:r>
+        <w:rPr>
+          <w:sz w:val="24"/>
+          <w:szCs w:val="24"/>
+        </w:rPr>
+        <w:t>tinuous Deployment (</w:t>
+      </w:r>
+      <w:r>
+        <w:rPr>
+          <w:sz w:val="24"/>
+          <w:szCs w:val="24"/>
+        </w:rPr>
+        <w:t xml:space="preserve">Railway Deployment </w:t>
+      </w:r>
+      <w:proofErr w:type="spellStart"/>
+      <w:r>
+        <w:rPr>
+          <w:sz w:val="24"/>
+          <w:szCs w:val="24"/>
+        </w:rPr>
+        <w:t>Documents</w:t>
+      </w:r>
+      <w:r>
+        <w:rPr>
+          <w:sz w:val="24"/>
+          <w:szCs w:val="24"/>
+        </w:rPr>
+        <w:t>&amp;automated</w:t>
+      </w:r>
+      <w:proofErr w:type="spellEnd"/>
+      <w:r>
+        <w:rPr>
+          <w:sz w:val="24"/>
+          <w:szCs w:val="24"/>
+        </w:rPr>
+        <w:t xml:space="preserve"> deployment</w:t>
+      </w:r>
+      <w:r>
+        <w:rPr>
+          <w:sz w:val="24"/>
+          <w:szCs w:val="24"/>
+        </w:rPr>
+        <w:t>)</w:t>
+      </w:r>
     </w:p>
     <w:p>
       <w:pPr>
@@ -4516,6 +6104,16 @@
           <w:szCs w:val="24"/>
         </w:rPr>
       </w:pPr>
+      <w:hyperlink r:id="rId41" w:history="1">
+        <w:r>
+          <w:rPr>
+            <w:rStyle w:val="Hyperlink"/>
+            <w:sz w:val="24"/>
+            <w:szCs w:val="24"/>
+          </w:rPr>
+          <w:t>https://docs.railway.com</w:t>
+        </w:r>
+      </w:hyperlink>
     </w:p>
     <w:p>
       <w:pPr>
@@ -4528,9 +6126,22 @@
           <w:szCs w:val="24"/>
         </w:rPr>
       </w:pPr>
-    </w:p>
-    <w:p>
-      <w:pPr>
+      <w:hyperlink r:id="rId42" w:history="1">
+        <w:r>
+          <w:rPr>
+            <w:rStyle w:val="Hyperlink"/>
+            <w:sz w:val="24"/>
+            <w:szCs w:val="24"/>
+          </w:rPr>
+          <w:t>https://docs.railway.com/deployments/github-autodeploys</w:t>
+        </w:r>
+      </w:hyperlink>
+    </w:p>
+    <w:p>
+      <w:pPr>
+        <w:tabs>
+          <w:tab w:val="left" w:pos="6645"/>
+        </w:tabs>
         <w:jc w:val="both"/>
         <w:rPr>
           <w:sz w:val="24"/>
@@ -4540,6 +6151,9 @@
     </w:p>
     <w:p>
       <w:pPr>
+        <w:tabs>
+          <w:tab w:val="left" w:pos="6645"/>
+        </w:tabs>
         <w:jc w:val="both"/>
         <w:rPr>
           <w:sz w:val="24"/>
@@ -4549,6 +6163,9 @@
     </w:p>
     <w:p>
       <w:pPr>
+        <w:tabs>
+          <w:tab w:val="left" w:pos="6645"/>
+        </w:tabs>
         <w:jc w:val="both"/>
         <w:rPr>
           <w:sz w:val="24"/>
@@ -4558,6 +6175,9 @@
     </w:p>
     <w:p>
       <w:pPr>
+        <w:tabs>
+          <w:tab w:val="left" w:pos="6645"/>
+        </w:tabs>
         <w:jc w:val="both"/>
         <w:rPr>
           <w:sz w:val="24"/>
@@ -4567,6 +6187,9 @@
     </w:p>
     <w:p>
       <w:pPr>
+        <w:tabs>
+          <w:tab w:val="left" w:pos="6645"/>
+        </w:tabs>
         <w:jc w:val="both"/>
         <w:rPr>
           <w:sz w:val="24"/>
@@ -4576,6 +6199,9 @@
     </w:p>
     <w:p>
       <w:pPr>
+        <w:tabs>
+          <w:tab w:val="left" w:pos="6645"/>
+        </w:tabs>
         <w:jc w:val="both"/>
         <w:rPr>
           <w:sz w:val="24"/>
@@ -4585,6 +6211,9 @@
     </w:p>
     <w:p>
       <w:pPr>
+        <w:tabs>
+          <w:tab w:val="left" w:pos="6645"/>
+        </w:tabs>
         <w:jc w:val="both"/>
         <w:rPr>
           <w:sz w:val="24"/>
@@ -4592,8 +6221,71 @@
         </w:rPr>
       </w:pPr>
     </w:p>
+    <w:p>
+      <w:pPr>
+        <w:jc w:val="both"/>
+        <w:rPr>
+          <w:sz w:val="24"/>
+          <w:szCs w:val="24"/>
+        </w:rPr>
+      </w:pPr>
+    </w:p>
+    <w:p>
+      <w:pPr>
+        <w:jc w:val="both"/>
+        <w:rPr>
+          <w:sz w:val="24"/>
+          <w:szCs w:val="24"/>
+        </w:rPr>
+      </w:pPr>
+    </w:p>
+    <w:p>
+      <w:pPr>
+        <w:jc w:val="both"/>
+        <w:rPr>
+          <w:sz w:val="24"/>
+          <w:szCs w:val="24"/>
+        </w:rPr>
+      </w:pPr>
+    </w:p>
+    <w:p>
+      <w:pPr>
+        <w:jc w:val="both"/>
+        <w:rPr>
+          <w:sz w:val="24"/>
+          <w:szCs w:val="24"/>
+        </w:rPr>
+      </w:pPr>
+    </w:p>
+    <w:p>
+      <w:pPr>
+        <w:jc w:val="both"/>
+        <w:rPr>
+          <w:sz w:val="24"/>
+          <w:szCs w:val="24"/>
+        </w:rPr>
+      </w:pPr>
+    </w:p>
+    <w:p>
+      <w:pPr>
+        <w:jc w:val="both"/>
+        <w:rPr>
+          <w:sz w:val="24"/>
+          <w:szCs w:val="24"/>
+        </w:rPr>
+      </w:pPr>
+    </w:p>
+    <w:p>
+      <w:pPr>
+        <w:jc w:val="both"/>
+        <w:rPr>
+          <w:sz w:val="24"/>
+          <w:szCs w:val="24"/>
+        </w:rPr>
+      </w:pPr>
+    </w:p>
     <w:sectPr>
-      <w:headerReference w:type="default" r:id="rId39"/>
+      <w:headerReference w:type="default" r:id="rId43"/>
       <w:pgSz w:w="12240" w:h="15840"/>
       <w:pgMar w:top="1440" w:right="1800" w:bottom="1440" w:left="1800" w:header="720" w:footer="720" w:gutter="0"/>
       <w:cols w:space="720"/>
@@ -6079,7 +7771,7 @@
   <w:style w:type="paragraph" w:default="1" w:styleId="Normal">
     <w:name w:val="Normal"/>
     <w:qFormat/>
-    <w:rsid w:val="00FC693F"/>
+    <w:rsid w:val="009C17DC"/>
     <w:rPr>
       <w:lang w:val="en-IE"/>
     </w:rPr>
@@ -7010,7 +8702,6 @@
     <w:basedOn w:val="Heading1"/>
     <w:next w:val="Normal"/>
     <w:uiPriority w:val="39"/>
-    <w:semiHidden/>
     <w:unhideWhenUsed/>
     <w:qFormat/>
     <w:rsid w:val="00FC693F"/>
@@ -17106,6 +18797,31 @@
       <w:color w:val="800080" w:themeColor="followedHyperlink"/>
       <w:u w:val="single"/>
     </w:rPr>
+  </w:style>
+  <w:style w:type="paragraph" w:styleId="TOC1">
+    <w:name w:val="toc 1"/>
+    <w:basedOn w:val="Normal"/>
+    <w:next w:val="Normal"/>
+    <w:autoRedefine/>
+    <w:uiPriority w:val="39"/>
+    <w:unhideWhenUsed/>
+    <w:rsid w:val="000447FE"/>
+    <w:pPr>
+      <w:spacing w:after="100"/>
+    </w:pPr>
+  </w:style>
+  <w:style w:type="paragraph" w:styleId="TOC2">
+    <w:name w:val="toc 2"/>
+    <w:basedOn w:val="Normal"/>
+    <w:next w:val="Normal"/>
+    <w:autoRedefine/>
+    <w:uiPriority w:val="39"/>
+    <w:unhideWhenUsed/>
+    <w:rsid w:val="000447FE"/>
+    <w:pPr>
+      <w:spacing w:after="100"/>
+      <w:ind w:left="220"/>
+    </w:pPr>
   </w:style>
 </w:styles>
 </file>

</xml_diff>

<commit_message>
adding in a csv view for exporting requests as a csv
Co-authored-by: Copilot <copilot@github.com>
</commit_message>
<xml_diff>
--- a/ReportTemplateSample.docx
+++ b/ReportTemplateSample.docx
@@ -2276,23 +2276,7 @@
           <w:sz w:val="24"/>
           <w:szCs w:val="24"/>
         </w:rPr>
-        <w:t>The request status is ‘APPROVED</w:t>
-      </w:r>
-      <w:proofErr w:type="gramStart"/>
-      <w:r>
-        <w:rPr>
-          <w:sz w:val="24"/>
-          <w:szCs w:val="24"/>
-        </w:rPr>
-        <w:t>’</w:t>
-      </w:r>
-      <w:proofErr w:type="gramEnd"/>
-      <w:r>
-        <w:rPr>
-          <w:sz w:val="24"/>
-          <w:szCs w:val="24"/>
-        </w:rPr>
-        <w:t xml:space="preserve"> and the user is the requester. The items stock quantity is incremented by one and the request status is ‘RETURNED’.</w:t>
+        <w:t>The request status is ‘APPROVED’ and the user is the requester. The items stock quantity is incremented by one and the request status is ‘RETURNED’.</w:t>
       </w:r>
     </w:p>
     <w:p>
@@ -3165,21 +3149,12 @@
           <w:szCs w:val="24"/>
         </w:rPr>
       </w:pPr>
-      <w:proofErr w:type="gramStart"/>
-      <w:r>
-        <w:rPr>
-          <w:sz w:val="24"/>
-          <w:szCs w:val="24"/>
-        </w:rPr>
-        <w:t>id(</w:t>
-      </w:r>
-      <w:proofErr w:type="gramEnd"/>
-      <w:r>
-        <w:rPr>
-          <w:sz w:val="24"/>
-          <w:szCs w:val="24"/>
-        </w:rPr>
-        <w:t>PK) - Primary key for each individual category</w:t>
+      <w:r>
+        <w:rPr>
+          <w:sz w:val="24"/>
+          <w:szCs w:val="24"/>
+        </w:rPr>
+        <w:t>id(PK) - Primary key for each individual category</w:t>
       </w:r>
     </w:p>
     <w:p>
@@ -3252,21 +3227,12 @@
           <w:szCs w:val="24"/>
         </w:rPr>
       </w:pPr>
-      <w:proofErr w:type="gramStart"/>
-      <w:r>
-        <w:rPr>
-          <w:sz w:val="24"/>
-          <w:szCs w:val="24"/>
-        </w:rPr>
-        <w:t>id(</w:t>
-      </w:r>
-      <w:proofErr w:type="gramEnd"/>
-      <w:r>
-        <w:rPr>
-          <w:sz w:val="24"/>
-          <w:szCs w:val="24"/>
-        </w:rPr>
-        <w:t>PK) – Unique primary key for each individual category</w:t>
+      <w:r>
+        <w:rPr>
+          <w:sz w:val="24"/>
+          <w:szCs w:val="24"/>
+        </w:rPr>
+        <w:t>id(PK) – Unique primary key for each individual category</w:t>
       </w:r>
     </w:p>
     <w:p>
@@ -3335,15 +3301,7 @@
           <w:sz w:val="24"/>
           <w:szCs w:val="24"/>
         </w:rPr>
-        <w:t>category_</w:t>
-      </w:r>
-      <w:proofErr w:type="gramStart"/>
-      <w:r>
-        <w:rPr>
-          <w:sz w:val="24"/>
-          <w:szCs w:val="24"/>
-        </w:rPr>
-        <w:t>id</w:t>
+        <w:t>category_id</w:t>
       </w:r>
       <w:proofErr w:type="spellEnd"/>
       <w:r>
@@ -3351,15 +3309,7 @@
           <w:sz w:val="24"/>
           <w:szCs w:val="24"/>
         </w:rPr>
-        <w:t>(</w:t>
-      </w:r>
-      <w:proofErr w:type="gramEnd"/>
-      <w:r>
-        <w:rPr>
-          <w:sz w:val="24"/>
-          <w:szCs w:val="24"/>
-        </w:rPr>
-        <w:t>FK – Category) – The category the item belongs to</w:t>
+        <w:t>(FK – Category) – The category the item belongs to</w:t>
       </w:r>
     </w:p>
     <w:p>
@@ -3398,21 +3348,12 @@
           <w:szCs w:val="24"/>
         </w:rPr>
       </w:pPr>
-      <w:proofErr w:type="gramStart"/>
-      <w:r>
-        <w:rPr>
-          <w:sz w:val="24"/>
-          <w:szCs w:val="24"/>
-        </w:rPr>
-        <w:t>id(</w:t>
-      </w:r>
-      <w:proofErr w:type="gramEnd"/>
-      <w:r>
-        <w:rPr>
-          <w:sz w:val="24"/>
-          <w:szCs w:val="24"/>
-        </w:rPr>
-        <w:t>PK) – Primary key for each request</w:t>
+      <w:r>
+        <w:rPr>
+          <w:sz w:val="24"/>
+          <w:szCs w:val="24"/>
+        </w:rPr>
+        <w:t>id(PK) – Primary key for each request</w:t>
       </w:r>
     </w:p>
     <w:p>
@@ -3430,15 +3371,7 @@
           <w:sz w:val="24"/>
           <w:szCs w:val="24"/>
         </w:rPr>
-        <w:t>user_</w:t>
-      </w:r>
-      <w:proofErr w:type="gramStart"/>
-      <w:r>
-        <w:rPr>
-          <w:sz w:val="24"/>
-          <w:szCs w:val="24"/>
-        </w:rPr>
-        <w:t>id</w:t>
+        <w:t>user_id</w:t>
       </w:r>
       <w:proofErr w:type="spellEnd"/>
       <w:r>
@@ -3446,15 +3379,7 @@
           <w:sz w:val="24"/>
           <w:szCs w:val="24"/>
         </w:rPr>
-        <w:t>(</w:t>
-      </w:r>
-      <w:proofErr w:type="gramEnd"/>
-      <w:r>
-        <w:rPr>
-          <w:sz w:val="24"/>
-          <w:szCs w:val="24"/>
-        </w:rPr>
-        <w:t>FK – User) – The student who made the request</w:t>
+        <w:t>(FK – User) – The student who made the request</w:t>
       </w:r>
     </w:p>
     <w:p>
@@ -3472,15 +3397,7 @@
           <w:sz w:val="24"/>
           <w:szCs w:val="24"/>
         </w:rPr>
-        <w:t>item_</w:t>
-      </w:r>
-      <w:proofErr w:type="gramStart"/>
-      <w:r>
-        <w:rPr>
-          <w:sz w:val="24"/>
-          <w:szCs w:val="24"/>
-        </w:rPr>
-        <w:t>id</w:t>
+        <w:t>item_id</w:t>
       </w:r>
       <w:proofErr w:type="spellEnd"/>
       <w:r>
@@ -3488,15 +3405,7 @@
           <w:sz w:val="24"/>
           <w:szCs w:val="24"/>
         </w:rPr>
-        <w:t>(</w:t>
-      </w:r>
-      <w:proofErr w:type="gramEnd"/>
-      <w:r>
-        <w:rPr>
-          <w:sz w:val="24"/>
-          <w:szCs w:val="24"/>
-        </w:rPr>
-        <w:t>FK – Item) – The item being requested</w:t>
+        <w:t>(FK – Item) – The item being requested</w:t>
       </w:r>
     </w:p>
     <w:p>
@@ -4210,23 +4119,7 @@
           <w:sz w:val="24"/>
           <w:szCs w:val="24"/>
         </w:rPr>
-        <w:t xml:space="preserve">To make the database a bit safer, invalid or unsafe database lookups were handled by get_object_or_404() which means that invalid ID’s return with </w:t>
-      </w:r>
-      <w:proofErr w:type="gramStart"/>
-      <w:r>
-        <w:rPr>
-          <w:sz w:val="24"/>
-          <w:szCs w:val="24"/>
-        </w:rPr>
-        <w:t>a</w:t>
-      </w:r>
-      <w:proofErr w:type="gramEnd"/>
-      <w:r>
-        <w:rPr>
-          <w:sz w:val="24"/>
-          <w:szCs w:val="24"/>
-        </w:rPr>
-        <w:t xml:space="preserve"> error response instead of crashing the entire server. Django’s messages framework is also implemented and is used to give the user feedback after every action, such as approving a request or successfully returning an item.</w:t>
+        <w:t>To make the database a bit safer, invalid or unsafe database lookups were handled by get_object_or_404() which means that invalid ID’s return with a error response instead of crashing the entire server. Django’s messages framework is also implemented and is used to give the user feedback after every action, such as approving a request or successfully returning an item.</w:t>
       </w:r>
     </w:p>
     <w:p>
@@ -5004,23 +4897,7 @@
           <w:sz w:val="24"/>
           <w:szCs w:val="24"/>
         </w:rPr>
-        <w:t xml:space="preserve"> – sends a GET request for </w:t>
-      </w:r>
-      <w:proofErr w:type="gramStart"/>
-      <w:r>
-        <w:rPr>
-          <w:sz w:val="24"/>
-          <w:szCs w:val="24"/>
-        </w:rPr>
-        <w:t>a</w:t>
-      </w:r>
-      <w:proofErr w:type="gramEnd"/>
-      <w:r>
-        <w:rPr>
-          <w:sz w:val="24"/>
-          <w:szCs w:val="24"/>
-        </w:rPr>
-        <w:t xml:space="preserve"> item to check if it is there and visible</w:t>
+        <w:t xml:space="preserve"> – sends a GET request for a item to check if it is there and visible</w:t>
       </w:r>
     </w:p>
     <w:p>
@@ -5293,6 +5170,173 @@
     </w:p>
     <w:p>
       <w:pPr>
+        <w:rPr>
+          <w:sz w:val="24"/>
+          <w:szCs w:val="24"/>
+        </w:rPr>
+      </w:pPr>
+    </w:p>
+    <w:p>
+      <w:pPr>
+        <w:rPr>
+          <w:b/>
+          <w:bCs/>
+          <w:sz w:val="32"/>
+          <w:szCs w:val="32"/>
+          <w:u w:val="single"/>
+        </w:rPr>
+      </w:pPr>
+      <w:r>
+        <w:rPr>
+          <w:b/>
+          <w:bCs/>
+          <w:sz w:val="32"/>
+          <w:szCs w:val="32"/>
+          <w:u w:val="single"/>
+        </w:rPr>
+        <w:lastRenderedPageBreak/>
+        <w:t>Continuous Integration</w:t>
+      </w:r>
+      <w:r>
+        <w:rPr>
+          <w:b/>
+          <w:bCs/>
+          <w:sz w:val="32"/>
+          <w:szCs w:val="32"/>
+          <w:u w:val="single"/>
+        </w:rPr>
+        <w:t xml:space="preserve"> &amp; Continuous Development</w:t>
+      </w:r>
+    </w:p>
+    <w:p>
+      <w:pPr>
+        <w:rPr>
+          <w:sz w:val="24"/>
+          <w:szCs w:val="24"/>
+        </w:rPr>
+      </w:pPr>
+      <w:r>
+        <w:rPr>
+          <w:sz w:val="24"/>
+          <w:szCs w:val="24"/>
+        </w:rPr>
+        <w:t>The project also implements Continuous Integration (CI) using GitHub Actions. This workflow is done in .</w:t>
+      </w:r>
+      <w:proofErr w:type="spellStart"/>
+      <w:r>
+        <w:rPr>
+          <w:sz w:val="24"/>
+          <w:szCs w:val="24"/>
+        </w:rPr>
+        <w:t>github</w:t>
+      </w:r>
+      <w:proofErr w:type="spellEnd"/>
+      <w:r>
+        <w:rPr>
+          <w:sz w:val="24"/>
+          <w:szCs w:val="24"/>
+        </w:rPr>
+        <w:t>/workflows/</w:t>
+      </w:r>
+      <w:proofErr w:type="spellStart"/>
+      <w:r>
+        <w:rPr>
+          <w:sz w:val="24"/>
+          <w:szCs w:val="24"/>
+        </w:rPr>
+        <w:t>django.yml</w:t>
+      </w:r>
+      <w:proofErr w:type="spellEnd"/>
+      <w:r>
+        <w:rPr>
+          <w:sz w:val="24"/>
+          <w:szCs w:val="24"/>
+        </w:rPr>
+        <w:t xml:space="preserve"> and is triggered automatically every time there is a push to the main branch.</w:t>
+      </w:r>
+      <w:r>
+        <w:rPr>
+          <w:sz w:val="24"/>
+          <w:szCs w:val="24"/>
+        </w:rPr>
+        <w:t xml:space="preserve"> This ensures that all the tests are passing after any change, which can help catch issues like missing dependencies or any other minor issues before they reach production and deployment. This CI pipeline is also paired with Continuous Development (CD) provided by Railway, which automatically builds and redeploys the application on every push to main. With these two pipelines together, every commit is tested and if the tests pass, the commit can go on to being deployed to production.</w:t>
+      </w:r>
+    </w:p>
+    <w:p>
+      <w:pPr>
+        <w:rPr>
+          <w:sz w:val="24"/>
+          <w:szCs w:val="24"/>
+        </w:rPr>
+      </w:pPr>
+      <w:r>
+        <w:rPr>
+          <w:sz w:val="24"/>
+          <w:szCs w:val="24"/>
+        </w:rPr>
+        <w:drawing>
+          <wp:inline distT="0" distB="0" distL="0" distR="0" wp14:anchorId="5FDDD967" wp14:editId="6EDF2F20">
+            <wp:extent cx="5486400" cy="4029710"/>
+            <wp:effectExtent l="0" t="0" r="0" b="8890"/>
+            <wp:docPr id="667761517" name="Picture 1"/>
+            <wp:cNvGraphicFramePr>
+              <a:graphicFrameLocks xmlns:a="http://schemas.openxmlformats.org/drawingml/2006/main" noChangeAspect="1"/>
+            </wp:cNvGraphicFramePr>
+            <a:graphic xmlns:a="http://schemas.openxmlformats.org/drawingml/2006/main">
+              <a:graphicData uri="http://schemas.openxmlformats.org/drawingml/2006/picture">
+                <pic:pic xmlns:pic="http://schemas.openxmlformats.org/drawingml/2006/picture">
+                  <pic:nvPicPr>
+                    <pic:cNvPr id="667761517" name=""/>
+                    <pic:cNvPicPr/>
+                  </pic:nvPicPr>
+                  <pic:blipFill>
+                    <a:blip r:embed="rId23"/>
+                    <a:stretch>
+                      <a:fillRect/>
+                    </a:stretch>
+                  </pic:blipFill>
+                  <pic:spPr>
+                    <a:xfrm>
+                      <a:off x="0" y="0"/>
+                      <a:ext cx="5486400" cy="4029710"/>
+                    </a:xfrm>
+                    <a:prstGeom prst="rect">
+                      <a:avLst/>
+                    </a:prstGeom>
+                  </pic:spPr>
+                </pic:pic>
+              </a:graphicData>
+            </a:graphic>
+          </wp:inline>
+        </w:drawing>
+      </w:r>
+    </w:p>
+    <w:p>
+      <w:pPr>
+        <w:rPr>
+          <w:sz w:val="24"/>
+          <w:szCs w:val="24"/>
+        </w:rPr>
+      </w:pPr>
+    </w:p>
+    <w:p>
+      <w:pPr>
+        <w:rPr>
+          <w:sz w:val="24"/>
+          <w:szCs w:val="24"/>
+        </w:rPr>
+      </w:pPr>
+    </w:p>
+    <w:p>
+      <w:pPr>
+        <w:rPr>
+          <w:sz w:val="24"/>
+          <w:szCs w:val="24"/>
+        </w:rPr>
+      </w:pPr>
+    </w:p>
+    <w:p>
+      <w:pPr>
         <w:pStyle w:val="Heading1"/>
         <w:numPr>
           <w:ilvl w:val="0"/>
@@ -5339,7 +5383,7 @@
           <w:szCs w:val="24"/>
         </w:rPr>
       </w:pPr>
-      <w:hyperlink r:id="rId23" w:history="1">
+      <w:hyperlink r:id="rId24" w:history="1">
         <w:r>
           <w:rPr>
             <w:rStyle w:val="Hyperlink"/>
@@ -5383,7 +5427,7 @@
           <w:szCs w:val="24"/>
         </w:rPr>
       </w:pPr>
-      <w:hyperlink r:id="rId24" w:history="1">
+      <w:hyperlink r:id="rId25" w:history="1">
         <w:r>
           <w:rPr>
             <w:rStyle w:val="Hyperlink"/>
@@ -5402,7 +5446,7 @@
           <w:szCs w:val="24"/>
         </w:rPr>
       </w:pPr>
-      <w:hyperlink r:id="rId25" w:history="1">
+      <w:hyperlink r:id="rId26" w:history="1">
         <w:r>
           <w:rPr>
             <w:rStyle w:val="Hyperlink"/>
@@ -5446,7 +5490,7 @@
           <w:szCs w:val="24"/>
         </w:rPr>
       </w:pPr>
-      <w:hyperlink r:id="rId26" w:history="1">
+      <w:hyperlink r:id="rId27" w:history="1">
         <w:r>
           <w:rPr>
             <w:rStyle w:val="Hyperlink"/>
@@ -5465,7 +5509,7 @@
           <w:szCs w:val="24"/>
         </w:rPr>
       </w:pPr>
-      <w:hyperlink r:id="rId27" w:history="1">
+      <w:hyperlink r:id="rId28" w:history="1">
         <w:r>
           <w:rPr>
             <w:rStyle w:val="Hyperlink"/>
@@ -5500,7 +5544,7 @@
           <w:szCs w:val="24"/>
         </w:rPr>
       </w:pPr>
-      <w:hyperlink r:id="rId28" w:anchor="pako:eNqtU1Fv2jAQ_ivWPVMUisE0b1OXVlVVtaPwsAkJefGRuiV2ajtbGeW_zzYJMIamTZqf4u----7z3WUNuRYIKaD5KHlheDlTxJ_r8f30gby_n53pNZk-ZmOSkhlwa2WhUBCnZ7AlxljDG2efptnjJFJL_oK2JV1-mGTX9-PPLfFmkt1FVr4Mkgu5p8bQCT2DrzVa52tLFbiHNtfbSzhSOSIFebjdQ9YZqQqieIlbcNNmR-9_lVxbNHuBg0Dl_X_XRvwWwJLL5R79qvUSuSLSzm1doQmCp6OOLxYnIzx38tuBA8EdOlli_Jg_a-kHc_TAXd__sUPhOHxzRKDNjayc1OpIOs7pv8m2Cq81V0661a9o7h9YaLOa-wJXt0dG2iX5s5cAhZ4fSuyoDstjvPHup-Fqe6LnzTrOA9AYgg4URgpInamxAyUavwL-CtHZDNwT-kZAWGbBzUtY4pBTcfVF67JNM7ouniBd8KX1t7oKBZo_c4caVALNpa6Vg5T2ogaka3iDtNdjXcrYRcIGfTqkyagDq4Ced3tDNuyPLihLKE3YpgM_YtWkywYJHZ0PhrSf-Jw-2_wE0nA1CQ" w:history="1">
+      <w:hyperlink r:id="rId29" w:anchor="pako:eNqtU1Fv2jAQ_ivWPVMUisE0b1OXVlVVtaPwsAkJefGRuiV2ajtbGeW_zzYJMIamTZqf4u----7z3WUNuRYIKaD5KHlheDlTxJ_r8f30gby_n53pNZk-ZmOSkhlwa2WhUBCnZ7AlxljDG2efptnjJFJL_oK2JV1-mGTX9-PPLfFmkt1FVr4Mkgu5p8bQCT2DrzVa52tLFbiHNtfbSzhSOSIFebjdQ9YZqQqieIlbcNNmR-9_lVxbNHuBg0Dl_X_XRvwWwJLL5R79qvUSuSLSzm1doQmCp6OOLxYnIzx38tuBA8EdOlli_Jg_a-kHc_TAXd__sUPhOHxzRKDNjayc1OpIOs7pv8m2Cq81V0661a9o7h9YaLOa-wJXt0dG2iX5s5cAhZ4fSuyoDstjvPHup-Fqe6LnzTrOA9AYgg4URgpInamxAyUavwL-CtHZDNwT-kZAWGbBzUtY4pBTcfVF67JNM7ouniBd8KX1t7oKBZo_c4caVALNpa6Vg5T2ogaka3iDtNdjXcrYRcIGfTqkyagDq4Ced3tDNuyPLihLKE3YpgM_YtWkywYJHZ0PhrSf-Jw-2_wE0nA1CQ" w:history="1">
         <w:r>
           <w:rPr>
             <w:rStyle w:val="Hyperlink"/>
@@ -5543,7 +5587,7 @@
           <w:szCs w:val="24"/>
         </w:rPr>
       </w:pPr>
-      <w:hyperlink r:id="rId29" w:history="1">
+      <w:hyperlink r:id="rId30" w:history="1">
         <w:r>
           <w:rPr>
             <w:rStyle w:val="Hyperlink"/>
@@ -5562,7 +5606,7 @@
           <w:szCs w:val="24"/>
         </w:rPr>
       </w:pPr>
-      <w:hyperlink r:id="rId30" w:history="1">
+      <w:hyperlink r:id="rId31" w:history="1">
         <w:r>
           <w:rPr>
             <w:rStyle w:val="Hyperlink"/>
@@ -5606,7 +5650,7 @@
           <w:szCs w:val="24"/>
         </w:rPr>
       </w:pPr>
-      <w:hyperlink r:id="rId31" w:history="1">
+      <w:hyperlink r:id="rId32" w:history="1">
         <w:r>
           <w:rPr>
             <w:rStyle w:val="Hyperlink"/>
@@ -5653,7 +5697,7 @@
           <w:szCs w:val="24"/>
         </w:rPr>
       </w:pPr>
-      <w:hyperlink r:id="rId32" w:history="1">
+      <w:hyperlink r:id="rId33" w:history="1">
         <w:r>
           <w:rPr>
             <w:rStyle w:val="Hyperlink"/>
@@ -5701,7 +5745,7 @@
           <w:szCs w:val="24"/>
         </w:rPr>
       </w:pPr>
-      <w:hyperlink r:id="rId33" w:history="1">
+      <w:hyperlink r:id="rId34" w:history="1">
         <w:r>
           <w:rPr>
             <w:rStyle w:val="Hyperlink"/>
@@ -5742,7 +5786,7 @@
           <w:szCs w:val="24"/>
         </w:rPr>
       </w:pPr>
-      <w:hyperlink r:id="rId34" w:history="1">
+      <w:hyperlink r:id="rId35" w:history="1">
         <w:r>
           <w:rPr>
             <w:rStyle w:val="Hyperlink"/>
@@ -5804,7 +5848,7 @@
           <w:szCs w:val="24"/>
         </w:rPr>
       </w:pPr>
-      <w:hyperlink r:id="rId35" w:history="1">
+      <w:hyperlink r:id="rId36" w:history="1">
         <w:r>
           <w:rPr>
             <w:rStyle w:val="Hyperlink"/>
@@ -5826,7 +5870,7 @@
           <w:szCs w:val="24"/>
         </w:rPr>
       </w:pPr>
-      <w:hyperlink r:id="rId36" w:history="1">
+      <w:hyperlink r:id="rId37" w:history="1">
         <w:r>
           <w:rPr>
             <w:rStyle w:val="Hyperlink"/>
@@ -5848,7 +5892,7 @@
           <w:szCs w:val="24"/>
         </w:rPr>
       </w:pPr>
-      <w:hyperlink r:id="rId37" w:history="1">
+      <w:hyperlink r:id="rId38" w:history="1">
         <w:r>
           <w:rPr>
             <w:rStyle w:val="Hyperlink"/>
@@ -5898,7 +5942,7 @@
           <w:szCs w:val="24"/>
         </w:rPr>
       </w:pPr>
-      <w:hyperlink r:id="rId38" w:history="1">
+      <w:hyperlink r:id="rId39" w:history="1">
         <w:r>
           <w:rPr>
             <w:rStyle w:val="Hyperlink"/>
@@ -5953,7 +5997,7 @@
           <w:szCs w:val="24"/>
         </w:rPr>
       </w:pPr>
-      <w:hyperlink r:id="rId39" w:history="1">
+      <w:hyperlink r:id="rId40" w:history="1">
         <w:r>
           <w:rPr>
             <w:rStyle w:val="Hyperlink"/>
@@ -5982,7 +6026,7 @@
           <w:szCs w:val="24"/>
         </w:rPr>
       </w:pPr>
-      <w:hyperlink r:id="rId40" w:history="1">
+      <w:hyperlink r:id="rId41" w:history="1">
         <w:r>
           <w:rPr>
             <w:rStyle w:val="Hyperlink"/>
@@ -6104,7 +6148,7 @@
           <w:szCs w:val="24"/>
         </w:rPr>
       </w:pPr>
-      <w:hyperlink r:id="rId41" w:history="1">
+      <w:hyperlink r:id="rId42" w:history="1">
         <w:r>
           <w:rPr>
             <w:rStyle w:val="Hyperlink"/>
@@ -6126,7 +6170,7 @@
           <w:szCs w:val="24"/>
         </w:rPr>
       </w:pPr>
-      <w:hyperlink r:id="rId42" w:history="1">
+      <w:hyperlink r:id="rId43" w:history="1">
         <w:r>
           <w:rPr>
             <w:rStyle w:val="Hyperlink"/>
@@ -6285,7 +6329,7 @@
       </w:pPr>
     </w:p>
     <w:sectPr>
-      <w:headerReference w:type="default" r:id="rId43"/>
+      <w:headerReference w:type="default" r:id="rId44"/>
       <w:pgSz w:w="12240" w:h="15840"/>
       <w:pgMar w:top="1440" w:right="1800" w:bottom="1440" w:left="1800" w:header="720" w:footer="720" w:gutter="0"/>
       <w:cols w:space="720"/>

</xml_diff>

<commit_message>
adding csv view to manager
</commit_message>
<xml_diff>
--- a/ReportTemplateSample.docx
+++ b/ReportTemplateSample.docx
@@ -75,13 +75,8 @@
           </w:tcPr>
           <w:p>
             <w:r>
-              <w:t xml:space="preserve">Matas </w:t>
+              <w:t>Matas Zostautas</w:t>
             </w:r>
-            <w:proofErr w:type="spellStart"/>
-            <w:r>
-              <w:t>Zostautas</w:t>
-            </w:r>
-            <w:proofErr w:type="spellEnd"/>
           </w:p>
         </w:tc>
       </w:tr>
@@ -256,13 +251,8 @@
         <w:t xml:space="preserve">Student Signature: </w:t>
       </w:r>
       <w:r>
-        <w:t xml:space="preserve">Matas </w:t>
-      </w:r>
-      <w:proofErr w:type="spellStart"/>
-      <w:r>
-        <w:t>Zostautas</w:t>
-      </w:r>
-      <w:proofErr w:type="spellEnd"/>
+        <w:t>Matas Zostautas</w:t>
+      </w:r>
     </w:p>
     <w:p>
       <w:r>
@@ -1501,23 +1491,13 @@
           <w:szCs w:val="24"/>
         </w:rPr>
       </w:pPr>
-      <w:proofErr w:type="spellStart"/>
       <w:r>
         <w:rPr>
           <w:rFonts w:cs="Arial"/>
           <w:sz w:val="24"/>
           <w:szCs w:val="24"/>
         </w:rPr>
-        <w:t>Assetra</w:t>
-      </w:r>
-      <w:proofErr w:type="spellEnd"/>
-      <w:r>
-        <w:rPr>
-          <w:rFonts w:cs="Arial"/>
-          <w:sz w:val="24"/>
-          <w:szCs w:val="24"/>
-        </w:rPr>
-        <w:t xml:space="preserve"> is a web-based school inventory management system designed to show how an educational institution tracks, lends, and manages assets such as laptops, projectors, laboratory equipment, textbooks and more. Schools often rely on spreadsheets or paper logs to keep track of which items have been loaned to which student and when those items are due to be returned. This approach could have errors, difficult to keep track, and difficult to always see stock levels.</w:t>
+        <w:t>Assetra is a web-based school inventory management system designed to show how an educational institution tracks, lends, and manages assets such as laptops, projectors, laboratory equipment, textbooks and more. Schools often rely on spreadsheets or paper logs to keep track of which items have been loaned to which student and when those items are due to be returned. This approach could have errors, difficult to keep track, and difficult to always see stock levels.</w:t>
       </w:r>
     </w:p>
     <w:p>
@@ -1536,25 +1516,7 @@
           <w:sz w:val="24"/>
           <w:szCs w:val="24"/>
         </w:rPr>
-        <w:t xml:space="preserve">The </w:t>
-      </w:r>
-      <w:proofErr w:type="spellStart"/>
-      <w:r>
-        <w:rPr>
-          <w:rFonts w:cs="Arial"/>
-          <w:sz w:val="24"/>
-          <w:szCs w:val="24"/>
-        </w:rPr>
-        <w:t>Assetra</w:t>
-      </w:r>
-      <w:proofErr w:type="spellEnd"/>
-      <w:r>
-        <w:rPr>
-          <w:rFonts w:cs="Arial"/>
-          <w:sz w:val="24"/>
-          <w:szCs w:val="24"/>
-        </w:rPr>
-        <w:t xml:space="preserve"> platform will address </w:t>
+        <w:t xml:space="preserve">The Assetra platform will address </w:t>
       </w:r>
       <w:r>
         <w:rPr>
@@ -2995,23 +2957,7 @@
           <w:sz w:val="24"/>
           <w:szCs w:val="24"/>
         </w:rPr>
-        <w:t xml:space="preserve">The </w:t>
-      </w:r>
-      <w:proofErr w:type="spellStart"/>
-      <w:r>
-        <w:rPr>
-          <w:sz w:val="24"/>
-          <w:szCs w:val="24"/>
-        </w:rPr>
-        <w:t>Assetra</w:t>
-      </w:r>
-      <w:proofErr w:type="spellEnd"/>
-      <w:r>
-        <w:rPr>
-          <w:sz w:val="24"/>
-          <w:szCs w:val="24"/>
-        </w:rPr>
-        <w:t xml:space="preserve"> database is built around </w:t>
+        <w:t xml:space="preserve">The Assetra database is built around </w:t>
       </w:r>
       <w:r>
         <w:rPr>
@@ -3295,21 +3241,12 @@
           <w:szCs w:val="24"/>
         </w:rPr>
       </w:pPr>
-      <w:proofErr w:type="spellStart"/>
-      <w:r>
-        <w:rPr>
-          <w:sz w:val="24"/>
-          <w:szCs w:val="24"/>
-        </w:rPr>
-        <w:t>category_id</w:t>
-      </w:r>
-      <w:proofErr w:type="spellEnd"/>
-      <w:r>
-        <w:rPr>
-          <w:sz w:val="24"/>
-          <w:szCs w:val="24"/>
-        </w:rPr>
-        <w:t>(FK – Category) – The category the item belongs to</w:t>
+      <w:r>
+        <w:rPr>
+          <w:sz w:val="24"/>
+          <w:szCs w:val="24"/>
+        </w:rPr>
+        <w:t>category_id(FK – Category) – The category the item belongs to</w:t>
       </w:r>
     </w:p>
     <w:p>
@@ -3365,21 +3302,12 @@
           <w:szCs w:val="24"/>
         </w:rPr>
       </w:pPr>
-      <w:proofErr w:type="spellStart"/>
-      <w:r>
-        <w:rPr>
-          <w:sz w:val="24"/>
-          <w:szCs w:val="24"/>
-        </w:rPr>
-        <w:t>user_id</w:t>
-      </w:r>
-      <w:proofErr w:type="spellEnd"/>
-      <w:r>
-        <w:rPr>
-          <w:sz w:val="24"/>
-          <w:szCs w:val="24"/>
-        </w:rPr>
-        <w:t>(FK – User) – The student who made the request</w:t>
+      <w:r>
+        <w:rPr>
+          <w:sz w:val="24"/>
+          <w:szCs w:val="24"/>
+        </w:rPr>
+        <w:t>user_id(FK – User) – The student who made the request</w:t>
       </w:r>
     </w:p>
     <w:p>
@@ -3391,21 +3319,12 @@
           <w:szCs w:val="24"/>
         </w:rPr>
       </w:pPr>
-      <w:proofErr w:type="spellStart"/>
-      <w:r>
-        <w:rPr>
-          <w:sz w:val="24"/>
-          <w:szCs w:val="24"/>
-        </w:rPr>
-        <w:t>item_id</w:t>
-      </w:r>
-      <w:proofErr w:type="spellEnd"/>
-      <w:r>
-        <w:rPr>
-          <w:sz w:val="24"/>
-          <w:szCs w:val="24"/>
-        </w:rPr>
-        <w:t>(FK – Item) – The item being requested</w:t>
+      <w:r>
+        <w:rPr>
+          <w:sz w:val="24"/>
+          <w:szCs w:val="24"/>
+        </w:rPr>
+        <w:t>item_id(FK – Item) – The item being requested</w:t>
       </w:r>
     </w:p>
     <w:p>
@@ -3434,21 +3353,12 @@
           <w:szCs w:val="24"/>
         </w:rPr>
       </w:pPr>
-      <w:proofErr w:type="spellStart"/>
-      <w:r>
-        <w:rPr>
-          <w:sz w:val="24"/>
-          <w:szCs w:val="24"/>
-        </w:rPr>
-        <w:t>request_date</w:t>
-      </w:r>
-      <w:proofErr w:type="spellEnd"/>
-      <w:r>
-        <w:rPr>
-          <w:sz w:val="24"/>
-          <w:szCs w:val="24"/>
-        </w:rPr>
-        <w:t>(datetime) – Timestamp of when the request was made</w:t>
+      <w:r>
+        <w:rPr>
+          <w:sz w:val="24"/>
+          <w:szCs w:val="24"/>
+        </w:rPr>
+        <w:t>request_date(datetime) – Timestamp of when the request was made</w:t>
       </w:r>
     </w:p>
     <w:p>
@@ -3756,21 +3666,12 @@
           <w:szCs w:val="24"/>
         </w:rPr>
       </w:pPr>
-      <w:proofErr w:type="spellStart"/>
-      <w:r>
-        <w:rPr>
-          <w:sz w:val="24"/>
-          <w:szCs w:val="24"/>
-        </w:rPr>
-        <w:t>Assetra</w:t>
-      </w:r>
-      <w:proofErr w:type="spellEnd"/>
-      <w:r>
-        <w:rPr>
-          <w:sz w:val="24"/>
-          <w:szCs w:val="24"/>
-        </w:rPr>
-        <w:t xml:space="preserve"> </w:t>
+      <w:r>
+        <w:rPr>
+          <w:sz w:val="24"/>
+          <w:szCs w:val="24"/>
+        </w:rPr>
+        <w:t xml:space="preserve">Assetra </w:t>
       </w:r>
       <w:r>
         <w:rPr>
@@ -4002,23 +3903,7 @@
           <w:szCs w:val="24"/>
         </w:rPr>
         <w:lastRenderedPageBreak/>
-        <w:t xml:space="preserve">There would have been a User and Group model here also however Django already has that built in the auth system, so I did not need to make this myself. Each new request has a date stamp with </w:t>
-      </w:r>
-      <w:proofErr w:type="spellStart"/>
-      <w:r>
-        <w:rPr>
-          <w:sz w:val="24"/>
-          <w:szCs w:val="24"/>
-        </w:rPr>
-        <w:t>auto_now_add</w:t>
-      </w:r>
-      <w:proofErr w:type="spellEnd"/>
-      <w:r>
-        <w:rPr>
-          <w:sz w:val="24"/>
-          <w:szCs w:val="24"/>
-        </w:rPr>
-        <w:t>=True and automatically defaults to a ‘PENDING’ status.</w:t>
+        <w:t>There would have been a User and Group model here also however Django already has that built in the auth system, so I did not need to make this myself. Each new request has a date stamp with auto_now_add=True and automatically defaults to a ‘PENDING’ status.</w:t>
       </w:r>
     </w:p>
     <w:p/>
@@ -4206,39 +4091,7 @@
           <w:sz w:val="24"/>
           <w:szCs w:val="24"/>
         </w:rPr>
-        <w:t xml:space="preserve">Fort the managers create/edit views, I used Django’s </w:t>
-      </w:r>
-      <w:proofErr w:type="spellStart"/>
-      <w:r>
-        <w:rPr>
-          <w:sz w:val="24"/>
-          <w:szCs w:val="24"/>
-        </w:rPr>
-        <w:t>ModelForm</w:t>
-      </w:r>
-      <w:proofErr w:type="spellEnd"/>
-      <w:r>
-        <w:rPr>
-          <w:sz w:val="24"/>
-          <w:szCs w:val="24"/>
-        </w:rPr>
-        <w:t xml:space="preserve"> class which is defined in inventory/forms.py. A </w:t>
-      </w:r>
-      <w:proofErr w:type="spellStart"/>
-      <w:r>
-        <w:rPr>
-          <w:sz w:val="24"/>
-          <w:szCs w:val="24"/>
-        </w:rPr>
-        <w:t>ModelForm</w:t>
-      </w:r>
-      <w:proofErr w:type="spellEnd"/>
-      <w:r>
-        <w:rPr>
-          <w:sz w:val="24"/>
-          <w:szCs w:val="24"/>
-        </w:rPr>
-        <w:t xml:space="preserve"> allowed me to easily </w:t>
+        <w:t xml:space="preserve">Fort the managers create/edit views, I used Django’s ModelForm class which is defined in inventory/forms.py. A ModelForm allowed me to easily </w:t>
       </w:r>
       <w:r>
         <w:rPr>
@@ -4714,23 +4567,7 @@
           <w:sz w:val="24"/>
           <w:szCs w:val="24"/>
         </w:rPr>
-        <w:t xml:space="preserve">Automated testing in </w:t>
-      </w:r>
-      <w:proofErr w:type="spellStart"/>
-      <w:r>
-        <w:rPr>
-          <w:sz w:val="24"/>
-          <w:szCs w:val="24"/>
-        </w:rPr>
-        <w:t>Assetra</w:t>
-      </w:r>
-      <w:proofErr w:type="spellEnd"/>
-      <w:r>
-        <w:rPr>
-          <w:sz w:val="24"/>
-          <w:szCs w:val="24"/>
-        </w:rPr>
-        <w:t xml:space="preserve"> is implemented in inventory/tests.py using Django’s built in test framework. The testing strategy covers all three types of test types required for the project; unit tests, integration tests, and use case tests. </w:t>
+        <w:t xml:space="preserve">Automated testing in Assetra is implemented in inventory/tests.py using Django’s built in test framework. The testing strategy covers all three types of test types required for the project; unit tests, integration tests, and use case tests. </w:t>
       </w:r>
     </w:p>
     <w:p>
@@ -4782,7 +4619,6 @@
           <w:szCs w:val="24"/>
         </w:rPr>
       </w:pPr>
-      <w:proofErr w:type="spellStart"/>
       <w:r>
         <w:rPr>
           <w:sz w:val="24"/>
@@ -4809,15 +4645,7 @@
           <w:sz w:val="24"/>
           <w:szCs w:val="24"/>
         </w:rPr>
-        <w:t>ity_can_be_updated</w:t>
-      </w:r>
-      <w:proofErr w:type="spellEnd"/>
-      <w:r>
-        <w:rPr>
-          <w:sz w:val="24"/>
-          <w:szCs w:val="24"/>
-        </w:rPr>
-        <w:t xml:space="preserve"> </w:t>
+        <w:t xml:space="preserve">ity_can_be_updated </w:t>
       </w:r>
       <w:r>
         <w:rPr>
@@ -4834,7 +4662,6 @@
           <w:szCs w:val="24"/>
         </w:rPr>
       </w:pPr>
-      <w:proofErr w:type="spellStart"/>
       <w:r>
         <w:rPr>
           <w:sz w:val="24"/>
@@ -4849,7 +4676,6 @@
         </w:rPr>
         <w:t>est_user_assigned_to_correct_group</w:t>
       </w:r>
-      <w:proofErr w:type="spellEnd"/>
       <w:r>
         <w:rPr>
           <w:sz w:val="24"/>
@@ -4882,16 +4708,8 @@
           <w:szCs w:val="24"/>
         </w:rPr>
         <w:br/>
-      </w:r>
-      <w:proofErr w:type="spellStart"/>
-      <w:r>
-        <w:rPr>
-          <w:sz w:val="24"/>
-          <w:szCs w:val="24"/>
-        </w:rPr>
         <w:t>test_item_list_is_visible</w:t>
       </w:r>
-      <w:proofErr w:type="spellEnd"/>
       <w:r>
         <w:rPr>
           <w:sz w:val="24"/>
@@ -4907,7 +4725,6 @@
           <w:szCs w:val="24"/>
         </w:rPr>
       </w:pPr>
-      <w:proofErr w:type="spellStart"/>
       <w:r>
         <w:rPr>
           <w:sz w:val="24"/>
@@ -4922,7 +4739,6 @@
         </w:rPr>
         <w:t>est_student_cannot_access_manage_request</w:t>
       </w:r>
-      <w:proofErr w:type="spellEnd"/>
       <w:r>
         <w:rPr>
           <w:sz w:val="24"/>
@@ -4938,7 +4754,6 @@
           <w:szCs w:val="24"/>
         </w:rPr>
       </w:pPr>
-      <w:proofErr w:type="spellStart"/>
       <w:r>
         <w:rPr>
           <w:sz w:val="24"/>
@@ -4953,7 +4768,6 @@
         </w:rPr>
         <w:t>est_login_required_to_make_request</w:t>
       </w:r>
-      <w:proofErr w:type="spellEnd"/>
       <w:r>
         <w:rPr>
           <w:sz w:val="24"/>
@@ -4990,7 +4804,6 @@
           <w:szCs w:val="24"/>
         </w:rPr>
       </w:pPr>
-      <w:proofErr w:type="spellStart"/>
       <w:r>
         <w:rPr>
           <w:sz w:val="24"/>
@@ -5005,7 +4818,6 @@
         </w:rPr>
         <w:t>est_student_can_request_item</w:t>
       </w:r>
-      <w:proofErr w:type="spellEnd"/>
       <w:r>
         <w:rPr>
           <w:sz w:val="24"/>
@@ -5021,7 +4833,6 @@
           <w:szCs w:val="24"/>
         </w:rPr>
       </w:pPr>
-      <w:proofErr w:type="spellStart"/>
       <w:r>
         <w:rPr>
           <w:sz w:val="24"/>
@@ -5036,7 +4847,6 @@
         </w:rPr>
         <w:t>est_staff_can_approve_request</w:t>
       </w:r>
-      <w:proofErr w:type="spellEnd"/>
       <w:r>
         <w:rPr>
           <w:sz w:val="24"/>
@@ -5220,39 +5030,7 @@
           <w:sz w:val="24"/>
           <w:szCs w:val="24"/>
         </w:rPr>
-        <w:t>The project also implements Continuous Integration (CI) using GitHub Actions. This workflow is done in .</w:t>
-      </w:r>
-      <w:proofErr w:type="spellStart"/>
-      <w:r>
-        <w:rPr>
-          <w:sz w:val="24"/>
-          <w:szCs w:val="24"/>
-        </w:rPr>
-        <w:t>github</w:t>
-      </w:r>
-      <w:proofErr w:type="spellEnd"/>
-      <w:r>
-        <w:rPr>
-          <w:sz w:val="24"/>
-          <w:szCs w:val="24"/>
-        </w:rPr>
-        <w:t>/workflows/</w:t>
-      </w:r>
-      <w:proofErr w:type="spellStart"/>
-      <w:r>
-        <w:rPr>
-          <w:sz w:val="24"/>
-          <w:szCs w:val="24"/>
-        </w:rPr>
-        <w:t>django.yml</w:t>
-      </w:r>
-      <w:proofErr w:type="spellEnd"/>
-      <w:r>
-        <w:rPr>
-          <w:sz w:val="24"/>
-          <w:szCs w:val="24"/>
-        </w:rPr>
-        <w:t xml:space="preserve"> and is triggered automatically every time there is a push to the main branch.</w:t>
+        <w:t>The project also implements Continuous Integration (CI) using GitHub Actions. This workflow is done in .github/workflows/django.yml and is triggered automatically every time there is a push to the main branch.</w:t>
       </w:r>
       <w:r>
         <w:rPr>
@@ -5630,17 +5408,8 @@
           <w:sz w:val="24"/>
           <w:szCs w:val="24"/>
         </w:rPr>
-        <w:t xml:space="preserve">Django </w:t>
-      </w:r>
-      <w:proofErr w:type="spellStart"/>
-      <w:r>
-        <w:rPr>
-          <w:sz w:val="24"/>
-          <w:szCs w:val="24"/>
-        </w:rPr>
-        <w:t>ModelForm</w:t>
-      </w:r>
-      <w:proofErr w:type="spellEnd"/>
+        <w:t>Django ModelForm</w:t>
+      </w:r>
     </w:p>
     <w:p>
       <w:pPr>
@@ -5674,17 +5443,8 @@
           <w:sz w:val="24"/>
           <w:szCs w:val="24"/>
         </w:rPr>
-        <w:t xml:space="preserve">Django </w:t>
-      </w:r>
-      <w:proofErr w:type="spellStart"/>
-      <w:r>
-        <w:rPr>
-          <w:sz w:val="24"/>
-          <w:szCs w:val="24"/>
-        </w:rPr>
-        <w:t>auto_now_add</w:t>
-      </w:r>
-      <w:proofErr w:type="spellEnd"/>
+        <w:t>Django auto_now_add</w:t>
+      </w:r>
     </w:p>
     <w:p>
       <w:pPr>
@@ -5914,21 +5674,12 @@
           <w:szCs w:val="24"/>
         </w:rPr>
       </w:pPr>
-      <w:proofErr w:type="spellStart"/>
-      <w:r>
-        <w:rPr>
-          <w:sz w:val="24"/>
-          <w:szCs w:val="24"/>
-        </w:rPr>
-        <w:t>Gunicorn</w:t>
-      </w:r>
-      <w:proofErr w:type="spellEnd"/>
-      <w:r>
-        <w:rPr>
-          <w:sz w:val="24"/>
-          <w:szCs w:val="24"/>
-        </w:rPr>
-        <w:t xml:space="preserve"> Installation</w:t>
+      <w:r>
+        <w:rPr>
+          <w:sz w:val="24"/>
+          <w:szCs w:val="24"/>
+        </w:rPr>
+        <w:t>Gunicorn Installation</w:t>
       </w:r>
     </w:p>
     <w:p>
@@ -6104,30 +5855,14 @@
           <w:sz w:val="24"/>
           <w:szCs w:val="24"/>
         </w:rPr>
-        <w:t xml:space="preserve">Railway Deployment </w:t>
-      </w:r>
-      <w:proofErr w:type="spellStart"/>
-      <w:r>
-        <w:rPr>
-          <w:sz w:val="24"/>
-          <w:szCs w:val="24"/>
-        </w:rPr>
-        <w:t>Documents</w:t>
-      </w:r>
-      <w:r>
-        <w:rPr>
-          <w:sz w:val="24"/>
-          <w:szCs w:val="24"/>
-        </w:rPr>
-        <w:t>&amp;automated</w:t>
-      </w:r>
-      <w:proofErr w:type="spellEnd"/>
-      <w:r>
-        <w:rPr>
-          <w:sz w:val="24"/>
-          <w:szCs w:val="24"/>
-        </w:rPr>
-        <w:t xml:space="preserve"> deployment</w:t>
+        <w:t>Railway Deployment Documents</w:t>
+      </w:r>
+      <w:r>
+        <w:rPr>
+          <w:sz w:val="24"/>
+          <w:szCs w:val="24"/>
+        </w:rPr>
+        <w:t>&amp;automated deployment</w:t>
       </w:r>
       <w:r>
         <w:rPr>
@@ -6192,6 +5927,27 @@
           <w:szCs w:val="24"/>
         </w:rPr>
       </w:pPr>
+      <w:r>
+        <w:rPr>
+          <w:sz w:val="24"/>
+          <w:szCs w:val="24"/>
+        </w:rPr>
+        <w:t xml:space="preserve">Advanced Feature – </w:t>
+      </w:r>
+      <w:r>
+        <w:rPr>
+          <w:sz w:val="24"/>
+          <w:szCs w:val="24"/>
+        </w:rPr>
+        <w:t xml:space="preserve">Exporting </w:t>
+      </w:r>
+      <w:r>
+        <w:rPr>
+          <w:sz w:val="24"/>
+          <w:szCs w:val="24"/>
+        </w:rPr>
+        <w:t>Data as CSV</w:t>
+      </w:r>
     </w:p>
     <w:p>
       <w:pPr>
@@ -6204,6 +5960,16 @@
           <w:szCs w:val="24"/>
         </w:rPr>
       </w:pPr>
+      <w:hyperlink r:id="rId44" w:history="1">
+        <w:r>
+          <w:rPr>
+            <w:rStyle w:val="Hyperlink"/>
+            <w:sz w:val="24"/>
+            <w:szCs w:val="24"/>
+          </w:rPr>
+          <w:t>https://docs.djangoproject.com/en/5.0/howto/outputting-csv/</w:t>
+        </w:r>
+      </w:hyperlink>
     </w:p>
     <w:p>
       <w:pPr>
@@ -6267,6 +6033,9 @@
     </w:p>
     <w:p>
       <w:pPr>
+        <w:tabs>
+          <w:tab w:val="left" w:pos="6645"/>
+        </w:tabs>
         <w:jc w:val="both"/>
         <w:rPr>
           <w:sz w:val="24"/>
@@ -6276,6 +6045,9 @@
     </w:p>
     <w:p>
       <w:pPr>
+        <w:tabs>
+          <w:tab w:val="left" w:pos="6645"/>
+        </w:tabs>
         <w:jc w:val="both"/>
         <w:rPr>
           <w:sz w:val="24"/>
@@ -6285,6 +6057,9 @@
     </w:p>
     <w:p>
       <w:pPr>
+        <w:tabs>
+          <w:tab w:val="left" w:pos="6645"/>
+        </w:tabs>
         <w:jc w:val="both"/>
         <w:rPr>
           <w:sz w:val="24"/>
@@ -6328,8 +6103,35 @@
         </w:rPr>
       </w:pPr>
     </w:p>
+    <w:p>
+      <w:pPr>
+        <w:jc w:val="both"/>
+        <w:rPr>
+          <w:sz w:val="24"/>
+          <w:szCs w:val="24"/>
+        </w:rPr>
+      </w:pPr>
+    </w:p>
+    <w:p>
+      <w:pPr>
+        <w:jc w:val="both"/>
+        <w:rPr>
+          <w:sz w:val="24"/>
+          <w:szCs w:val="24"/>
+        </w:rPr>
+      </w:pPr>
+    </w:p>
+    <w:p>
+      <w:pPr>
+        <w:jc w:val="both"/>
+        <w:rPr>
+          <w:sz w:val="24"/>
+          <w:szCs w:val="24"/>
+        </w:rPr>
+      </w:pPr>
+    </w:p>
     <w:sectPr>
-      <w:headerReference w:type="default" r:id="rId44"/>
+      <w:headerReference w:type="default" r:id="rId45"/>
       <w:pgSz w:w="12240" w:h="15840"/>
       <w:pgMar w:top="1440" w:right="1800" w:bottom="1440" w:left="1800" w:header="720" w:footer="720" w:gutter="0"/>
       <w:cols w:space="720"/>

</xml_diff>

<commit_message>
final changes to report and data.json
</commit_message>
<xml_diff>
--- a/ReportTemplateSample.docx
+++ b/ReportTemplateSample.docx
@@ -505,6 +505,14 @@
     </w:p>
     <w:sdt>
       <w:sdtPr>
+        <w:rPr>
+          <w:rFonts w:asciiTheme="minorHAnsi" w:eastAsiaTheme="minorEastAsia" w:hAnsiTheme="minorHAnsi" w:cstheme="minorBidi"/>
+          <w:b w:val="0"/>
+          <w:bCs w:val="0"/>
+          <w:color w:val="auto"/>
+          <w:sz w:val="22"/>
+          <w:szCs w:val="22"/>
+        </w:rPr>
         <w:id w:val="1402954278"/>
         <w:docPartObj>
           <w:docPartGallery w:val="Table of Contents"/>
@@ -513,11 +521,7 @@
       </w:sdtPr>
       <w:sdtEndPr>
         <w:rPr>
-          <w:rFonts w:asciiTheme="minorHAnsi" w:eastAsiaTheme="minorEastAsia" w:hAnsiTheme="minorHAnsi" w:cstheme="minorBidi"/>
           <w:noProof/>
-          <w:color w:val="auto"/>
-          <w:sz w:val="22"/>
-          <w:szCs w:val="22"/>
         </w:rPr>
       </w:sdtEndPr>
       <w:sdtContent>
@@ -1017,7 +1021,7 @@
                 <w:noProof/>
                 <w:webHidden/>
               </w:rPr>
-              <w:t>3</w:t>
+              <w:t>4</w:t>
             </w:r>
             <w:r>
               <w:rPr>
@@ -1181,7 +1185,7 @@
                 <w:noProof/>
                 <w:webHidden/>
               </w:rPr>
-              <w:t>7</w:t>
+              <w:t>8</w:t>
             </w:r>
             <w:r>
               <w:rPr>
@@ -1263,7 +1267,7 @@
                 <w:noProof/>
                 <w:webHidden/>
               </w:rPr>
-              <w:t>8</w:t>
+              <w:t>10</w:t>
             </w:r>
             <w:r>
               <w:rPr>
@@ -1345,7 +1349,7 @@
                 <w:noProof/>
                 <w:webHidden/>
               </w:rPr>
-              <w:t>13</w:t>
+              <w:t>15</w:t>
             </w:r>
             <w:r>
               <w:rPr>
@@ -1427,7 +1431,7 @@
                 <w:noProof/>
                 <w:webHidden/>
               </w:rPr>
-              <w:t>14</w:t>
+              <w:t>18</w:t>
             </w:r>
             <w:r>
               <w:rPr>
@@ -2276,23 +2280,7 @@
           <w:sz w:val="24"/>
           <w:szCs w:val="24"/>
         </w:rPr>
-        <w:t>The request status is ‘APPROVED</w:t>
-      </w:r>
-      <w:proofErr w:type="gramStart"/>
-      <w:r>
-        <w:rPr>
-          <w:sz w:val="24"/>
-          <w:szCs w:val="24"/>
-        </w:rPr>
-        <w:t>’</w:t>
-      </w:r>
-      <w:proofErr w:type="gramEnd"/>
-      <w:r>
-        <w:rPr>
-          <w:sz w:val="24"/>
-          <w:szCs w:val="24"/>
-        </w:rPr>
-        <w:t xml:space="preserve"> and the user is the requester. The items stock quantity is incremented by one and the request status is ‘RETURNED’.</w:t>
+        <w:t>The request status is ‘APPROVED’ and the user is the requester. The items stock quantity is incremented by one and the request status is ‘RETURNED’.</w:t>
       </w:r>
     </w:p>
     <w:p>
@@ -3106,14 +3094,7 @@
           <w:sz w:val="24"/>
           <w:szCs w:val="24"/>
         </w:rPr>
-        <w:t>: Category, Item, Request, User, and Group</w:t>
-      </w:r>
-      <w:r>
-        <w:rPr>
-          <w:sz w:val="24"/>
-          <w:szCs w:val="24"/>
-        </w:rPr>
-        <w:t>.</w:t>
+        <w:t>: Category, Item, Request, User, and Group.</w:t>
       </w:r>
     </w:p>
     <w:p>
@@ -3175,8 +3156,8 @@
         <w:rPr>
           <w:b/>
           <w:bCs/>
-          <w:sz w:val="24"/>
-          <w:szCs w:val="24"/>
+          <w:sz w:val="32"/>
+          <w:szCs w:val="32"/>
           <w:u w:val="single"/>
         </w:rPr>
       </w:pPr>
@@ -3184,8 +3165,8 @@
         <w:rPr>
           <w:b/>
           <w:bCs/>
-          <w:sz w:val="24"/>
-          <w:szCs w:val="24"/>
+          <w:sz w:val="32"/>
+          <w:szCs w:val="32"/>
           <w:u w:val="single"/>
         </w:rPr>
         <w:lastRenderedPageBreak/>
@@ -3207,14 +3188,20 @@
         <w:spacing w:after="0" w:line="240" w:lineRule="auto"/>
         <w:jc w:val="both"/>
         <w:rPr>
-          <w:sz w:val="24"/>
-          <w:szCs w:val="24"/>
-        </w:rPr>
-      </w:pPr>
-      <w:r>
-        <w:rPr>
-          <w:sz w:val="24"/>
-          <w:szCs w:val="24"/>
+          <w:b/>
+          <w:bCs/>
+          <w:sz w:val="24"/>
+          <w:szCs w:val="24"/>
+          <w:u w:val="single"/>
+        </w:rPr>
+      </w:pPr>
+      <w:r>
+        <w:rPr>
+          <w:b/>
+          <w:bCs/>
+          <w:sz w:val="24"/>
+          <w:szCs w:val="24"/>
+          <w:u w:val="single"/>
         </w:rPr>
         <w:t>Category</w:t>
       </w:r>
@@ -3228,21 +3215,12 @@
           <w:szCs w:val="24"/>
         </w:rPr>
       </w:pPr>
-      <w:proofErr w:type="gramStart"/>
-      <w:r>
-        <w:rPr>
-          <w:sz w:val="24"/>
-          <w:szCs w:val="24"/>
-        </w:rPr>
-        <w:t>id(</w:t>
-      </w:r>
-      <w:proofErr w:type="gramEnd"/>
-      <w:r>
-        <w:rPr>
-          <w:sz w:val="24"/>
-          <w:szCs w:val="24"/>
-        </w:rPr>
-        <w:t>PK) - Primary key for each individual category</w:t>
+      <w:r>
+        <w:rPr>
+          <w:sz w:val="24"/>
+          <w:szCs w:val="24"/>
+        </w:rPr>
+        <w:t>id(PK) - Primary key for each individual category</w:t>
       </w:r>
     </w:p>
     <w:p>
@@ -3294,14 +3272,20 @@
         <w:spacing w:after="0" w:line="240" w:lineRule="auto"/>
         <w:jc w:val="both"/>
         <w:rPr>
-          <w:sz w:val="24"/>
-          <w:szCs w:val="24"/>
-        </w:rPr>
-      </w:pPr>
-      <w:r>
-        <w:rPr>
-          <w:sz w:val="24"/>
-          <w:szCs w:val="24"/>
+          <w:b/>
+          <w:bCs/>
+          <w:sz w:val="24"/>
+          <w:szCs w:val="24"/>
+          <w:u w:val="single"/>
+        </w:rPr>
+      </w:pPr>
+      <w:r>
+        <w:rPr>
+          <w:b/>
+          <w:bCs/>
+          <w:sz w:val="24"/>
+          <w:szCs w:val="24"/>
+          <w:u w:val="single"/>
         </w:rPr>
         <w:t>Item</w:t>
       </w:r>
@@ -3315,21 +3299,12 @@
           <w:szCs w:val="24"/>
         </w:rPr>
       </w:pPr>
-      <w:proofErr w:type="gramStart"/>
-      <w:r>
-        <w:rPr>
-          <w:sz w:val="24"/>
-          <w:szCs w:val="24"/>
-        </w:rPr>
-        <w:t>id(</w:t>
-      </w:r>
-      <w:proofErr w:type="gramEnd"/>
-      <w:r>
-        <w:rPr>
-          <w:sz w:val="24"/>
-          <w:szCs w:val="24"/>
-        </w:rPr>
-        <w:t>PK) – Unique primary key for each individual category</w:t>
+      <w:r>
+        <w:rPr>
+          <w:sz w:val="24"/>
+          <w:szCs w:val="24"/>
+        </w:rPr>
+        <w:t>id(PK) – Unique primary key for each individual category</w:t>
       </w:r>
     </w:p>
     <w:p>
@@ -3398,15 +3373,7 @@
           <w:sz w:val="24"/>
           <w:szCs w:val="24"/>
         </w:rPr>
-        <w:t>category_</w:t>
-      </w:r>
-      <w:proofErr w:type="gramStart"/>
-      <w:r>
-        <w:rPr>
-          <w:sz w:val="24"/>
-          <w:szCs w:val="24"/>
-        </w:rPr>
-        <w:t>id</w:t>
+        <w:t>category_id</w:t>
       </w:r>
       <w:proofErr w:type="spellEnd"/>
       <w:r>
@@ -3414,15 +3381,7 @@
           <w:sz w:val="24"/>
           <w:szCs w:val="24"/>
         </w:rPr>
-        <w:t>(</w:t>
-      </w:r>
-      <w:proofErr w:type="gramEnd"/>
-      <w:r>
-        <w:rPr>
-          <w:sz w:val="24"/>
-          <w:szCs w:val="24"/>
-        </w:rPr>
-        <w:t>FK – Category) – The category the item belongs to</w:t>
+        <w:t>(FK – Category) – The category the item belongs to</w:t>
       </w:r>
     </w:p>
     <w:p>
@@ -3440,14 +3399,20 @@
         <w:spacing w:after="0" w:line="240" w:lineRule="auto"/>
         <w:jc w:val="both"/>
         <w:rPr>
-          <w:sz w:val="24"/>
-          <w:szCs w:val="24"/>
-        </w:rPr>
-      </w:pPr>
-      <w:r>
-        <w:rPr>
-          <w:sz w:val="24"/>
-          <w:szCs w:val="24"/>
+          <w:b/>
+          <w:bCs/>
+          <w:sz w:val="24"/>
+          <w:szCs w:val="24"/>
+          <w:u w:val="single"/>
+        </w:rPr>
+      </w:pPr>
+      <w:r>
+        <w:rPr>
+          <w:b/>
+          <w:bCs/>
+          <w:sz w:val="24"/>
+          <w:szCs w:val="24"/>
+          <w:u w:val="single"/>
         </w:rPr>
         <w:t>Request</w:t>
       </w:r>
@@ -3461,21 +3426,12 @@
           <w:szCs w:val="24"/>
         </w:rPr>
       </w:pPr>
-      <w:proofErr w:type="gramStart"/>
-      <w:r>
-        <w:rPr>
-          <w:sz w:val="24"/>
-          <w:szCs w:val="24"/>
-        </w:rPr>
-        <w:t>id(</w:t>
-      </w:r>
-      <w:proofErr w:type="gramEnd"/>
-      <w:r>
-        <w:rPr>
-          <w:sz w:val="24"/>
-          <w:szCs w:val="24"/>
-        </w:rPr>
-        <w:t>PK) – Primary key for each request</w:t>
+      <w:r>
+        <w:rPr>
+          <w:sz w:val="24"/>
+          <w:szCs w:val="24"/>
+        </w:rPr>
+        <w:t>id(PK) – Primary key for each request</w:t>
       </w:r>
     </w:p>
     <w:p>
@@ -3493,15 +3449,7 @@
           <w:sz w:val="24"/>
           <w:szCs w:val="24"/>
         </w:rPr>
-        <w:t>user_</w:t>
-      </w:r>
-      <w:proofErr w:type="gramStart"/>
-      <w:r>
-        <w:rPr>
-          <w:sz w:val="24"/>
-          <w:szCs w:val="24"/>
-        </w:rPr>
-        <w:t>id</w:t>
+        <w:t>user_id</w:t>
       </w:r>
       <w:proofErr w:type="spellEnd"/>
       <w:r>
@@ -3509,15 +3457,7 @@
           <w:sz w:val="24"/>
           <w:szCs w:val="24"/>
         </w:rPr>
-        <w:t>(</w:t>
-      </w:r>
-      <w:proofErr w:type="gramEnd"/>
-      <w:r>
-        <w:rPr>
-          <w:sz w:val="24"/>
-          <w:szCs w:val="24"/>
-        </w:rPr>
-        <w:t>FK – User) – The student who made the request</w:t>
+        <w:t>(FK – User) – The student who made the request</w:t>
       </w:r>
     </w:p>
     <w:p>
@@ -3535,15 +3475,7 @@
           <w:sz w:val="24"/>
           <w:szCs w:val="24"/>
         </w:rPr>
-        <w:t>item_</w:t>
-      </w:r>
-      <w:proofErr w:type="gramStart"/>
-      <w:r>
-        <w:rPr>
-          <w:sz w:val="24"/>
-          <w:szCs w:val="24"/>
-        </w:rPr>
-        <w:t>id</w:t>
+        <w:t>item_id</w:t>
       </w:r>
       <w:proofErr w:type="spellEnd"/>
       <w:r>
@@ -3551,15 +3483,7 @@
           <w:sz w:val="24"/>
           <w:szCs w:val="24"/>
         </w:rPr>
-        <w:t>(</w:t>
-      </w:r>
-      <w:proofErr w:type="gramEnd"/>
-      <w:r>
-        <w:rPr>
-          <w:sz w:val="24"/>
-          <w:szCs w:val="24"/>
-        </w:rPr>
-        <w:t>FK – Item) – The item being requested</w:t>
+        <w:t>(FK – Item) – The item being requested</w:t>
       </w:r>
     </w:p>
     <w:p>
@@ -3620,14 +3544,20 @@
         <w:spacing w:after="0" w:line="240" w:lineRule="auto"/>
         <w:jc w:val="both"/>
         <w:rPr>
-          <w:sz w:val="24"/>
-          <w:szCs w:val="24"/>
-        </w:rPr>
-      </w:pPr>
-      <w:r>
-        <w:rPr>
-          <w:sz w:val="24"/>
-          <w:szCs w:val="24"/>
+          <w:b/>
+          <w:bCs/>
+          <w:sz w:val="24"/>
+          <w:szCs w:val="24"/>
+          <w:u w:val="single"/>
+        </w:rPr>
+      </w:pPr>
+      <w:r>
+        <w:rPr>
+          <w:b/>
+          <w:bCs/>
+          <w:sz w:val="24"/>
+          <w:szCs w:val="24"/>
+          <w:u w:val="single"/>
         </w:rPr>
         <w:t>User and Group (Django Admin)</w:t>
       </w:r>
@@ -3693,8 +3623,8 @@
         <w:rPr>
           <w:b/>
           <w:bCs/>
-          <w:sz w:val="24"/>
-          <w:szCs w:val="24"/>
+          <w:sz w:val="32"/>
+          <w:szCs w:val="32"/>
           <w:u w:val="single"/>
         </w:rPr>
       </w:pPr>
@@ -3702,8 +3632,8 @@
         <w:rPr>
           <w:b/>
           <w:bCs/>
-          <w:sz w:val="24"/>
-          <w:szCs w:val="24"/>
+          <w:sz w:val="32"/>
+          <w:szCs w:val="32"/>
           <w:u w:val="single"/>
         </w:rPr>
         <w:t>Relationship</w:t>
@@ -3712,8 +3642,8 @@
         <w:rPr>
           <w:b/>
           <w:bCs/>
-          <w:sz w:val="24"/>
-          <w:szCs w:val="24"/>
+          <w:sz w:val="32"/>
+          <w:szCs w:val="32"/>
           <w:u w:val="single"/>
         </w:rPr>
         <w:t>s</w:t>
@@ -3816,18 +3746,34 @@
         <w:spacing w:after="0" w:line="240" w:lineRule="auto"/>
         <w:jc w:val="both"/>
         <w:rPr>
-          <w:sz w:val="24"/>
-          <w:szCs w:val="24"/>
-        </w:rPr>
-      </w:pPr>
+          <w:b/>
+          <w:bCs/>
+          <w:sz w:val="40"/>
+          <w:szCs w:val="40"/>
+          <w:u w:val="single"/>
+        </w:rPr>
+      </w:pPr>
+      <w:r>
+        <w:rPr>
+          <w:b/>
+          <w:bCs/>
+          <w:sz w:val="40"/>
+          <w:szCs w:val="40"/>
+          <w:u w:val="single"/>
+        </w:rPr>
+        <w:t>Database Fixtures</w:t>
+      </w:r>
     </w:p>
     <w:p>
       <w:pPr>
         <w:spacing w:after="0" w:line="240" w:lineRule="auto"/>
         <w:jc w:val="both"/>
         <w:rPr>
-          <w:sz w:val="24"/>
-          <w:szCs w:val="24"/>
+          <w:b/>
+          <w:bCs/>
+          <w:sz w:val="40"/>
+          <w:szCs w:val="40"/>
+          <w:u w:val="single"/>
         </w:rPr>
       </w:pPr>
     </w:p>
@@ -3840,36 +3786,108 @@
           <w:szCs w:val="24"/>
         </w:rPr>
       </w:pPr>
-    </w:p>
-    <w:p>
-      <w:pPr>
-        <w:spacing w:after="0" w:line="240" w:lineRule="auto"/>
-        <w:jc w:val="both"/>
-        <w:rPr>
-          <w:sz w:val="24"/>
-          <w:szCs w:val="24"/>
-        </w:rPr>
-      </w:pPr>
-    </w:p>
-    <w:p>
-      <w:pPr>
-        <w:spacing w:after="0" w:line="240" w:lineRule="auto"/>
-        <w:jc w:val="both"/>
-        <w:rPr>
-          <w:sz w:val="24"/>
-          <w:szCs w:val="24"/>
-        </w:rPr>
-      </w:pPr>
-    </w:p>
-    <w:p>
-      <w:pPr>
-        <w:spacing w:after="0" w:line="240" w:lineRule="auto"/>
-        <w:jc w:val="both"/>
-        <w:rPr>
-          <w:sz w:val="24"/>
-          <w:szCs w:val="24"/>
-        </w:rPr>
-      </w:pPr>
+      <w:r>
+        <w:rPr>
+          <w:sz w:val="24"/>
+          <w:szCs w:val="24"/>
+        </w:rPr>
+        <w:t>To ensure the database is always populated with consistent data on each fresh deployment, a fixture file (</w:t>
+      </w:r>
+      <w:proofErr w:type="spellStart"/>
+      <w:r>
+        <w:rPr>
+          <w:sz w:val="24"/>
+          <w:szCs w:val="24"/>
+        </w:rPr>
+        <w:t>data.json</w:t>
+      </w:r>
+      <w:proofErr w:type="spellEnd"/>
+      <w:r>
+        <w:rPr>
+          <w:sz w:val="24"/>
+          <w:szCs w:val="24"/>
+        </w:rPr>
+        <w:t xml:space="preserve">) is made in the project root. The fixture contains data for every entity in the system, which includes 5 Categories, 12 Items spread through these categories, 7 Requests in different lifecycles (Pending, Approved, Rejected, Returned), and 6 Users assigned to 4 different Groups (Admin, Staff, Manager, Student, with an additional basic User). The fixture is loaded on every </w:t>
+      </w:r>
+      <w:r>
+        <w:rPr>
+          <w:sz w:val="24"/>
+          <w:szCs w:val="24"/>
+        </w:rPr>
+        <w:lastRenderedPageBreak/>
+        <w:t xml:space="preserve">Railway </w:t>
+      </w:r>
+      <w:proofErr w:type="spellStart"/>
+      <w:r>
+        <w:rPr>
+          <w:sz w:val="24"/>
+          <w:szCs w:val="24"/>
+        </w:rPr>
+        <w:t>deploymrny</w:t>
+      </w:r>
+      <w:proofErr w:type="spellEnd"/>
+      <w:r>
+        <w:rPr>
+          <w:sz w:val="24"/>
+          <w:szCs w:val="24"/>
+        </w:rPr>
+        <w:t xml:space="preserve"> via a </w:t>
+      </w:r>
+      <w:proofErr w:type="spellStart"/>
+      <w:r>
+        <w:rPr>
+          <w:sz w:val="24"/>
+          <w:szCs w:val="24"/>
+        </w:rPr>
+        <w:t>Procfile</w:t>
+      </w:r>
+      <w:proofErr w:type="spellEnd"/>
+      <w:r>
+        <w:rPr>
+          <w:sz w:val="24"/>
+          <w:szCs w:val="24"/>
+        </w:rPr>
+        <w:t xml:space="preserve">, which runs python manage.py </w:t>
+      </w:r>
+      <w:proofErr w:type="spellStart"/>
+      <w:r>
+        <w:rPr>
+          <w:sz w:val="24"/>
+          <w:szCs w:val="24"/>
+        </w:rPr>
+        <w:t>loaddata</w:t>
+      </w:r>
+      <w:proofErr w:type="spellEnd"/>
+      <w:r>
+        <w:rPr>
+          <w:sz w:val="24"/>
+          <w:szCs w:val="24"/>
+        </w:rPr>
+        <w:t xml:space="preserve"> </w:t>
+      </w:r>
+      <w:proofErr w:type="spellStart"/>
+      <w:r>
+        <w:rPr>
+          <w:sz w:val="24"/>
+          <w:szCs w:val="24"/>
+        </w:rPr>
+        <w:t>data.json</w:t>
+      </w:r>
+      <w:proofErr w:type="spellEnd"/>
+      <w:r>
+        <w:rPr>
+          <w:sz w:val="24"/>
+          <w:szCs w:val="24"/>
+        </w:rPr>
+        <w:t xml:space="preserve"> immediately after migrations.</w:t>
+      </w:r>
+      <w:r>
+        <w:rPr>
+          <w:sz w:val="24"/>
+          <w:szCs w:val="24"/>
+        </w:rPr>
+        <w:t xml:space="preserve"> </w:t>
+      </w:r>
     </w:p>
     <w:p>
       <w:pPr>
@@ -3891,8 +3909,21 @@
           <w:sz w:val="40"/>
           <w:szCs w:val="40"/>
         </w:rPr>
-        <w:lastRenderedPageBreak/>
-        <w:t>Django Framework Implementation</w:t>
+        <w:t>Django Frame</w:t>
+      </w:r>
+      <w:r>
+        <w:rPr>
+          <w:sz w:val="40"/>
+          <w:szCs w:val="40"/>
+        </w:rPr>
+        <w:t>w</w:t>
+      </w:r>
+      <w:r>
+        <w:rPr>
+          <w:sz w:val="40"/>
+          <w:szCs w:val="40"/>
+        </w:rPr>
+        <w:t>ork Implementation</w:t>
       </w:r>
       <w:bookmarkEnd w:id="9"/>
       <w:r>
@@ -4134,22 +4165,6 @@
           <w:szCs w:val="24"/>
         </w:rPr>
       </w:pPr>
-    </w:p>
-    <w:p>
-      <w:pPr>
-        <w:rPr>
-          <w:sz w:val="24"/>
-          <w:szCs w:val="24"/>
-        </w:rPr>
-      </w:pPr>
-    </w:p>
-    <w:p>
-      <w:pPr>
-        <w:rPr>
-          <w:sz w:val="24"/>
-          <w:szCs w:val="24"/>
-        </w:rPr>
-      </w:pPr>
       <w:r>
         <w:rPr>
           <w:sz w:val="24"/>
@@ -4275,7 +4290,7 @@
         </w:rPr>
         <w:t xml:space="preserve">To make the database a bit safer, invalid or unsafe database lookups were handled by get_object_or_404() which means that invalid ID’s return with </w:t>
       </w:r>
-      <w:proofErr w:type="gramStart"/>
+      <w:proofErr w:type="spellStart"/>
       <w:r>
         <w:rPr>
           <w:sz w:val="24"/>
@@ -4283,7 +4298,7 @@
         </w:rPr>
         <w:t>a</w:t>
       </w:r>
-      <w:proofErr w:type="gramEnd"/>
+      <w:proofErr w:type="spellEnd"/>
       <w:r>
         <w:rPr>
           <w:sz w:val="24"/>
@@ -4931,6 +4946,7 @@
       </w:pPr>
       <w:r>
         <w:rPr>
+          <w:noProof/>
           <w:sz w:val="24"/>
           <w:szCs w:val="24"/>
         </w:rPr>
@@ -4981,6 +4997,740 @@
     </w:p>
     <w:p>
       <w:pPr>
+        <w:rPr>
+          <w:b/>
+          <w:bCs/>
+          <w:sz w:val="40"/>
+          <w:szCs w:val="40"/>
+          <w:u w:val="single"/>
+        </w:rPr>
+      </w:pPr>
+      <w:r>
+        <w:rPr>
+          <w:b/>
+          <w:bCs/>
+          <w:sz w:val="40"/>
+          <w:szCs w:val="40"/>
+          <w:u w:val="single"/>
+        </w:rPr>
+        <w:lastRenderedPageBreak/>
+        <w:t xml:space="preserve">Extra </w:t>
+      </w:r>
+      <w:r>
+        <w:rPr>
+          <w:b/>
+          <w:bCs/>
+          <w:sz w:val="40"/>
+          <w:szCs w:val="40"/>
+          <w:u w:val="single"/>
+        </w:rPr>
+        <w:t>Screenshots of Web Framework</w:t>
+      </w:r>
+    </w:p>
+    <w:p>
+      <w:pPr>
+        <w:rPr>
+          <w:b/>
+          <w:bCs/>
+          <w:sz w:val="24"/>
+          <w:szCs w:val="24"/>
+          <w:u w:val="single"/>
+        </w:rPr>
+      </w:pPr>
+      <w:r>
+        <w:rPr>
+          <w:b/>
+          <w:bCs/>
+          <w:sz w:val="24"/>
+          <w:szCs w:val="24"/>
+          <w:u w:val="single"/>
+        </w:rPr>
+        <w:t>Login page</w:t>
+      </w:r>
+    </w:p>
+    <w:p>
+      <w:pPr>
+        <w:rPr>
+          <w:sz w:val="24"/>
+          <w:szCs w:val="24"/>
+        </w:rPr>
+      </w:pPr>
+      <w:r>
+        <w:rPr>
+          <w:sz w:val="24"/>
+          <w:szCs w:val="24"/>
+        </w:rPr>
+        <w:drawing>
+          <wp:inline distT="0" distB="0" distL="0" distR="0" wp14:anchorId="3BE15368" wp14:editId="48AAE193">
+            <wp:extent cx="5486400" cy="3421380"/>
+            <wp:effectExtent l="0" t="0" r="0" b="7620"/>
+            <wp:docPr id="306746665" name="Picture 1"/>
+            <wp:cNvGraphicFramePr>
+              <a:graphicFrameLocks xmlns:a="http://schemas.openxmlformats.org/drawingml/2006/main" noChangeAspect="1"/>
+            </wp:cNvGraphicFramePr>
+            <a:graphic xmlns:a="http://schemas.openxmlformats.org/drawingml/2006/main">
+              <a:graphicData uri="http://schemas.openxmlformats.org/drawingml/2006/picture">
+                <pic:pic xmlns:pic="http://schemas.openxmlformats.org/drawingml/2006/picture">
+                  <pic:nvPicPr>
+                    <pic:cNvPr id="306746665" name=""/>
+                    <pic:cNvPicPr/>
+                  </pic:nvPicPr>
+                  <pic:blipFill>
+                    <a:blip r:embed="rId23"/>
+                    <a:stretch>
+                      <a:fillRect/>
+                    </a:stretch>
+                  </pic:blipFill>
+                  <pic:spPr>
+                    <a:xfrm>
+                      <a:off x="0" y="0"/>
+                      <a:ext cx="5486400" cy="3421380"/>
+                    </a:xfrm>
+                    <a:prstGeom prst="rect">
+                      <a:avLst/>
+                    </a:prstGeom>
+                  </pic:spPr>
+                </pic:pic>
+              </a:graphicData>
+            </a:graphic>
+          </wp:inline>
+        </w:drawing>
+      </w:r>
+    </w:p>
+    <w:p>
+      <w:pPr>
+        <w:rPr>
+          <w:b/>
+          <w:bCs/>
+          <w:sz w:val="24"/>
+          <w:szCs w:val="24"/>
+          <w:u w:val="single"/>
+        </w:rPr>
+      </w:pPr>
+      <w:r>
+        <w:rPr>
+          <w:b/>
+          <w:bCs/>
+          <w:sz w:val="24"/>
+          <w:szCs w:val="24"/>
+          <w:u w:val="single"/>
+        </w:rPr>
+        <w:t>Student Dashboard</w:t>
+      </w:r>
+    </w:p>
+    <w:p>
+      <w:pPr>
+        <w:rPr>
+          <w:sz w:val="24"/>
+          <w:szCs w:val="24"/>
+        </w:rPr>
+      </w:pPr>
+      <w:r>
+        <w:rPr>
+          <w:sz w:val="24"/>
+          <w:szCs w:val="24"/>
+        </w:rPr>
+        <w:drawing>
+          <wp:inline distT="0" distB="0" distL="0" distR="0" wp14:anchorId="38BD17F9" wp14:editId="19A403D7">
+            <wp:extent cx="5486400" cy="2278380"/>
+            <wp:effectExtent l="0" t="0" r="0" b="7620"/>
+            <wp:docPr id="718566265" name="Picture 1"/>
+            <wp:cNvGraphicFramePr>
+              <a:graphicFrameLocks xmlns:a="http://schemas.openxmlformats.org/drawingml/2006/main" noChangeAspect="1"/>
+            </wp:cNvGraphicFramePr>
+            <a:graphic xmlns:a="http://schemas.openxmlformats.org/drawingml/2006/main">
+              <a:graphicData uri="http://schemas.openxmlformats.org/drawingml/2006/picture">
+                <pic:pic xmlns:pic="http://schemas.openxmlformats.org/drawingml/2006/picture">
+                  <pic:nvPicPr>
+                    <pic:cNvPr id="718566265" name=""/>
+                    <pic:cNvPicPr/>
+                  </pic:nvPicPr>
+                  <pic:blipFill>
+                    <a:blip r:embed="rId24"/>
+                    <a:stretch>
+                      <a:fillRect/>
+                    </a:stretch>
+                  </pic:blipFill>
+                  <pic:spPr>
+                    <a:xfrm>
+                      <a:off x="0" y="0"/>
+                      <a:ext cx="5486400" cy="2278380"/>
+                    </a:xfrm>
+                    <a:prstGeom prst="rect">
+                      <a:avLst/>
+                    </a:prstGeom>
+                  </pic:spPr>
+                </pic:pic>
+              </a:graphicData>
+            </a:graphic>
+          </wp:inline>
+        </w:drawing>
+      </w:r>
+    </w:p>
+    <w:p>
+      <w:pPr>
+        <w:rPr>
+          <w:sz w:val="24"/>
+          <w:szCs w:val="24"/>
+        </w:rPr>
+      </w:pPr>
+    </w:p>
+    <w:p>
+      <w:pPr>
+        <w:rPr>
+          <w:sz w:val="24"/>
+          <w:szCs w:val="24"/>
+        </w:rPr>
+      </w:pPr>
+    </w:p>
+    <w:p>
+      <w:pPr>
+        <w:rPr>
+          <w:b/>
+          <w:bCs/>
+          <w:sz w:val="24"/>
+          <w:szCs w:val="24"/>
+          <w:u w:val="single"/>
+        </w:rPr>
+      </w:pPr>
+      <w:r>
+        <w:rPr>
+          <w:b/>
+          <w:bCs/>
+          <w:sz w:val="24"/>
+          <w:szCs w:val="24"/>
+          <w:u w:val="single"/>
+        </w:rPr>
+        <w:lastRenderedPageBreak/>
+        <w:t>Staff Dashboard</w:t>
+      </w:r>
+    </w:p>
+    <w:p>
+      <w:pPr>
+        <w:rPr>
+          <w:sz w:val="24"/>
+          <w:szCs w:val="24"/>
+        </w:rPr>
+      </w:pPr>
+      <w:r>
+        <w:rPr>
+          <w:sz w:val="24"/>
+          <w:szCs w:val="24"/>
+        </w:rPr>
+        <w:drawing>
+          <wp:inline distT="0" distB="0" distL="0" distR="0" wp14:anchorId="27DAA9B6" wp14:editId="77B03AA6">
+            <wp:extent cx="5486400" cy="2280285"/>
+            <wp:effectExtent l="0" t="0" r="0" b="5715"/>
+            <wp:docPr id="664532279" name="Picture 1"/>
+            <wp:cNvGraphicFramePr>
+              <a:graphicFrameLocks xmlns:a="http://schemas.openxmlformats.org/drawingml/2006/main" noChangeAspect="1"/>
+            </wp:cNvGraphicFramePr>
+            <a:graphic xmlns:a="http://schemas.openxmlformats.org/drawingml/2006/main">
+              <a:graphicData uri="http://schemas.openxmlformats.org/drawingml/2006/picture">
+                <pic:pic xmlns:pic="http://schemas.openxmlformats.org/drawingml/2006/picture">
+                  <pic:nvPicPr>
+                    <pic:cNvPr id="664532279" name=""/>
+                    <pic:cNvPicPr/>
+                  </pic:nvPicPr>
+                  <pic:blipFill>
+                    <a:blip r:embed="rId25"/>
+                    <a:stretch>
+                      <a:fillRect/>
+                    </a:stretch>
+                  </pic:blipFill>
+                  <pic:spPr>
+                    <a:xfrm>
+                      <a:off x="0" y="0"/>
+                      <a:ext cx="5486400" cy="2280285"/>
+                    </a:xfrm>
+                    <a:prstGeom prst="rect">
+                      <a:avLst/>
+                    </a:prstGeom>
+                  </pic:spPr>
+                </pic:pic>
+              </a:graphicData>
+            </a:graphic>
+          </wp:inline>
+        </w:drawing>
+      </w:r>
+    </w:p>
+    <w:p>
+      <w:pPr>
+        <w:rPr>
+          <w:b/>
+          <w:bCs/>
+          <w:sz w:val="24"/>
+          <w:szCs w:val="24"/>
+          <w:u w:val="single"/>
+        </w:rPr>
+      </w:pPr>
+      <w:r>
+        <w:rPr>
+          <w:b/>
+          <w:bCs/>
+          <w:sz w:val="24"/>
+          <w:szCs w:val="24"/>
+          <w:u w:val="single"/>
+        </w:rPr>
+        <w:t>Staff Manage Requests</w:t>
+      </w:r>
+    </w:p>
+    <w:p>
+      <w:pPr>
+        <w:rPr>
+          <w:sz w:val="24"/>
+          <w:szCs w:val="24"/>
+        </w:rPr>
+      </w:pPr>
+      <w:r>
+        <w:rPr>
+          <w:sz w:val="24"/>
+          <w:szCs w:val="24"/>
+        </w:rPr>
+        <w:drawing>
+          <wp:inline distT="0" distB="0" distL="0" distR="0" wp14:anchorId="130E4989" wp14:editId="5EF1B261">
+            <wp:extent cx="5486400" cy="2193925"/>
+            <wp:effectExtent l="0" t="0" r="0" b="0"/>
+            <wp:docPr id="480506648" name="Picture 1"/>
+            <wp:cNvGraphicFramePr>
+              <a:graphicFrameLocks xmlns:a="http://schemas.openxmlformats.org/drawingml/2006/main" noChangeAspect="1"/>
+            </wp:cNvGraphicFramePr>
+            <a:graphic xmlns:a="http://schemas.openxmlformats.org/drawingml/2006/main">
+              <a:graphicData uri="http://schemas.openxmlformats.org/drawingml/2006/picture">
+                <pic:pic xmlns:pic="http://schemas.openxmlformats.org/drawingml/2006/picture">
+                  <pic:nvPicPr>
+                    <pic:cNvPr id="480506648" name=""/>
+                    <pic:cNvPicPr/>
+                  </pic:nvPicPr>
+                  <pic:blipFill>
+                    <a:blip r:embed="rId26"/>
+                    <a:stretch>
+                      <a:fillRect/>
+                    </a:stretch>
+                  </pic:blipFill>
+                  <pic:spPr>
+                    <a:xfrm>
+                      <a:off x="0" y="0"/>
+                      <a:ext cx="5486400" cy="2193925"/>
+                    </a:xfrm>
+                    <a:prstGeom prst="rect">
+                      <a:avLst/>
+                    </a:prstGeom>
+                  </pic:spPr>
+                </pic:pic>
+              </a:graphicData>
+            </a:graphic>
+          </wp:inline>
+        </w:drawing>
+      </w:r>
+    </w:p>
+    <w:p>
+      <w:pPr>
+        <w:rPr>
+          <w:sz w:val="24"/>
+          <w:szCs w:val="24"/>
+        </w:rPr>
+      </w:pPr>
+    </w:p>
+    <w:p>
+      <w:pPr>
+        <w:rPr>
+          <w:sz w:val="24"/>
+          <w:szCs w:val="24"/>
+        </w:rPr>
+      </w:pPr>
+    </w:p>
+    <w:p>
+      <w:pPr>
+        <w:rPr>
+          <w:sz w:val="24"/>
+          <w:szCs w:val="24"/>
+        </w:rPr>
+      </w:pPr>
+    </w:p>
+    <w:p>
+      <w:pPr>
+        <w:rPr>
+          <w:sz w:val="24"/>
+          <w:szCs w:val="24"/>
+        </w:rPr>
+      </w:pPr>
+    </w:p>
+    <w:p>
+      <w:pPr>
+        <w:rPr>
+          <w:sz w:val="24"/>
+          <w:szCs w:val="24"/>
+        </w:rPr>
+      </w:pPr>
+    </w:p>
+    <w:p>
+      <w:pPr>
+        <w:rPr>
+          <w:sz w:val="24"/>
+          <w:szCs w:val="24"/>
+        </w:rPr>
+      </w:pPr>
+    </w:p>
+    <w:p>
+      <w:pPr>
+        <w:rPr>
+          <w:sz w:val="24"/>
+          <w:szCs w:val="24"/>
+        </w:rPr>
+      </w:pPr>
+    </w:p>
+    <w:p>
+      <w:pPr>
+        <w:rPr>
+          <w:b/>
+          <w:bCs/>
+          <w:sz w:val="24"/>
+          <w:szCs w:val="24"/>
+          <w:u w:val="single"/>
+        </w:rPr>
+      </w:pPr>
+      <w:r>
+        <w:rPr>
+          <w:b/>
+          <w:bCs/>
+          <w:sz w:val="24"/>
+          <w:szCs w:val="24"/>
+          <w:u w:val="single"/>
+        </w:rPr>
+        <w:lastRenderedPageBreak/>
+        <w:t>Manager Dashboard</w:t>
+      </w:r>
+    </w:p>
+    <w:p>
+      <w:pPr>
+        <w:rPr>
+          <w:sz w:val="24"/>
+          <w:szCs w:val="24"/>
+        </w:rPr>
+      </w:pPr>
+      <w:r>
+        <w:rPr>
+          <w:sz w:val="24"/>
+          <w:szCs w:val="24"/>
+        </w:rPr>
+        <w:drawing>
+          <wp:inline distT="0" distB="0" distL="0" distR="0" wp14:anchorId="5FC489E9" wp14:editId="00F94CB9">
+            <wp:extent cx="5486400" cy="2852420"/>
+            <wp:effectExtent l="0" t="0" r="0" b="5080"/>
+            <wp:docPr id="183074087" name="Picture 1"/>
+            <wp:cNvGraphicFramePr>
+              <a:graphicFrameLocks xmlns:a="http://schemas.openxmlformats.org/drawingml/2006/main" noChangeAspect="1"/>
+            </wp:cNvGraphicFramePr>
+            <a:graphic xmlns:a="http://schemas.openxmlformats.org/drawingml/2006/main">
+              <a:graphicData uri="http://schemas.openxmlformats.org/drawingml/2006/picture">
+                <pic:pic xmlns:pic="http://schemas.openxmlformats.org/drawingml/2006/picture">
+                  <pic:nvPicPr>
+                    <pic:cNvPr id="183074087" name=""/>
+                    <pic:cNvPicPr/>
+                  </pic:nvPicPr>
+                  <pic:blipFill>
+                    <a:blip r:embed="rId27"/>
+                    <a:stretch>
+                      <a:fillRect/>
+                    </a:stretch>
+                  </pic:blipFill>
+                  <pic:spPr>
+                    <a:xfrm>
+                      <a:off x="0" y="0"/>
+                      <a:ext cx="5486400" cy="2852420"/>
+                    </a:xfrm>
+                    <a:prstGeom prst="rect">
+                      <a:avLst/>
+                    </a:prstGeom>
+                  </pic:spPr>
+                </pic:pic>
+              </a:graphicData>
+            </a:graphic>
+          </wp:inline>
+        </w:drawing>
+      </w:r>
+    </w:p>
+    <w:p>
+      <w:pPr>
+        <w:rPr>
+          <w:b/>
+          <w:bCs/>
+          <w:sz w:val="24"/>
+          <w:szCs w:val="24"/>
+          <w:u w:val="single"/>
+        </w:rPr>
+      </w:pPr>
+      <w:r>
+        <w:rPr>
+          <w:b/>
+          <w:bCs/>
+          <w:sz w:val="24"/>
+          <w:szCs w:val="24"/>
+          <w:u w:val="single"/>
+        </w:rPr>
+        <w:t>Manager Edit Categories</w:t>
+      </w:r>
+    </w:p>
+    <w:p>
+      <w:pPr>
+        <w:rPr>
+          <w:sz w:val="24"/>
+          <w:szCs w:val="24"/>
+        </w:rPr>
+      </w:pPr>
+      <w:r>
+        <w:rPr>
+          <w:sz w:val="24"/>
+          <w:szCs w:val="24"/>
+        </w:rPr>
+        <w:drawing>
+          <wp:inline distT="0" distB="0" distL="0" distR="0" wp14:anchorId="6FF23373" wp14:editId="05CBD061">
+            <wp:extent cx="5486400" cy="2607310"/>
+            <wp:effectExtent l="0" t="0" r="0" b="2540"/>
+            <wp:docPr id="1188087542" name="Picture 1"/>
+            <wp:cNvGraphicFramePr>
+              <a:graphicFrameLocks xmlns:a="http://schemas.openxmlformats.org/drawingml/2006/main" noChangeAspect="1"/>
+            </wp:cNvGraphicFramePr>
+            <a:graphic xmlns:a="http://schemas.openxmlformats.org/drawingml/2006/main">
+              <a:graphicData uri="http://schemas.openxmlformats.org/drawingml/2006/picture">
+                <pic:pic xmlns:pic="http://schemas.openxmlformats.org/drawingml/2006/picture">
+                  <pic:nvPicPr>
+                    <pic:cNvPr id="1188087542" name=""/>
+                    <pic:cNvPicPr/>
+                  </pic:nvPicPr>
+                  <pic:blipFill>
+                    <a:blip r:embed="rId28"/>
+                    <a:stretch>
+                      <a:fillRect/>
+                    </a:stretch>
+                  </pic:blipFill>
+                  <pic:spPr>
+                    <a:xfrm>
+                      <a:off x="0" y="0"/>
+                      <a:ext cx="5486400" cy="2607310"/>
+                    </a:xfrm>
+                    <a:prstGeom prst="rect">
+                      <a:avLst/>
+                    </a:prstGeom>
+                  </pic:spPr>
+                </pic:pic>
+              </a:graphicData>
+            </a:graphic>
+          </wp:inline>
+        </w:drawing>
+      </w:r>
+    </w:p>
+    <w:p>
+      <w:pPr>
+        <w:rPr>
+          <w:sz w:val="24"/>
+          <w:szCs w:val="24"/>
+        </w:rPr>
+      </w:pPr>
+    </w:p>
+    <w:p>
+      <w:pPr>
+        <w:rPr>
+          <w:sz w:val="24"/>
+          <w:szCs w:val="24"/>
+        </w:rPr>
+      </w:pPr>
+    </w:p>
+    <w:p>
+      <w:pPr>
+        <w:rPr>
+          <w:sz w:val="24"/>
+          <w:szCs w:val="24"/>
+        </w:rPr>
+      </w:pPr>
+      <w:r>
+        <w:rPr>
+          <w:sz w:val="24"/>
+          <w:szCs w:val="24"/>
+        </w:rPr>
+        <w:br w:type="page"/>
+      </w:r>
+    </w:p>
+    <w:p>
+      <w:pPr>
+        <w:jc w:val="both"/>
+        <w:rPr>
+          <w:b/>
+          <w:bCs/>
+          <w:sz w:val="24"/>
+          <w:szCs w:val="24"/>
+          <w:u w:val="single"/>
+        </w:rPr>
+      </w:pPr>
+      <w:r>
+        <w:rPr>
+          <w:b/>
+          <w:bCs/>
+          <w:sz w:val="24"/>
+          <w:szCs w:val="24"/>
+          <w:u w:val="single"/>
+        </w:rPr>
+        <w:lastRenderedPageBreak/>
+        <w:t>Admin Dashboard</w:t>
+      </w:r>
+    </w:p>
+    <w:p>
+      <w:pPr>
+        <w:jc w:val="both"/>
+        <w:rPr>
+          <w:b/>
+          <w:bCs/>
+          <w:sz w:val="24"/>
+          <w:szCs w:val="24"/>
+          <w:u w:val="single"/>
+        </w:rPr>
+      </w:pPr>
+      <w:r>
+        <w:rPr>
+          <w:b/>
+          <w:bCs/>
+          <w:sz w:val="24"/>
+          <w:szCs w:val="24"/>
+          <w:u w:val="single"/>
+        </w:rPr>
+        <w:drawing>
+          <wp:inline distT="0" distB="0" distL="0" distR="0" wp14:anchorId="252D8F0A" wp14:editId="33249495">
+            <wp:extent cx="5486400" cy="3099435"/>
+            <wp:effectExtent l="0" t="0" r="0" b="5715"/>
+            <wp:docPr id="419410162" name="Picture 1"/>
+            <wp:cNvGraphicFramePr>
+              <a:graphicFrameLocks xmlns:a="http://schemas.openxmlformats.org/drawingml/2006/main" noChangeAspect="1"/>
+            </wp:cNvGraphicFramePr>
+            <a:graphic xmlns:a="http://schemas.openxmlformats.org/drawingml/2006/main">
+              <a:graphicData uri="http://schemas.openxmlformats.org/drawingml/2006/picture">
+                <pic:pic xmlns:pic="http://schemas.openxmlformats.org/drawingml/2006/picture">
+                  <pic:nvPicPr>
+                    <pic:cNvPr id="419410162" name=""/>
+                    <pic:cNvPicPr/>
+                  </pic:nvPicPr>
+                  <pic:blipFill>
+                    <a:blip r:embed="rId29"/>
+                    <a:stretch>
+                      <a:fillRect/>
+                    </a:stretch>
+                  </pic:blipFill>
+                  <pic:spPr>
+                    <a:xfrm>
+                      <a:off x="0" y="0"/>
+                      <a:ext cx="5486400" cy="3099435"/>
+                    </a:xfrm>
+                    <a:prstGeom prst="rect">
+                      <a:avLst/>
+                    </a:prstGeom>
+                  </pic:spPr>
+                </pic:pic>
+              </a:graphicData>
+            </a:graphic>
+          </wp:inline>
+        </w:drawing>
+      </w:r>
+    </w:p>
+    <w:p>
+      <w:pPr>
+        <w:jc w:val="both"/>
+        <w:rPr>
+          <w:b/>
+          <w:bCs/>
+          <w:sz w:val="24"/>
+          <w:szCs w:val="24"/>
+          <w:u w:val="single"/>
+        </w:rPr>
+      </w:pPr>
+    </w:p>
+    <w:p>
+      <w:pPr>
+        <w:jc w:val="both"/>
+        <w:rPr>
+          <w:b/>
+          <w:bCs/>
+          <w:sz w:val="24"/>
+          <w:szCs w:val="24"/>
+          <w:u w:val="single"/>
+        </w:rPr>
+      </w:pPr>
+      <w:r>
+        <w:rPr>
+          <w:b/>
+          <w:bCs/>
+          <w:sz w:val="24"/>
+          <w:szCs w:val="24"/>
+          <w:u w:val="single"/>
+        </w:rPr>
+        <w:t>Admin System Overview</w:t>
+      </w:r>
+    </w:p>
+    <w:p>
+      <w:pPr>
+        <w:jc w:val="both"/>
+        <w:rPr>
+          <w:b/>
+          <w:bCs/>
+          <w:sz w:val="24"/>
+          <w:szCs w:val="24"/>
+          <w:u w:val="single"/>
+        </w:rPr>
+      </w:pPr>
+      <w:r>
+        <w:rPr>
+          <w:b/>
+          <w:bCs/>
+          <w:sz w:val="24"/>
+          <w:szCs w:val="24"/>
+          <w:u w:val="single"/>
+        </w:rPr>
+        <w:drawing>
+          <wp:inline distT="0" distB="0" distL="0" distR="0" wp14:anchorId="6EBF79D8" wp14:editId="4D29DBE0">
+            <wp:extent cx="5486400" cy="1939290"/>
+            <wp:effectExtent l="0" t="0" r="0" b="3810"/>
+            <wp:docPr id="577609918" name="Picture 1"/>
+            <wp:cNvGraphicFramePr>
+              <a:graphicFrameLocks xmlns:a="http://schemas.openxmlformats.org/drawingml/2006/main" noChangeAspect="1"/>
+            </wp:cNvGraphicFramePr>
+            <a:graphic xmlns:a="http://schemas.openxmlformats.org/drawingml/2006/main">
+              <a:graphicData uri="http://schemas.openxmlformats.org/drawingml/2006/picture">
+                <pic:pic xmlns:pic="http://schemas.openxmlformats.org/drawingml/2006/picture">
+                  <pic:nvPicPr>
+                    <pic:cNvPr id="577609918" name=""/>
+                    <pic:cNvPicPr/>
+                  </pic:nvPicPr>
+                  <pic:blipFill>
+                    <a:blip r:embed="rId30"/>
+                    <a:stretch>
+                      <a:fillRect/>
+                    </a:stretch>
+                  </pic:blipFill>
+                  <pic:spPr>
+                    <a:xfrm>
+                      <a:off x="0" y="0"/>
+                      <a:ext cx="5486400" cy="1939290"/>
+                    </a:xfrm>
+                    <a:prstGeom prst="rect">
+                      <a:avLst/>
+                    </a:prstGeom>
+                  </pic:spPr>
+                </pic:pic>
+              </a:graphicData>
+            </a:graphic>
+          </wp:inline>
+        </w:drawing>
+      </w:r>
+    </w:p>
+    <w:p>
+      <w:pPr>
+        <w:rPr>
+          <w:sz w:val="24"/>
+          <w:szCs w:val="24"/>
+        </w:rPr>
+      </w:pPr>
+    </w:p>
+    <w:p>
+      <w:pPr>
         <w:pStyle w:val="Heading1"/>
         <w:numPr>
           <w:ilvl w:val="0"/>
@@ -5216,7 +5966,7 @@
         </w:rPr>
         <w:t xml:space="preserve"> – sends a GET request for </w:t>
       </w:r>
-      <w:proofErr w:type="gramStart"/>
+      <w:proofErr w:type="spellStart"/>
       <w:r>
         <w:rPr>
           <w:sz w:val="24"/>
@@ -5224,7 +5974,7 @@
         </w:rPr>
         <w:t>a</w:t>
       </w:r>
-      <w:proofErr w:type="gramEnd"/>
+      <w:proofErr w:type="spellEnd"/>
       <w:r>
         <w:rPr>
           <w:sz w:val="24"/>
@@ -5448,6 +6198,7 @@
       </w:pPr>
       <w:r>
         <w:rPr>
+          <w:noProof/>
           <w:sz w:val="24"/>
           <w:szCs w:val="24"/>
         </w:rPr>
@@ -5467,7 +6218,7 @@
                     <pic:cNvPicPr/>
                   </pic:nvPicPr>
                   <pic:blipFill>
-                    <a:blip r:embed="rId23"/>
+                    <a:blip r:embed="rId31"/>
                     <a:stretch>
                       <a:fillRect/>
                     </a:stretch>
@@ -5633,6 +6384,7 @@
       </w:pPr>
       <w:r>
         <w:rPr>
+          <w:noProof/>
           <w:sz w:val="24"/>
           <w:szCs w:val="24"/>
         </w:rPr>
@@ -5653,7 +6405,7 @@
                     <pic:cNvPicPr/>
                   </pic:nvPicPr>
                   <pic:blipFill>
-                    <a:blip r:embed="rId24"/>
+                    <a:blip r:embed="rId32"/>
                     <a:stretch>
                       <a:fillRect/>
                     </a:stretch>
@@ -5778,7 +6530,7 @@
           <w:szCs w:val="24"/>
         </w:rPr>
       </w:pPr>
-      <w:hyperlink r:id="rId25" w:history="1">
+      <w:hyperlink r:id="rId33" w:history="1">
         <w:r>
           <w:rPr>
             <w:rStyle w:val="Hyperlink"/>
@@ -5797,6 +6549,13 @@
           <w:szCs w:val="24"/>
         </w:rPr>
       </w:pPr>
+      <w:r>
+        <w:rPr>
+          <w:sz w:val="24"/>
+          <w:szCs w:val="24"/>
+        </w:rPr>
+        <w:t>Bootstrap CSS for Design:</w:t>
+      </w:r>
     </w:p>
     <w:p>
       <w:pPr>
@@ -5806,32 +6565,7 @@
           <w:szCs w:val="24"/>
         </w:rPr>
       </w:pPr>
-    </w:p>
-    <w:p>
-      <w:pPr>
-        <w:jc w:val="both"/>
-        <w:rPr>
-          <w:sz w:val="24"/>
-          <w:szCs w:val="24"/>
-        </w:rPr>
-      </w:pPr>
-      <w:r>
-        <w:rPr>
-          <w:sz w:val="24"/>
-          <w:szCs w:val="24"/>
-        </w:rPr>
-        <w:t>Bootstrap CSS for Design:</w:t>
-      </w:r>
-    </w:p>
-    <w:p>
-      <w:pPr>
-        <w:jc w:val="both"/>
-        <w:rPr>
-          <w:sz w:val="24"/>
-          <w:szCs w:val="24"/>
-        </w:rPr>
-      </w:pPr>
-      <w:hyperlink r:id="rId26" w:history="1">
+      <w:hyperlink r:id="rId34" w:history="1">
         <w:r>
           <w:rPr>
             <w:rStyle w:val="Hyperlink"/>
@@ -5850,7 +6584,7 @@
           <w:szCs w:val="24"/>
         </w:rPr>
       </w:pPr>
-      <w:hyperlink r:id="rId27" w:history="1">
+      <w:hyperlink r:id="rId35" w:history="1">
         <w:r>
           <w:rPr>
             <w:rStyle w:val="Hyperlink"/>
@@ -5869,6 +6603,13 @@
           <w:szCs w:val="24"/>
         </w:rPr>
       </w:pPr>
+      <w:r>
+        <w:rPr>
+          <w:sz w:val="24"/>
+          <w:szCs w:val="24"/>
+        </w:rPr>
+        <w:t>Bootstrap CSS for Icons:</w:t>
+      </w:r>
     </w:p>
     <w:p>
       <w:pPr>
@@ -5878,23 +6619,7 @@
           <w:szCs w:val="24"/>
         </w:rPr>
       </w:pPr>
-      <w:r>
-        <w:rPr>
-          <w:sz w:val="24"/>
-          <w:szCs w:val="24"/>
-        </w:rPr>
-        <w:t>Bootstrap CSS for Icons:</w:t>
-      </w:r>
-    </w:p>
-    <w:p>
-      <w:pPr>
-        <w:jc w:val="both"/>
-        <w:rPr>
-          <w:sz w:val="24"/>
-          <w:szCs w:val="24"/>
-        </w:rPr>
-      </w:pPr>
-      <w:hyperlink r:id="rId28" w:history="1">
+      <w:hyperlink r:id="rId36" w:history="1">
         <w:r>
           <w:rPr>
             <w:rStyle w:val="Hyperlink"/>
@@ -5913,7 +6638,7 @@
           <w:szCs w:val="24"/>
         </w:rPr>
       </w:pPr>
-      <w:hyperlink r:id="rId29" w:history="1">
+      <w:hyperlink r:id="rId37" w:history="1">
         <w:r>
           <w:rPr>
             <w:rStyle w:val="Hyperlink"/>
@@ -5943,28 +6668,15 @@
     <w:p>
       <w:pPr>
         <w:jc w:val="both"/>
-        <w:rPr>
-          <w:sz w:val="24"/>
-          <w:szCs w:val="24"/>
-        </w:rPr>
-      </w:pPr>
-      <w:hyperlink r:id="rId30" w:anchor="pako:eNqtU1Fv2jAQ_ivWPVMUisE0b1OXVlVVtaPwsAkJefGRuiV2ajtbGeW_zzYJMIamTZqf4u----7z3WUNuRYIKaD5KHlheDlTxJ_r8f30gby_n53pNZk-ZmOSkhlwa2WhUBCnZ7AlxljDG2efptnjJFJL_oK2JV1-mGTX9-PPLfFmkt1FVr4Mkgu5p8bQCT2DrzVa52tLFbiHNtfbSzhSOSIFebjdQ9YZqQqieIlbcNNmR-9_lVxbNHuBg0Dl_X_XRvwWwJLL5R79qvUSuSLSzm1doQmCp6OOLxYnIzx38tuBA8EdOlli_Jg_a-kHc_TAXd__sUPhOHxzRKDNjayc1OpIOs7pv8m2Cq81V0661a9o7h9YaLOa-wJXt0dG2iX5s5cAhZ4fSuyoDstjvPHup-Fqe6LnzTrOA9AYgg4URgpInamxAyUavwL-CtHZDNwT-kZAWGbBzUtY4pBTcfVF67JNM7ouniBd8KX1t7oKBZo_c4caVALNpa6Vg5T2ogaka3iDtNdjXcrYRcIGfTqkyagDq4Ced3tDNuyPLihLKE3YpgM_YtWkywYJHZ0PhrSf-Jw-2_wE0nA1CQ" w:history="1">
+      </w:pPr>
+      <w:hyperlink r:id="rId38" w:anchor="pako:eNqtU1Fv2jAQ_ivWPVMUisE0b1OXVlVVtaPwsAkJefGRuiV2ajtbGeW_zzYJMIamTZqf4u----7z3WUNuRYIKaD5KHlheDlTxJ_r8f30gby_n53pNZk-ZmOSkhlwa2WhUBCnZ7AlxljDG2efptnjJFJL_oK2JV1-mGTX9-PPLfFmkt1FVr4Mkgu5p8bQCT2DrzVa52tLFbiHNtfbSzhSOSIFebjdQ9YZqQqieIlbcNNmR-9_lVxbNHuBg0Dl_X_XRvwWwJLL5R79qvUSuSLSzm1doQmCp6OOLxYnIzx38tuBA8EdOlli_Jg_a-kHc_TAXd__sUPhOHxzRKDNjayc1OpIOs7pv8m2Cq81V0661a9o7h9YaLOa-wJXt0dG2iX5s5cAhZ4fSuyoDstjvPHup-Fqe6LnzTrOA9AYgg4URgpInamxAyUavwL-CtHZDNwT-kZAWGbBzUtY4pBTcfVF67JNM7ouniBd8KX1t7oKBZo_c4caVALNpa6Vg5T2ogaka3iDtNdjXcrYRcIGfTqkyagDq4Ced3tDNuyPLihLKE3YpgM_YtWkywYJHZ0PhrSf-Jw-2_wE0nA1CQ" w:history="1">
         <w:r>
           <w:rPr>
             <w:rStyle w:val="Hyperlink"/>
             <w:sz w:val="24"/>
             <w:szCs w:val="24"/>
           </w:rPr>
-          <w:t>https://mermaid.live/edit#pako:eNqtU1Fv2jAQ_ivWPVMUisE0b1OXVlVVtaPwsAkJefGRuiV2ajtbGeW_zzYJMIamTZqf4u----7z3WUNuRYIKaD5KHlheDlTxJ_r8f30gby_n53pNZk-ZmOSkhlwa2WhUBCnZ7AlxljDG2efptnjJFJL_oK2JV1-mGTX9-PPLfFmkt1FVr4Mkgu5p8bQCT2DrzVa52tLFbiHNtfbSzhSOSIFebjdQ9YZqQqieIlbcNNmR-9_lVxbNHuBg0Dl_X_XRvwWwJLL5R79qvUSuSLSzm1doQmCp6OOLxYnIzx38tuBA8EdOlli_Jg_a-kHc_TAXd__sUPhOHxzRKDNjayc1OpIOs7pv8m2Cq81V0661a9o7h9YaLOa-wJXt0dG2iX5s5cAhZ4fSuyoDstjvPHup-Fqe6LnzTrOA9AYgg4URgpInamxAyUavwL-CtHZDNwT-kZAWGbBzUtY4pBTcfVF67JNM7ouniBd8KX1t7oKBZo_c4caVALNpa6Vg5T2ogaka3i</w:t>
-        </w:r>
-        <w:r>
-          <w:rPr>
-            <w:rStyle w:val="Hyperlink"/>
-            <w:sz w:val="24"/>
-            <w:szCs w:val="24"/>
-          </w:rPr>
-          <w:lastRenderedPageBreak/>
-          <w:t>DtNdjXcrYRcIGfTqkyagDq4Ced3tDNuyPLihLKE3YpgM_YtWkywYJHZ0PhrSf-Jw-2_wE0nA1CQ</w:t>
+          <w:t>https://mermaid.live/edit#pako:eNqtU1Fv2jAQ_ivWPVMUisE0b1OXVlVVtaPwsAkJefGRuiV2ajtbGeW_zzYJMIamTZqf4u----7z3WUNuRYIKaD5KHlheDlTxJ_r8f30gby_n53pNZk-ZmOSkhlwa2WhUBCnZ7AlxljDG2efptnjJFJL_oK2JV1-mGTX9-PPLfFmkt1FVr4Mkgu5p8bQCT2DrzVa52tLFbiHNtfbSzhSOSIFebjdQ9YZqQqieIlbcNNmR-9_lVxbNHuBg0Dl_X_XRvwWwJLL5R79qvUSuSLSzm1doQmCp6OOLxYnIzx38tuBA8EdOlli_Jg_a-kHc_TAXd__sUPhOHxzRKDNjayc1OpIOs7pv8m2Cq81V0661a9o7h9YaLOa-wJXt0dG2iX5s5cAhZ4fSuyoDstjvPHup-Fqe6LnzTrOA9AYgg4URgpInamxAyUavwL-CtHZDNwT-kZAWGbBzUtY4pBTcfVF67JNM7ouniBd8KX1t7oKBZo_c4caVALNpa6Vg5T2ogaka3iDtNdjXcrYRcIGfTqkyagDq4Ced3tDNuyPLihLKE3YpgM_YtWkywYJHZ0PhrSf-Jw-2_wE0nA1CQ</w:t>
         </w:r>
       </w:hyperlink>
     </w:p>
@@ -5976,11 +6688,30 @@
           <w:szCs w:val="24"/>
         </w:rPr>
       </w:pPr>
-      <w:r>
-        <w:rPr>
-          <w:sz w:val="24"/>
-          <w:szCs w:val="24"/>
-        </w:rPr>
+    </w:p>
+    <w:p>
+      <w:pPr>
+        <w:jc w:val="both"/>
+        <w:rPr>
+          <w:sz w:val="24"/>
+          <w:szCs w:val="24"/>
+        </w:rPr>
+      </w:pPr>
+    </w:p>
+    <w:p>
+      <w:pPr>
+        <w:jc w:val="both"/>
+        <w:rPr>
+          <w:sz w:val="24"/>
+          <w:szCs w:val="24"/>
+        </w:rPr>
+      </w:pPr>
+      <w:r>
+        <w:rPr>
+          <w:sz w:val="24"/>
+          <w:szCs w:val="24"/>
+        </w:rPr>
+        <w:lastRenderedPageBreak/>
         <w:t xml:space="preserve">Bootstrap JS </w:t>
       </w:r>
       <w:r>
@@ -5999,7 +6730,7 @@
           <w:szCs w:val="24"/>
         </w:rPr>
       </w:pPr>
-      <w:hyperlink r:id="rId31" w:history="1">
+      <w:hyperlink r:id="rId39" w:history="1">
         <w:r>
           <w:rPr>
             <w:rStyle w:val="Hyperlink"/>
@@ -6018,7 +6749,7 @@
           <w:szCs w:val="24"/>
         </w:rPr>
       </w:pPr>
-      <w:hyperlink r:id="rId32" w:history="1">
+      <w:hyperlink r:id="rId40" w:history="1">
         <w:r>
           <w:rPr>
             <w:rStyle w:val="Hyperlink"/>
@@ -6062,7 +6793,7 @@
           <w:szCs w:val="24"/>
         </w:rPr>
       </w:pPr>
-      <w:hyperlink r:id="rId33" w:history="1">
+      <w:hyperlink r:id="rId41" w:history="1">
         <w:r>
           <w:rPr>
             <w:rStyle w:val="Hyperlink"/>
@@ -6081,15 +6812,6 @@
           <w:szCs w:val="24"/>
         </w:rPr>
       </w:pPr>
-    </w:p>
-    <w:p>
-      <w:pPr>
-        <w:jc w:val="both"/>
-        <w:rPr>
-          <w:sz w:val="24"/>
-          <w:szCs w:val="24"/>
-        </w:rPr>
-      </w:pPr>
       <w:r>
         <w:rPr>
           <w:sz w:val="24"/>
@@ -6118,7 +6840,7 @@
           <w:szCs w:val="24"/>
         </w:rPr>
       </w:pPr>
-      <w:hyperlink r:id="rId34" w:history="1">
+      <w:hyperlink r:id="rId42" w:history="1">
         <w:r>
           <w:rPr>
             <w:rStyle w:val="Hyperlink"/>
@@ -6166,7 +6888,7 @@
           <w:szCs w:val="24"/>
         </w:rPr>
       </w:pPr>
-      <w:hyperlink r:id="rId35" w:history="1">
+      <w:hyperlink r:id="rId43" w:history="1">
         <w:r>
           <w:rPr>
             <w:rStyle w:val="Hyperlink"/>
@@ -6207,7 +6929,7 @@
           <w:szCs w:val="24"/>
         </w:rPr>
       </w:pPr>
-      <w:hyperlink r:id="rId36" w:history="1">
+      <w:hyperlink r:id="rId44" w:history="1">
         <w:r>
           <w:rPr>
             <w:rStyle w:val="Hyperlink"/>
@@ -6269,7 +6991,7 @@
           <w:szCs w:val="24"/>
         </w:rPr>
       </w:pPr>
-      <w:hyperlink r:id="rId37" w:history="1">
+      <w:hyperlink r:id="rId45" w:history="1">
         <w:r>
           <w:rPr>
             <w:rStyle w:val="Hyperlink"/>
@@ -6291,7 +7013,7 @@
           <w:szCs w:val="24"/>
         </w:rPr>
       </w:pPr>
-      <w:hyperlink r:id="rId38" w:history="1">
+      <w:hyperlink r:id="rId46" w:history="1">
         <w:r>
           <w:rPr>
             <w:rStyle w:val="Hyperlink"/>
@@ -6313,7 +7035,7 @@
           <w:szCs w:val="24"/>
         </w:rPr>
       </w:pPr>
-      <w:hyperlink r:id="rId39" w:history="1">
+      <w:hyperlink r:id="rId47" w:history="1">
         <w:r>
           <w:rPr>
             <w:rStyle w:val="Hyperlink"/>
@@ -6363,7 +7085,7 @@
           <w:szCs w:val="24"/>
         </w:rPr>
       </w:pPr>
-      <w:hyperlink r:id="rId40" w:history="1">
+      <w:hyperlink r:id="rId48" w:history="1">
         <w:r>
           <w:rPr>
             <w:rStyle w:val="Hyperlink"/>
@@ -6418,7 +7140,7 @@
           <w:szCs w:val="24"/>
         </w:rPr>
       </w:pPr>
-      <w:hyperlink r:id="rId41" w:history="1">
+      <w:hyperlink r:id="rId49" w:history="1">
         <w:r>
           <w:rPr>
             <w:rStyle w:val="Hyperlink"/>
@@ -6447,7 +7169,7 @@
           <w:szCs w:val="24"/>
         </w:rPr>
       </w:pPr>
-      <w:hyperlink r:id="rId42" w:history="1">
+      <w:hyperlink r:id="rId50" w:history="1">
         <w:r>
           <w:rPr>
             <w:rStyle w:val="Hyperlink"/>
@@ -6474,15 +7196,7 @@
           <w:sz w:val="24"/>
           <w:szCs w:val="24"/>
         </w:rPr>
-        <w:lastRenderedPageBreak/>
-        <w:t>Con</w:t>
-      </w:r>
-      <w:r>
-        <w:rPr>
-          <w:sz w:val="24"/>
-          <w:szCs w:val="24"/>
-        </w:rPr>
-        <w:t>tinuous Deployment (</w:t>
+        <w:t>Continuous Deployment (</w:t>
       </w:r>
       <w:r>
         <w:t>Railway Deployment Documents</w:t>
@@ -6518,7 +7232,7 @@
           <w:szCs w:val="24"/>
         </w:rPr>
       </w:pPr>
-      <w:hyperlink r:id="rId43" w:history="1">
+      <w:hyperlink r:id="rId51" w:history="1">
         <w:r>
           <w:rPr>
             <w:rStyle w:val="Hyperlink"/>
@@ -6540,7 +7254,7 @@
           <w:szCs w:val="24"/>
         </w:rPr>
       </w:pPr>
-      <w:hyperlink r:id="rId44" w:history="1">
+      <w:hyperlink r:id="rId52" w:history="1">
         <w:r>
           <w:rPr>
             <w:rStyle w:val="Hyperlink"/>
@@ -6567,6 +7281,7 @@
           <w:sz w:val="24"/>
           <w:szCs w:val="24"/>
         </w:rPr>
+        <w:lastRenderedPageBreak/>
         <w:t xml:space="preserve">Advanced Feature – </w:t>
       </w:r>
       <w:r>
@@ -6595,7 +7310,7 @@
           <w:szCs w:val="24"/>
         </w:rPr>
       </w:pPr>
-      <w:hyperlink r:id="rId45" w:history="1">
+      <w:hyperlink r:id="rId53" w:history="1">
         <w:r>
           <w:rPr>
             <w:rStyle w:val="Hyperlink"/>
@@ -6766,7 +7481,7 @@
       </w:pPr>
     </w:p>
     <w:sectPr>
-      <w:headerReference w:type="default" r:id="rId46"/>
+      <w:headerReference w:type="default" r:id="rId54"/>
       <w:pgSz w:w="12240" w:h="15840"/>
       <w:pgMar w:top="1440" w:right="1800" w:bottom="1440" w:left="1800" w:header="720" w:footer="720" w:gutter="0"/>
       <w:cols w:space="720"/>
@@ -8469,6 +9184,7 @@
   <w:style w:type="character" w:default="1" w:styleId="DefaultParagraphFont">
     <w:name w:val="Default Paragraph Font"/>
     <w:uiPriority w:val="1"/>
+    <w:semiHidden/>
     <w:unhideWhenUsed/>
   </w:style>
   <w:style w:type="table" w:default="1" w:styleId="TableNormal">

</xml_diff>